<commit_message>
expand full manuscripts and add prospective MD methods v3.5.0
Co-authored-by: arena-agent <297053741+arena-agent@users.noreply.github.com>
</commit_message>
<xml_diff>
--- a/projects/porphyromonas-ad-mechanism-manuscript/manuscript/full/Chinese.docx
+++ b/projects/porphyromonas-ad-mechanism-manuscript/manuscript/full/Chinese.docx
@@ -4,15 +4,6 @@
   <w:body>
     <w:p>
       <w:pPr>
-        <w:pStyle w:val="Heading1"/>
-        <w:keepNext/>
-      </w:pPr>
-      <w:r>
-        <w:t>深度学习引导的牙周炎队列口腔微肽多模型优选：汇总筛选与乙酰胆碱酯酶对接随访</w:t>
-      </w:r>
-    </w:p>
-    <w:p>
-      <w:pPr>
         <w:pStyle w:val="Heading2"/>
         <w:keepNext/>
       </w:pPr>
@@ -25,69 +16,21 @@
         <w:pStyle w:val="Normal"/>
       </w:pPr>
       <w:r>
+        <w:t>牙周炎相关口腔菌群失调被认为可能参与阿尔茨海默病（AD）相关神经炎症过程，但连接口腔微生物组与脑组织的具体分子仍不明确。微生物组小开放阅读框（smORF）编码大量未表征肽，适合计算分流，却不能直接支持机制推断。本研究在明确来源边界的前提下，对口腔smORF汇总优选流程进行纯计算重建，并整合单独归档的乙酰胆碱酯酶（AChE）对接汇总。候选库先经序列/蛋白质组证据过滤，再进入深度学习引导的级联流程，包括ESM-2嵌入与任务特异性卷积网络、微调ESM2-t30神经毒性模型、两级神经网络金属结合预测器和多任务抗氧化CNN。证据过滤后，两条来源分支分别保留31,510和33,786条候选。在牙周炎标注分支中，3,518条候选为BBB高分，3,299条处于NTxPred2肽长度适用域，923条为模型阳性；来源记录随后报告111条金属结合阳性候选、15条CHEL优选候选、12条主集合和8条严格子集。外部记录列出12条互不重复的7–9残基序列，其组成可独立复现，并报告−9.60至−8.25 kcal/mol的AChE Vina均值。由于缺少制备结构、配置、原始运行、日志和构象，上述分数只能排序，不能独立复现或解释为亲和力。本研究还依据版本锁定的外部流程登记了前瞻性100 ns GROMACS方案，但排除尚未完成的轨迹分析，不报告任何分子动力学结果。因此，所得清单仅构成透明、可检验的计算假设集合，不证明翻译、脑暴露、神经毒性、金属依赖化学、AChE结合、牙周炎特异肽组或AD机制。</w:t>
+      </w:r>
+    </w:p>
+    <w:p>
+      <w:pPr>
+        <w:pStyle w:val="Keywords"/>
+      </w:pPr>
+      <w:r>
         <w:rPr>
           <w:b/>
         </w:rPr>
-        <w:t>背景：</w:t>
-      </w:r>
-      <w:r>
-        <w:t xml:space="preserve"> 微生物组小开放阅读框（smORF）编码的肽空间尚未被充分刻画。串联预测模型可以缩小候选空间，但不能证明翻译、组织暴露、毒性、靶标结合、机制或疾病因果关系。本研究重建一条汇总层面的口腔smORF优选流程，并在严格区分来源和证据等级的前提下整合一项独立报告的乙酰胆碱酯酶（AChE）对接随访。</w:t>
-      </w:r>
-    </w:p>
-    <w:p>
-      <w:pPr>
-        <w:pStyle w:val="Normal"/>
-      </w:pPr>
-      <w:r>
-        <w:rPr>
-          <w:b/>
-        </w:rPr>
-        <w:t>方法：</w:t>
-      </w:r>
-      <w:r>
-        <w:t xml:space="preserve"> 对4–50 aa smORF的来源汇总记录实施深度学习引导的级联重建，依次整合ESM-2肽嵌入、任务特异性卷积神经网络、用于神经毒性预测的微调蛋白质语言模型、分层神经网络金属结合预测器及多任务抗氧化CNN。研究以确定性脚本重算比例和单调性；候选序列不是独立生物学重复，故未实施候选计数推断。单独归档的外部来源记录提供12条序列及其针对人AChE PDB 4EY6的AutoDock Vina均值±SD。研究独立核验序列组成和分数排序；因缺少制备后的结构、配置、种子、原始运行、日志和构象，未重跑对接。</w:t>
-      </w:r>
-    </w:p>
-    <w:p>
-      <w:pPr>
-        <w:pStyle w:val="Normal"/>
-      </w:pPr>
-      <w:r>
-        <w:rPr>
-          <w:b/>
-        </w:rPr>
-        <w:t>结果：</w:t>
-      </w:r>
-      <w:r>
-        <w:t xml:space="preserve"> 证据过滤后，健康分支保留31,510/11,269,961（0.2796%），牙周炎分支保留33,786/11,721,988（0.2882%）。短肽分支BBB高分为3,359/30,557（10.99%）和3,446/32,754（10.52%），长肽分支为40/953（4.20%）和72/1,032（6.98%）。牙周炎分支共3,518条BBB高分候选；NTxPred2评估3,299条（93.77%），其中923/3,299（27.98%）为阳性，219条超出其声明长度范围。主要记录随后报告111条金属结合阳性候选，其中15/111（13.51%）满足CHEL≥0.25，12/111（10.81%）进一步满足FRS&lt;0.50，8/111（7.21%）满足FRS&lt;0.45。外部记录列出12条互不重复的7–9 aa序列：11条含组氨酸，6条含半胱氨酸，全部含至少一个Arg/Lys。其报告Vina均值范围为−9.60至−8.25 kcal/mol，SD范围为0.04至0.12。上述分数可排序和作图，但不能独立复现，也不能解释为亲和力。</w:t>
-      </w:r>
-    </w:p>
-    <w:p>
-      <w:pPr>
-        <w:pStyle w:val="Normal"/>
-      </w:pPr>
-      <w:r>
-        <w:rPr>
-          <w:b/>
-        </w:rPr>
-        <w:t>结论：</w:t>
-      </w:r>
-      <w:r>
-        <w:t xml:space="preserve"> 合并记录构成一套保留来源边界的候选清单，而不是经验证的牙周炎特异肽组或AD机制。外部序列清单使合成规划成为可能，但仍需主要来源逐行链路、原始对接产物、队列匹配的表达证据、实测BBB转运、毒理学、金属依赖生化实验和疾病相关验证。</w:t>
-      </w:r>
-    </w:p>
-    <w:p>
-      <w:pPr>
-        <w:pStyle w:val="Keywords"/>
-      </w:pPr>
-      <w:r>
-        <w:rPr>
-          <w:b/>
-        </w:rPr>
         <w:t>关键词：</w:t>
       </w:r>
       <w:r>
-        <w:t xml:space="preserve"> 深度学习；蛋白质语言模型；口腔微生物组；小开放阅读框；微肽；牙周炎；血脑屏障；神经毒性预测；金属结合预测；乙酰胆碱酯酶；分子对接；来源追踪；假设生成</w:t>
+        <w:t xml:space="preserve"> 深度学习；蛋白质语言模型；口腔微生物组；小开放阅读框；微肽；牙周炎；血脑屏障；神经毒性预测；金属结合预测；乙酰胆碱酯酶；分子对接；分子动力学；来源追踪；假设生成</w:t>
       </w:r>
     </w:p>
     <w:p>
@@ -105,49 +48,31 @@
         <w:keepNext/>
       </w:pPr>
       <w:r>
-        <w:t>1.1 阿尔茨海默病、牙周炎症与机制空白</w:t>
-      </w:r>
-    </w:p>
-    <w:p>
-      <w:pPr>
-        <w:pStyle w:val="Normal"/>
-      </w:pPr>
-      <w:r>
-        <w:t>阿尔茨海默病（Alzheimer’s disease，AD）是一种进行性神经退行性疾病，涉及淀粉样蛋白β、tau、突触、免疫和神经血管异常的相互作用[20]。淀粉样蛋白框架仍具有重要生物学意义，但当前证据更支持其处于多因素疾病网络中，而不是构成充分的单一病因解释[21]。因此，牙周炎作为一种潜在可干预的慢性炎症暴露，在广义口腔—脑轴研究中受到关注[43]。</w:t>
-      </w:r>
-    </w:p>
-    <w:p>
-      <w:pPr>
-        <w:pStyle w:val="Normal"/>
-      </w:pPr>
-      <w:r>
-        <w:t>在菌群失调的牙周生物膜中，牙龈卟啉单胞菌（</w:t>
-      </w:r>
-      <w:r>
-        <w:rPr>
-          <w:i/>
-        </w:rPr>
-        <w:t>Porphyromonas gingivalis</w:t>
-      </w:r>
-      <w:r>
-        <w:t>）是一种具有免疫调节和组织破坏特性的革兰阴性厌氧条件致病菌。死后组织与实验研究曾在AD相关组织或模型中报告</w:t>
-      </w:r>
-      <w:r>
-        <w:rPr>
-          <w:i/>
-        </w:rPr>
-        <w:t>P. gingivalis</w:t>
-      </w:r>
-      <w:r>
-        <w:t>物质或牙龈蛋白酶相关信号[44]。野生型小鼠反复口腔感染可产生神经炎症和淀粉样蛋白相关改变，支持生物学合理性，但不能直接推导人类因果关系[46]。外膜囊泡则为细菌成分离开牙周生态位提供另一条候选运输路径[50]。相反，孟德尔随机化分析尚未建立牙周病对AD的遗传因果效应[41]。</w:t>
-      </w:r>
-    </w:p>
-    <w:p>
-      <w:pPr>
-        <w:pStyle w:val="Normal"/>
-      </w:pPr>
-      <w:r>
-        <w:t>当前尚未解决的问题不只是牙周炎症是否与神经退行性改变并存，而是哪些分子实体可能连接两个组织区室。微生物编码的小蛋白和小肽是一类研究不足的候选分子，其表达、系统暴露、BBB转运、神经活性、金属/氧化还原效应及胆碱能相互作用均属未知。本研究因此采用深度学习引导的多模型优选，形成可检验的候选集合，同时严格区分计算标签、来源报告对接和经实验验证的机制。</w:t>
+        <w:t>1.1 阿尔茨海默病是多层次生物学问题</w:t>
+      </w:r>
+    </w:p>
+    <w:p>
+      <w:pPr>
+        <w:pStyle w:val="Normal"/>
+      </w:pPr>
+      <w:r>
+        <w:t>阿尔茨海默病（Alzheimer’s disease，AD）是一种进行性神经退行性疾病，淀粉样蛋白β（Aβ）沉积、tau病理、突触衰竭、胶质细胞激活、血管功能障碍和系统性共病在漫长的临床前及临床连续体中相互作用[20]。淀粉样蛋白假说仍是解释疾病起始事件的重要框架，但单独的淀粉样蛋白负荷不能解释AD在空间、时间和临床表现上的全部异质性[21]。当前观点因而把淀粉样蛋白和tau置于更广泛的网络中，其中包括先天免疫信号、神经元易损性、脂质和金属稳态、脑血管完整性以及随年龄增长而下降的系统韧性。评价外周暴露时，这种系统视角非常重要：某一具有生物学合理性的因素未必是充分病因，但仍必须通过可追溯的分子和时间证据与疾病相关组织连接起来。</w:t>
+      </w:r>
+    </w:p>
+    <w:p>
+      <w:pPr>
+        <w:pStyle w:val="Normal"/>
+      </w:pPr>
+      <w:r>
+        <w:t>胆碱能系统体现了临床相关性与因果充分性之间的差别。胆碱能功能丧失参与认知症状，乙酰胆碱酯酶（AChE）抑制剂仍是成熟的对症治疗[22]。AChE还与Aβ装配存在非催化相互作用，从而在胆碱能生物学与淀粉样研究之间形成结构联系[23]。但这两点都不意味着每个预测可与AChE相互作用的分子均与AD相关。靶标占据、作用方向、组织暴露、浓度、选择性和下游表型都必须分别建立。这一证据顺序也适用于评价口腔—脑轴中的微生物分子。</w:t>
+      </w:r>
+    </w:p>
+    <w:p>
+      <w:pPr>
+        <w:pStyle w:val="Normal"/>
+      </w:pPr>
+      <w:r>
+        <w:t>慢性外周炎症状态因而被视为可能调节神经退行性易损性的因素。牙周炎尤其受到关注，因为它同时包含持续黏膜炎症、菌群失调的多微生物生物膜、微生物产物间歇进入循环的可能性，以及显著的年龄和共病梯度[43]。但这些特征也使因果解释变得困难。牙周炎可能增加系统炎症负担，也可能与认知下降共享决定因素，而认知下降又会恶化口腔卫生和牙科服务可及性。因此，严格的分子研究必须区分关联、路径合理性、分子身份和已证实功能，不能把它们视为同一层证据。</w:t>
       </w:r>
     </w:p>
     <w:p>
@@ -156,23 +81,76 @@
         <w:keepNext/>
       </w:pPr>
       <w:r>
-        <w:t>1.2 微生物组smORF是规模巨大但难以开发的发现空间</w:t>
-      </w:r>
-    </w:p>
-    <w:p>
-      <w:pPr>
-        <w:pStyle w:val="Normal"/>
-      </w:pPr>
-      <w:r>
-        <w:t>短编码序列难以与随机开放阅读框区分，而且常低于常规基因识别阈值，因此smORF长期存在系统性漏注释。对人类微生物组的大规模分析仍发现了数千个保守smORF家族，其中许多缺少已知结构域和功能 [1]。互补预测系统可整合谱模型、序列特征、进化信息和核糖体测序富集，提高短ORF注释能力 [2]。近期高分辨率多组学进一步将计算预测与宏转录组和深度宏蛋白质组证据连接起来 [3]。这些进展说明微生物smORF是合理的发现空间，同时也确立了严格边界：预测ORF不必然被翻译，被翻译的肽也不必然稳定或具有功能。</w:t>
-      </w:r>
-    </w:p>
-    <w:p>
-      <w:pPr>
-        <w:pStyle w:val="Normal"/>
-      </w:pPr>
-      <w:r>
-        <w:t>对极短肽而言，这一边界尤其重要。短ORF研究综述指出，有说服力的微肽发现需要正交证据，而不能仅依赖序列新颖性 [4]。人类蛋白质基因组研究同样要求区分翻译证据、组织背景和功能验证 [5]。在宏基因组组装中，六框翻译可能产生数百万条短序列。与整理后的序列或蛋白质组资源精确匹配可缩小搜索空间，但每个匹配的意义取决于来源：参考数据库可支持序列存在或分类信息，质谱数据仅能在其自身队列、疾病背景和错误发现率框架内支持检出。</w:t>
+        <w:t>1.2 牙周菌群失调与牙龈卟啉单胞菌</w:t>
+      </w:r>
+    </w:p>
+    <w:p>
+      <w:pPr>
+        <w:pStyle w:val="Normal"/>
+      </w:pPr>
+      <w:r>
+        <w:t>牙周炎是牙支持组织的生态性疾病，而不是单一病原体造成的结果。在易感宿主中，群落结构改变、炎症性营养释放和炎症消退受损可以相互强化，形成具有位点特异性转录活动的失调生态。配对口腔宏基因组和宏转录组数据表明，疾病相关信号随物种和口腔位点变化，分类丰度不能代替功能活性[6]。跨研究宏转录组综合还显示，疾病信号受到队列定义、采样位点、测序深度、标准化、协变量和受试者层面重复的影响[7]。因此，不能把疾病标注分支中恢复的每条序列都称为疾病特异序列。</w:t>
+      </w:r>
+    </w:p>
+    <w:p>
+      <w:pPr>
+        <w:pStyle w:val="Normal"/>
+      </w:pPr>
+      <w:r>
+        <w:t>在这一群落中，牙龈卟啉单胞菌（</w:t>
+      </w:r>
+      <w:r>
+        <w:rPr>
+          <w:i/>
+        </w:rPr>
+        <w:t>Porphyromonas gingivalis</w:t>
+      </w:r>
+      <w:r>
+        <w:t>）是研究最充分的革兰阴性厌氧条件致病菌之一。其重要性并不只来自丰度，还来自通过蛋白水解、免疫调节、群落协作和囊泡载荷输送重塑宿主—微生物相互作用的能力。牙龈蛋白酶可依赖具体背景影响宿主蛋白、补体通路、炎症、组织完整性和营养获取[48]。</w:t>
+      </w:r>
+      <w:r>
+        <w:rPr>
+          <w:i/>
+        </w:rPr>
+        <w:t>P. gingivalis</w:t>
+      </w:r>
+      <w:r>
+        <w:t>外膜囊泡能够浓缩并运输细菌成分，改变其与宿主组织及邻近微生物的相互作用[47]。这些性质使该菌适合作为口腔—系统假设的生物学背景，但不能据此把无法追溯的群落来源肽归属于该菌。</w:t>
+      </w:r>
+    </w:p>
+    <w:p>
+      <w:pPr>
+        <w:pStyle w:val="Normal"/>
+      </w:pPr>
+      <w:r>
+        <w:t>必须区分微生物种层面的假设与群落肽假设。检出</w:t>
+      </w:r>
+      <w:r>
+        <w:rPr>
+          <w:i/>
+        </w:rPr>
+        <w:t>P. gingivalis</w:t>
+      </w:r>
+      <w:r>
+        <w:t xml:space="preserve"> DNA、抗原、牙龈蛋白酶相关信号或囊泡物质，并不意味着某条短肽已经表达、分泌、在血液中稳定、跨越血脑屏障（BBB）或在神经组织中发挥作用。反过来，无法归属于</w:t>
+      </w:r>
+      <w:r>
+        <w:rPr>
+          <w:i/>
+        </w:rPr>
+        <w:t>P. gingivalis</w:t>
+      </w:r>
+      <w:r>
+        <w:t>的宏基因组来源肽也可能来自其他口腔分类单元或组装伪影。因此，本文把口腔宏基因组视为群落序列空间，而把</w:t>
+      </w:r>
+      <w:r>
+        <w:rPr>
+          <w:i/>
+        </w:rPr>
+        <w:t>P. gingivalis</w:t>
+      </w:r>
+      <w:r>
+        <w:t>作为机制背景而非预设分类标签。</w:t>
       </w:r>
     </w:p>
     <w:p>
@@ -181,23 +159,56 @@
         <w:keepNext/>
       </w:pPr>
       <w:r>
-        <w:t>1.3 牙周炎相关口腔生态需要受试者层面的来源信息</w:t>
-      </w:r>
-    </w:p>
-    <w:p>
-      <w:pPr>
-        <w:pStyle w:val="Normal"/>
-      </w:pPr>
-      <w:r>
-        <w:t>牙周炎伴随口腔微生物群的生态和功能重塑。配对宏基因组/宏转录组研究发现了与牙周炎相关的位点和物种特异性微生物活动 [6]。跨研究宏转录组综合分析进一步说明，疾病比较必须有受试者层面的映射、标准化、协变量和错误发现率控制 [7]。HOMD和eHOMD提供整理后的口腔及呼吸消化道序列/分类资源 [8] [9]，口腔宏蛋白质组数据则提供依赖具体背景的肽检出 [10] [11]。当代口腔宏蛋白质组流程还强调宿主去除、微生物富集、肽与蛋白层面错误控制、分类归属以及公共原始数据保存 [12]。</w:t>
-      </w:r>
-    </w:p>
-    <w:p>
-      <w:pPr>
-        <w:pStyle w:val="Normal"/>
-      </w:pPr>
-      <w:r>
-        <w:t>主要记录将若干异质性资源用于精确匹配过滤。其中一个资源混合了牙周炎、龋齿和健康唾液样本 [10]；另一个研究肺癌背景下的口腔宏蛋白质组 [11]；HOMD/eHOMD是序列资源而非表达库 [8] [9]。在缺少逐行链路时，这些资源可支持“匹配序列存在”或“曾在特定背景中被观察到”，但不能证明同一肽在当前队列中表达、在牙周炎中富集，或来自某一特定分类单元。因此本文使用“牙周炎队列分支”，而不使用“牙周炎特异肽”。</w:t>
+        <w:t>1.3 人体、实验和遗传证据具有不同因果权重</w:t>
+      </w:r>
+    </w:p>
+    <w:p>
+      <w:pPr>
+        <w:pStyle w:val="Normal"/>
+      </w:pPr>
+      <w:r>
+        <w:t>牙周炎—AD文献包含回答不同问题的多类证据。观察性综述和荟萃分析通常报告牙周病与认知障碍相关，但效应估计随牙周定义、痴呆判定、随访时间、人群年龄结构和校正策略而变化[35]。临床综合同样发现反复出现的关联，同时强调异质性以及回顾性设计难以确定方向性[36]。聚焦口腔细菌的综述扩展了候选机制，也显示微生物检出、抗体反应、口腔疾病状态和痴呆结局经常来自不同人群[37]。较新的证据评价仍把牙周炎视为潜在风险标志，同时要求更强的纵向和干预设计[38]。</w:t>
+      </w:r>
+    </w:p>
+    <w:p>
+      <w:pPr>
+        <w:pStyle w:val="Normal"/>
+      </w:pPr>
+      <w:r>
+        <w:t>纵向观察提供时间信息，但仍易受混杂和反向因果影响。一项AD队列研究观察到牙周炎与后续认知下降及促炎状态相关[39]。公共数据和文本挖掘分析也提出了共享分子信号[40]。这类研究可用于优选通路，却不能判断牙周暴露是否导致神经退行性改变、早期认知受损是否改变口腔健康，或二者是否共同受年龄、吸烟、糖尿病、药物、虚弱、社会经济条件和医疗可及性影响。</w:t>
+      </w:r>
+    </w:p>
+    <w:p>
+      <w:pPr>
+        <w:pStyle w:val="Normal"/>
+      </w:pPr>
+      <w:r>
+        <w:t>遗传工具研究为单向正面叙事提供了重要制衡。两样本孟德尔随机化分析没有建立牙周病遗传风险对AD的因果效应[41]。更广泛的孟德尔随机化综合同样说明，牙周炎的系统性影响并未在不同结局和工具选择中得到一致支持[42]。这些结果不能排除所有后天炎症或微生物路径，因为遗传易感性与随时间变化的暴露并不相同；但它们削弱了“仅凭流行病学关联即可证明因果”的说法。</w:t>
+      </w:r>
+    </w:p>
+    <w:p>
+      <w:pPr>
+        <w:pStyle w:val="Normal"/>
+      </w:pPr>
+      <w:r>
+        <w:t>机制实验在受控条件下回答更窄的问题。AD相关死后样本中曾报告</w:t>
+      </w:r>
+      <w:r>
+        <w:rPr>
+          <w:i/>
+        </w:rPr>
+        <w:t>P. gingivalis</w:t>
+      </w:r>
+      <w:r>
+        <w:t>物质和牙龈蛋白酶相关信号[44]，更早的组织研究也考察了AD脑材料中该菌的存在[45]。野生型小鼠反复口腔暴露可产生脑炎症、神经退行性变化和Aβ相关改变[46]。感染神经元体系中也观察到持续牙龈蛋白酶活性和AD样细胞表型[49]。囊泡研究则为浓缩微生物载荷及宿主信号提供一种合理载体[50]。这些研究的优势是机制分辨率，局限是可迁移性：剂量、暴露途径、模型生物、细胞体系、疾病阶段和终点差异使其不能直接外推至自然发生的人体肽暴露。</w:t>
+      </w:r>
+    </w:p>
+    <w:p>
+      <w:pPr>
+        <w:pStyle w:val="Normal"/>
+      </w:pPr>
+      <w:r>
+        <w:t>综合而言，现有文献支持提出研究问题，却没有建立确定通路。人体关联说明问题具有相关性，实验模型证明部分过程具有可能性，而阴性或不确定的因果分析约束解释。可辩护研究应先识别分子实体、追溯来源、证明暴露，再检验预先指定的功能。本研究仅处理这一证据序列中的前端计算步骤。</w:t>
       </w:r>
     </w:p>
     <w:p>
@@ -206,23 +217,31 @@
         <w:keepNext/>
       </w:pPr>
       <w:r>
-        <w:t>1.4 串联肽预测模型是分流工具，不是正交确认</w:t>
-      </w:r>
-    </w:p>
-    <w:p>
-      <w:pPr>
-        <w:pStyle w:val="Normal"/>
-      </w:pPr>
-      <w:r>
-        <w:t>UniDL4BioPep提供用于二分类肽活性任务的通用深度学习架构 [13]。BBB肽预测既说明模型的价值，也暴露其脆弱性：阳性训练集有限，类别高度不平衡，不同架构的灵敏度—特异度权衡和外部表现均可变化 [14] [15]。NTxPred2估计神经毒性肽标签 [16]；mebipred估计金属结合潜力 [17]；AnOxPePred估计与抗氧化肽相关的螯合和自由基清除特征 [18]。每个模型都可缩小清单，但不同模型重复利用相关序列描述符，训练域、终点和校准亦不同，因此模型一致不能视为独立生物学重复。</w:t>
-      </w:r>
-    </w:p>
-    <w:p>
-      <w:pPr>
-        <w:pStyle w:val="Normal"/>
-      </w:pPr>
-      <w:r>
-        <w:t>更强的肽发现范式应从计算优选进入合成和功能测试。微生物组来源肽类抗生素研究提供了有益先例：预测候选只有在化学合成和实验测定之后才成为生物学发现 [19]。因此，本研究把BBB、神经毒性、金属结合、CHEL和FRS输出视为操作性标签。“BBB高分”不等于实测脑暴露，“神经毒性阳性”不等于细胞毒性，CHEL高/FRS低也不能证明促氧化化学作用。</w:t>
+        <w:t>1.4 从牙周生态位到脑组织的候选路径</w:t>
+      </w:r>
+    </w:p>
+    <w:p>
+      <w:pPr>
+        <w:pStyle w:val="Normal"/>
+      </w:pPr>
+      <w:r>
+        <w:t>牙周菌群失调可能通过多条非互斥路径与神经退行性过程连接。第一条是间接路径：慢性牙周炎症可改变循环细胞因子、急性期反应、内皮激活或免疫细胞状态，从而在不需要活菌进入脑组织的情况下影响神经血管和胶质功能[43]。第二条涉及组织炎症或日常机械扰动期间细菌细胞或可溶性产物的间歇播散。第三条涉及外膜囊泡，其可保护并浓缩脂质、蛋白质、核酸和其他细菌载荷[47]。第四条涉及特定酶或分子片段，包括可能修饰宿主底物的牙龈蛋白酶相关产物[48]。这些路径在人类中的相对贡献仍不确定。</w:t>
+      </w:r>
+    </w:p>
+    <w:p>
+      <w:pPr>
+        <w:pStyle w:val="Normal"/>
+      </w:pPr>
+      <w:r>
+        <w:t>每条路径要求不同证据。炎症路径需要暴露—反应和中介证据；播散路径需要口腔与系统区室中匹配的分子身份；囊泡路径需要载荷表征、生物分布和屏障转运数据；直接肽路径还需要证明smORF被翻译、肽能够耐受加工与蛋白水解，并以足够浓度到达相关组织。BBB预测不能满足这些要求，因为通透性还取决于肽构象、电荷、转运机制、血清结合、降解、外排和实验背景。</w:t>
+      </w:r>
+    </w:p>
+    <w:p>
+      <w:pPr>
+        <w:pStyle w:val="Normal"/>
+      </w:pPr>
+      <w:r>
+        <w:t>微生物编码的小蛋白和小肽在这一框架中仍研究不足。短分子原则上可以是配体、酶调节剂、膜活性物质、免疫信号、金属结合分子或无活性的降解产物。因此，假设空间很广，但广泛合理性不是特定序列的证据。尚未解决的分子空白是：是否存在可追溯的口腔微生物肽，在相关生态背景中表达、离开口腔并产生可重复的神经或血管效应。计算优选只有在缩小候选空间的同时保留这些连续证据要求时才有价值。</w:t>
       </w:r>
     </w:p>
     <w:p>
@@ -231,23 +250,39 @@
         <w:keepNext/>
       </w:pPr>
       <w:r>
-        <w:t>1.5 AChE/PAS生物学可支持对接问题，但不能验证对接结论</w:t>
-      </w:r>
-    </w:p>
-    <w:p>
-      <w:pPr>
-        <w:pStyle w:val="Normal"/>
-      </w:pPr>
-      <w:r>
-        <w:t>阿尔茨海默病（AD）以淀粉样β（Aβ）斑块、tau病理、突触功能障碍和进行性认知下降为特征 [20] [21]。胆碱能系统仍具临床相关性，因为乙酰胆碱酯酶抑制剂是成熟的对症治疗 [22]。AChE还与Aβ存在非催化关系：经典实验显示AChE可加速Aβ纤维装配，并提示活性峡谷入口处的外周阴离子位点（PAS）参与其中 [23]。AChE特定结构基序可促进Aβ纤维形成 [24]，PAS定向配体可抑制AChE诱导的Aβ聚集 [25]。AChE复合物晶体结构描绘了催化位点与外周位点之间的芳香性峡谷 [26] [27]。</w:t>
-      </w:r>
-    </w:p>
-    <w:p>
-      <w:pPr>
-        <w:pStyle w:val="Normal"/>
-      </w:pPr>
-      <w:r>
-        <w:t>分子模拟研究提供了进一步背景，但不直接支持本研究候选。一项AChE–Aβ轨迹研究描述了PAS邻近表面的动态停留 [28]，加速模拟也探讨了AChE在Aβ结合中的作用 [29]。这些研究可支持“候选肽能否被放置在AChE峡谷附近”的问题，却不能证明任何口腔候选结合AChE、改变催化、影响Aβ聚集或到达脑组织。因此，本研究将对接随访报告为来源受限的外部排序，而非靶标验证。</w:t>
+        <w:t>1.5 微生物组smORF是合理但技术困难的发现空间</w:t>
+      </w:r>
+    </w:p>
+    <w:p>
+      <w:pPr>
+        <w:pStyle w:val="Normal"/>
+      </w:pPr>
+      <w:r>
+        <w:t>smORF长期存在系统性漏注释，因为短编码区难以与随机开放阅读框区分，可提供的系统发育信号有限，而且常低于面向常规基因的识别阈值。对人类相关微生物组的大规模分析仍识别出数千个保守小基因家族，其中许多缺少已知结构域[1]。专用注释方法通过整合谱模型、编码特征、保守性和其他证据，而不是套用常规蛋白长度阈值，提高发现能力[2]。高分辨率多组学则可把预测与转录和蛋白质组观察相连接，从而提高候选可信度[3]。</w:t>
+      </w:r>
+    </w:p>
+    <w:p>
+      <w:pPr>
+        <w:pStyle w:val="Normal"/>
+      </w:pPr>
+      <w:r>
+        <w:t>但证据阶梯依然陡峭。预测smORF不一定被转录；转录本不一定被翻译；肽谱匹配不一定唯一或归属正确；被检出的肽也不一定稳定或具有功能。短ORF生物学综述强调正交验证和谨慎命名[4]。蛋白质基因组研究同样表明，翻译证据必须结合组织、阅读框、错误发现和功能背景解释[5]。在宏基因组中，组装碎片、同源序列、菌株变异和六框翻译会进一步产生数百万短候选。</w:t>
+      </w:r>
+    </w:p>
+    <w:p>
+      <w:pPr>
+        <w:pStyle w:val="Normal"/>
+      </w:pPr>
+      <w:r>
+        <w:t>口腔序列与宏蛋白质组资源提供互补但不等价的证据。HOMD和eHOMD整理口腔及呼吸消化道分类和基因组信息[8]。唾液宏蛋白质组可在自身样本和错误发现框架内支持肽检出[10]。肺癌口腔宏蛋白质组则提供另一种背景特异性观察空间[11]。当代唾液宏蛋白质组流程强调宿主去除、微生物富集、肽和蛋白层面错误控制、分类歧义及公共原始数据保存[12]。与任一资源精确匹配可支持序列存在或曾被观察，但不能单独建立当前疾病标注分支中的表达。</w:t>
+      </w:r>
+    </w:p>
+    <w:p>
+      <w:pPr>
+        <w:pStyle w:val="Normal"/>
+      </w:pPr>
+      <w:r>
+        <w:t>因此，样本层面来源链不可缺少。疾病比较需要把序列连接到contig、组装或bin、标本、参与者、口腔位点、临床分组和处理批次。缺少这条链时，候选计数只是计算记账单位，不是独立生物学重复。当前记录保留汇总分支标签和计数，但缺少估计流行度、富集、分类来源和参与者间不确定性所需的逐行映射。因此，本文使用“牙周炎标注分支”，而不是“牙周炎特异肽组”。</w:t>
       </w:r>
     </w:p>
     <w:p>
@@ -256,23 +291,39 @@
         <w:keepNext/>
       </w:pPr>
       <w:r>
-        <w:t>1.6 金属稳态失衡与短神经活性肽构成可检验的假设</w:t>
-      </w:r>
-    </w:p>
-    <w:p>
-      <w:pPr>
-        <w:pStyle w:val="Normal"/>
-      </w:pPr>
-      <w:r>
-        <w:t>铜、铁、锌稳态失衡长期被用于讨论AD中的聚集、氧化还原化学和神经元损伤 [30]。元素组学视角强调金属失衡与淀粉样生物学、脂质过氧化、铁死亡过程和治疗探索之间的交叉 [31]。但疾病相关肽假设需要的不只是金属结合预测，还需要可识别的分子、可重复的配位化学、金属选择性、可测量的氧化还原结果、相关组织暴露和表型。</w:t>
-      </w:r>
-    </w:p>
-    <w:p>
-      <w:pPr>
-        <w:pStyle w:val="Normal"/>
-      </w:pPr>
-      <w:r>
-        <w:t>宿主来源短肽表明这一组合可以实验检验。Tau片段可配位Cu(II)，并以序列和金属依赖方式改变Aβ聚集 [32]。tau26–44片段尤其适合作为概念比较，因为结构和细胞研究将短而动态的肽与神经毒性、膜效应联系起来 [33]。细菌淀粉样蛋白暴露也可改变模型系统的聚集表型，例如curli与α-突触核蛋白的研究 [34]。这些先例不能把活性转移给当前12条序列，只是界定了判定候选无活性、结合金属但无害或产生金属依赖生物效应所需的实验。</w:t>
+        <w:t>1.6 深度学习引导的优选是分流而非验证</w:t>
+      </w:r>
+    </w:p>
+    <w:p>
+      <w:pPr>
+        <w:pStyle w:val="Normal"/>
+      </w:pPr>
+      <w:r>
+        <w:t>smORF搜索空间的规模促使研究使用序列模型，但模型输出继承训练数据的假设和适用域限制。UniDL4BioPep以预训练ESM-2生成上下文嵌入，再通过任务特异性卷积神经网络完成肽活性分类[13]。蛋白质语言模型能够捕获难以人工编码的序列规律，但输出分数仍是模型特异值；除非在可比较的序列和任务域中完成校准，否则不能把它解释为生物学概率。</w:t>
+      </w:r>
+    </w:p>
+    <w:p>
+      <w:pPr>
+        <w:pStyle w:val="Normal"/>
+      </w:pPr>
+      <w:r>
+        <w:t>BBB肽预测可说明这一局限。Augur整合工程化描述符、特征选择、类别平衡和随机森林分类器，并非深度学习模型[14]。B3BPFN则代表不同的模型家族和数据集构建方式[15]。阳性集合定义、去冗余、阴性采样、序列长度、类别平衡和验证设计差异都会实质影响表观性能。极短、富亮氨酸、带正电或组成异常的微生物组肽可能位于模型评估分布之外。因此，“BBB高分”只定义优选阈值，不等于实测转运。</w:t>
+      </w:r>
+    </w:p>
+    <w:p>
+      <w:pPr>
+        <w:pStyle w:val="Normal"/>
+      </w:pPr>
+      <w:r>
+        <w:t>下游工具同样具有异质性。NTxPred2肽模式在神经毒性肽序列上微调ESM2-t30蛋白质语言模型[16]。Mebipred使用工程化序列描述符和两级人工神经网络框架，估计一般及离子相关金属结合潜力[17]。AnOxPePred使用一维卷积和多任务输出预测自由基清除与螯合相关性质[18]。这些工具的串联一致不是正交重复，因为模型重复使用序列组成，训练终点不同，还可能沿漏斗传播相关偏倚。</w:t>
+      </w:r>
+    </w:p>
+    <w:p>
+      <w:pPr>
+        <w:pStyle w:val="Normal"/>
+      </w:pPr>
+      <w:r>
+        <w:t>恰当解释是计算分流。“神经毒性阳性”不是神经元毒性，“金属结合阳性”不是实测解离常数或配位几何，CHEL和FRS输出也不是氧化还原化学。微生物组肽挖掘的有力先例表明，计算候选只有经过合成和受控功能实验后才成为生物学发现[19]。对于纯计算研究，科学贡献应是透明缩小候选空间、准确描述模型、提示适用域风险，并可重复记录仍未检验的内容。</w:t>
       </w:r>
     </w:p>
     <w:p>
@@ -281,23 +332,39 @@
         <w:keepNext/>
       </w:pPr>
       <w:r>
-        <w:t>1.7 牙周炎–AD证据要求克制的因果表述</w:t>
-      </w:r>
-    </w:p>
-    <w:p>
-      <w:pPr>
-        <w:pStyle w:val="Normal"/>
-      </w:pPr>
-      <w:r>
-        <w:t>观察性综合分析报告牙周病与认知障碍之间存在关联，但估计值随疾病定义、严重程度、人群和设计变化 [35] [36] [37] [38]。纵向研究在AD队列中观察到牙周炎与认知下降相关 [39]，文本挖掘和公共数据分析也提出了共享信号 [40]。这些结果可能受到混杂、反向因果、口腔护理变化、共病和选择偏倚影响。近期孟德尔随机化研究及其综合未能有力支持牙周病对AD存在显著遗传因果效应 [41] [42]。最新入门综述亦将牙周–AD机制界定为具有合理性但尚未充分建立 [43]。</w:t>
-      </w:r>
-    </w:p>
-    <w:p>
-      <w:pPr>
-        <w:pStyle w:val="Normal"/>
-      </w:pPr>
-      <w:r>
-        <w:t>涉及牙龈卟啉单胞菌的机制研究提供重要但有限的背景。AD相关组织和模型中有牙龈蛋白酶及细菌物质的报道 [44] [45] [46]；外膜囊泡和牙龈蛋白酶生物化学也提供了宿主相互作用的可能通路 [47] [48] [49] [50]。然而，这些研究针对特定微生物、毒力因子或实验暴露，不能将当前候选归属给该菌，也不能验证微肽介导通路。口腔宏基因组代表微生物群落，而非单一物种肽组。</w:t>
+        <w:t>1.7 AChE、金属稳态、对接与分子动力学构成结构假设</w:t>
+      </w:r>
+    </w:p>
+    <w:p>
+      <w:pPr>
+        <w:pStyle w:val="Normal"/>
+      </w:pPr>
+      <w:r>
+        <w:t>AChE提供一个具有生物学依据但要求严格的结构随访方向。除水解乙酰胆碱外，AChE可加速Aβ纤维装配[23]。AChE特定基序被认为可促进Aβ纤维形成[24]，PAS定向配体则可在生化体系中抑制AChE诱导的Aβ聚集[25]。结构研究描绘了连接催化区域与外周位点的芳香性峡谷[26]。PDB 4EY6所代表的人AChE结构为配体导向问题提供实验确定的受体框架[27]。这些发现支持提出“候选肽能否稳定占据AChE某一区域”，但不能建立结合、抑制或Aβ效应。</w:t>
+      </w:r>
+    </w:p>
+    <w:p>
+      <w:pPr>
+        <w:pStyle w:val="Normal"/>
+      </w:pPr>
+      <w:r>
+        <w:t>柔性7–9残基肽的对接尤其不确定，因为肽质子化、端基、初始构象、受体柔性、搜索空间位置、评分随机性和对接后精修均可改变排序。AutoDock Vina适合初筛，但其分数不是实验亲和力或结合自由能[51]。后续Vina实现扩展了方法和接口，却没有消除完整制备及执行记录的必要性[52]。FlexPepDock等肽特异精修方法体现了透明初筛后可采用的更高分辨率标准[53]。</w:t>
+      </w:r>
+    </w:p>
+    <w:p>
+      <w:pPr>
+        <w:pStyle w:val="Normal"/>
+      </w:pPr>
+      <w:r>
+        <w:t>分子动力学（MD）可以在规定力场和溶剂模型下检验制备复合物是否停留于某一构象区域，但不能挽救无法追溯或制备不充分的对接构象。已发表AChE–Aβ模拟显示肽的停留位置和接触可随时间改变[28]，加速模拟也说明可以探索AChE表面的替代相互作用[29]。对当前候选而言，有意义的MD需要版本化起始坐标、拓扑和质子化决策、独立种子轨迹、收敛性评价及预先指定分析。在这些要素和完整轨迹可用之前，MD只能作为方案，不能作为结果。</w:t>
+      </w:r>
+    </w:p>
+    <w:p>
+      <w:pPr>
+        <w:pStyle w:val="Normal"/>
+      </w:pPr>
+      <w:r>
+        <w:t>金属生物学构成第二个结构假设。铜、铁和锌稳态失衡与Aβ聚集、氧化还原化学、脂质过氧化和神经元损伤相交[30]。更广义的元素组学视角把这些相互作用置于网络而非单金属机制中[31]。含组氨酸和半胱氨酸的肽可能具有配位基团，但组成不能决定亲和力、选择性、化学计量、几何、氧化态或氧化还原结果。Tau片段实验显示Cu(II)配位可改变肽结构和Aβ聚集[32]；tau26–44进一步说明如何通过专门实验把短动态肽连接到膜和细胞表型[33]。细菌淀粉样蛋白暴露也可改变模型系统中的聚集表型[34]。这些研究提供可检验比较对象，而不是可转移的活性。</w:t>
       </w:r>
     </w:p>
     <w:p>
@@ -306,23 +373,40 @@
         <w:keepNext/>
       </w:pPr>
       <w:r>
-        <w:t>1.8 研究目标与贡献</w:t>
-      </w:r>
-    </w:p>
-    <w:p>
-      <w:pPr>
-        <w:pStyle w:val="Normal"/>
-      </w:pPr>
-      <w:r>
-        <w:t>本研究有两个相互衔接的目标。第一，重建并审计汇总筛选记录：健康和牙周炎分支中，有多少候选通过证据过滤、BBB评分、NTxPred2、mebipred及CHEL/FRS阈值；哪些转换无法独立审计？第二，评估其中哪些新增信息可被负责任地使用：12条序列、可独立重算的组成，以及针对AChE PDB 4EY6的外部报告AutoDock Vina汇总 [27] [51] [52]。</w:t>
-      </w:r>
-    </w:p>
-    <w:p>
-      <w:pPr>
-        <w:pStyle w:val="Normal"/>
-      </w:pPr>
-      <w:r>
-        <w:t>本文贡献不是新预测器、复现的对接流程或经验证的疾病机制，而是一份显著扩展、保留来源边界的原创研究记录，明确区分主要来源筛选结果、外部序列/分数汇总、独立重算描述符和未来验证。FlexPepDock等柔性肽对接方法提示了结构随访可达到的标准 [53]，但原始输入和可重复执行是前提。</w:t>
+        <w:t>1.8 知识空白与研究目标</w:t>
+      </w:r>
+    </w:p>
+    <w:p>
+      <w:pPr>
+        <w:pStyle w:val="Normal"/>
+      </w:pPr>
+      <w:r>
+        <w:t>现有文献汇聚出一个边界清楚的空白：牙周炎与AD之间存在异质性观察关联，</w:t>
+      </w:r>
+      <w:r>
+        <w:rPr>
+          <w:i/>
+        </w:rPr>
+        <w:t>P. gingivalis</w:t>
+      </w:r>
+      <w:r>
+        <w:t>提供物种特异的机制合理性，口腔微生物组又编码大量未充分表征的小肽。然而，目前缺少的是一条可追溯分子链，把确定的微生物smORF依次连接到翻译、宿主暴露、BBB通过、靶标占据和疾病相关表型。任何单一计算分数都不能跨越这些层次。</w:t>
+      </w:r>
+    </w:p>
+    <w:p>
+      <w:pPr>
+        <w:pStyle w:val="Normal"/>
+      </w:pPr>
+      <w:r>
+        <w:t>因此，本研究处理一个更早且更窄的问题：能否把口腔smORF汇总记录重建为可审计候选漏斗，并在不把不完整来源转化为生物学确定性的前提下整合单独报告的AChE对接汇总？第一项目标是重算所有报告比例、检查分支算术和适用性约束，并按文献架构描述每个预测模型。第二项目标是审计12条序列的唯一性和组成，同时把外部AChE分数排序保留为来源报告。第三项目标是登记可重复的下游MD方案，同时暂不纳入未完成轨迹输出。</w:t>
+      </w:r>
+    </w:p>
+    <w:p>
+      <w:pPr>
+        <w:pStyle w:val="Normal"/>
+      </w:pPr>
+      <w:r>
+        <w:t>本文贡献是一套保留来源边界的计算假设集合，而不是新预测器、临床队列分析、独立复现的对接研究、MD结果或经验证的AD机制。这一定位既保留深度学习引导优选的价值，也明确下一步证据要求。</w:t>
       </w:r>
     </w:p>
     <w:p>
@@ -348,7 +432,7 @@
         <w:pStyle w:val="Normal"/>
       </w:pPr>
       <w:r>
-        <w:t>本研究为汇总层面计算重建，并附带跨仓库的二级随访。写作前将证据划分为三层：</w:t>
+        <w:t>本研究为纯计算、汇总层面重建，并包含跨仓库结构随访。本稿未实施湿实验、参与者招募、标本采集、新组学处理、对接重跑或已完成的分子动力学分析。写作前将证据划分为四层：</w:t>
       </w:r>
     </w:p>
     <w:p>
@@ -489,22 +573,97 @@
           <w:sz w:val="18"/>
           <w:szCs w:val="18"/>
         </w:rPr>
-        <w:t>C层——背景与未来工作：</w:t>
-      </w:r>
-      <w:r>
-        <w:rPr>
-          <w:sz w:val="18"/>
-          <w:szCs w:val="18"/>
-        </w:rPr>
-        <w:t xml:space="preserve"> 用于提出AChE/PAS、金属、口腔微生物组和验证问题的同行评议文献。文献不用于补造缺失结果。</w:t>
-      </w:r>
-    </w:p>
-    <w:p>
-      <w:pPr>
-        <w:pStyle w:val="Normal"/>
-      </w:pPr>
-      <w:r>
-        <w:t>A层始终是筛选漏斗的唯一权威来源；B层不追溯填补主要来源的逐行链路；C层仅提供解释边界。</w:t>
+        <w:t>C层——前瞻性MD方案：</w:t>
+      </w:r>
+      <w:r>
+        <w:rPr>
+          <w:sz w:val="18"/>
+          <w:szCs w:val="18"/>
+        </w:rPr>
+        <w:t xml:space="preserve"> 来自</w:t>
+      </w:r>
+      <w:r>
+        <w:rPr>
+          <w:rFonts w:ascii="Consolas" w:hAnsi="Consolas" w:eastAsia="等线"/>
+          <w:shd w:val="clear" w:color="auto" w:fill="F2F4F7"/>
+          <w:sz w:val="18"/>
+          <w:szCs w:val="18"/>
+        </w:rPr>
+        <w:t>shaohuawen03-cyber/asd</w:t>
+      </w:r>
+      <w:r>
+        <w:rPr>
+          <w:sz w:val="18"/>
+          <w:szCs w:val="18"/>
+        </w:rPr>
+        <w:t>提交</w:t>
+      </w:r>
+      <w:r>
+        <w:rPr>
+          <w:rFonts w:ascii="Consolas" w:hAnsi="Consolas" w:eastAsia="等线"/>
+          <w:shd w:val="clear" w:color="auto" w:fill="F2F4F7"/>
+          <w:sz w:val="18"/>
+          <w:szCs w:val="18"/>
+        </w:rPr>
+        <w:t>f11cd3751e8fce53dbf1a335ef1d8fa777751ef5</w:t>
+      </w:r>
+      <w:r>
+        <w:rPr>
+          <w:sz w:val="18"/>
+          <w:szCs w:val="18"/>
+        </w:rPr>
+        <w:t>的版本化GROMACS脚本和100 ns MDP文件。该层只定义后续计算，不提供可接纳结果。</w:t>
+      </w:r>
+    </w:p>
+    <w:p>
+      <w:pPr>
+        <w:pStyle w:val="Reference"/>
+        <w:ind w:left="360" w:hanging="360"/>
+      </w:pPr>
+      <w:r>
+        <w:rPr>
+          <w:sz w:val="18"/>
+          <w:szCs w:val="18"/>
+        </w:rPr>
+        <w:t xml:space="preserve">4. </w:t>
+      </w:r>
+      <w:r>
+        <w:rPr>
+          <w:b/>
+          <w:sz w:val="18"/>
+          <w:szCs w:val="18"/>
+        </w:rPr>
+        <w:t>D层——文献背景：</w:t>
+      </w:r>
+      <w:r>
+        <w:rPr>
+          <w:sz w:val="18"/>
+          <w:szCs w:val="18"/>
+        </w:rPr>
+        <w:t xml:space="preserve"> 用于综合AD、牙周炎、</w:t>
+      </w:r>
+      <w:r>
+        <w:rPr>
+          <w:i/>
+          <w:sz w:val="18"/>
+          <w:szCs w:val="18"/>
+        </w:rPr>
+        <w:t>P. gingivalis</w:t>
+      </w:r>
+      <w:r>
+        <w:rPr>
+          <w:sz w:val="18"/>
+          <w:szCs w:val="18"/>
+        </w:rPr>
+        <w:t>、AChE/PAS、金属、口腔微生物组和验证问题的同行评议证据。文献不用于补造缺失结果。</w:t>
+      </w:r>
+    </w:p>
+    <w:p>
+      <w:pPr>
+        <w:pStyle w:val="Normal"/>
+      </w:pPr>
+      <w:r>
+        <w:t>A层始终是筛选漏斗的唯一权威来源；B层不追溯填补主要来源的逐行链路；C层仅限前瞻性方法；D层仅提供解释边界。</w:t>
       </w:r>
     </w:p>
     <w:p>
@@ -521,15 +680,15 @@
         <w:pStyle w:val="Normal"/>
       </w:pPr>
       <w:r>
-        <w:t>主要记录列出PRJNA678453和PRJEB65451。登录号与论文核查表明，PRJNA678453是配对口腔宏基因组/宏转录组的原始队列，共22名参与者，包括11名口腔健康对照和11名牙周炎患者；共生成66份标本，包括22份龈下菌斑、22份舌刮取物和22份刺激性唾液[6]。PRJEB65451并非独立队列，而是由PRJNA678453衍生、使用metaSPAdes v3.15.3组装并由EBI-EMG/MGnify代理的第三方注释宏基因组组装项目。ENA项目页面目前列出118项序列组装分析；这些记录不被解释为参与者、临床标本或宏基因组组装基因组。另一项缺乏依据的队列和组装汇总未予保留。</w:t>
-      </w:r>
-    </w:p>
-    <w:p>
-      <w:pPr>
-        <w:pStyle w:val="Normal"/>
-      </w:pPr>
-      <w:r>
-        <w:t>本次重建未招募新参与者、未收集标本，也未重新分析原始组学或临床数据。主要材料中缺少候选核苷酸/氨基酸行、基因组坐标、受试者/样本映射、登录号—分组对应表、分类信息、肽谱匹配、模型输出、运行日志、数据库快照和原始管线。因此，经核验的队列构成仅用于说明来源，不作为候选层面推断的分母。</w:t>
+        <w:t>主要记录列出PRJNA678453和PRJEB65451。登录号与论文核查表明，PRJNA678453是配对口腔宏基因组/宏转录组的来源项目[6]。PRJEB65451并非独立临床队列，而是由PRJNA678453衍生、使用metaSPAdes v3.15.3组装并由EBI-EMG/MGnify代理的第三方注释宏基因组组装项目。本完整稿不报告参与者、标本、组装分析或宏基因组组装基因组总数，因为来源包不含能够一致审计这些单位的映射和bin层面清单。</w:t>
+      </w:r>
+    </w:p>
+    <w:p>
+      <w:pPr>
+        <w:pStyle w:val="Normal"/>
+      </w:pPr>
+      <w:r>
+        <w:t>本次重建未招募新参与者、未收集标本，也未重新分析原始组学或临床数据。主要材料中缺少候选核苷酸/氨基酸行、基因组坐标、受试者/样本映射、登录号—分组对应表、MAG-bin清单、bin质量表、分类信息、肽谱匹配、模型输出、运行日志、数据库快照和原始管线。因此，登录号仅用于限定数据来源，不作为候选层面分母，也不构成对分组标签的独立确认。</w:t>
       </w:r>
     </w:p>
     <w:p>
@@ -679,35 +838,95 @@
     </w:p>
     <w:p>
       <w:pPr>
-        <w:pStyle w:val="Normal"/>
-      </w:pPr>
-      <w:r>
-        <w:t>外部记录还描述了未完成的分子动力学尝试。由于不存在坐标、拓扑、参数、日志、能量、检查点或轨迹，该尝试被排除在本研究结果之外，且不表述为已复现工作。</w:t>
-      </w:r>
-    </w:p>
-    <w:p>
-      <w:pPr>
         <w:pStyle w:val="Heading3"/>
         <w:keepNext/>
       </w:pPr>
       <w:r>
-        <w:t>2.8 描述性统计与审计规则</w:t>
-      </w:r>
-    </w:p>
-    <w:p>
-      <w:pPr>
-        <w:pStyle w:val="Normal"/>
-      </w:pPr>
-      <w:r>
-        <w:t>计数从A层转录；比例按100×n/N并使用明确分母重算。候选序列是嵌套于样本、基因组和同源序列组的计算记账单位，不是独立生物学重复。在缺少受试者/样本—候选行时，对汇总肽计数进行Fisher或卡方检验将造成伪重复并人为缩小不确定性。因此，本研究不报告健康与牙周炎比较的p值、置信区间、效应量、ROC、功效或多重校正。</w:t>
-      </w:r>
-    </w:p>
-    <w:p>
-      <w:pPr>
-        <w:pStyle w:val="Normal"/>
-      </w:pPr>
-      <w:r>
-        <w:t>标准库脚本检查分支加和、分子≤分母、NTxPred2已评估/未评估分区、下游单调性、8/12阈值敏感性、序列组成和分数排序。这些属于算术与来源审计，不是生物学管线或对接的独立复现。</w:t>
+        <w:t>2.8 前瞻性GROMACS分子动力学方案</w:t>
+      </w:r>
+    </w:p>
+    <w:p>
+      <w:pPr>
+        <w:pStyle w:val="Normal"/>
+      </w:pPr>
+      <w:r>
+        <w:t>下游MD方案登记自</w:t>
+      </w:r>
+      <w:r>
+        <w:rPr>
+          <w:rFonts w:ascii="Consolas" w:hAnsi="Consolas" w:eastAsia="等线"/>
+          <w:shd w:val="clear" w:color="auto" w:fill="F2F4F7"/>
+        </w:rPr>
+        <w:t>shaohuawen03-cyber/asd</w:t>
+      </w:r>
+      <w:r>
+        <w:t>提交</w:t>
+      </w:r>
+      <w:r>
+        <w:rPr>
+          <w:rFonts w:ascii="Consolas" w:hAnsi="Consolas" w:eastAsia="等线"/>
+          <w:shd w:val="clear" w:color="auto" w:fill="F2F4F7"/>
+        </w:rPr>
+        <w:t>f11cd3751e8fce53dbf1a335ef1d8fa777751ef5</w:t>
+      </w:r>
+      <w:r>
+        <w:t>中的</w:t>
+      </w:r>
+      <w:r>
+        <w:rPr>
+          <w:rFonts w:ascii="Consolas" w:hAnsi="Consolas" w:eastAsia="等线"/>
+          <w:shd w:val="clear" w:color="auto" w:fill="F2F4F7"/>
+        </w:rPr>
+        <w:t>gromacs_md/</w:t>
+      </w:r>
+      <w:r>
+        <w:t>目录（https://github.com/shaohuawen03-cyber/asd/tree/arena/019ff90e-asd/gromacs_md）。控制性文件采用可执行的</w:t>
+      </w:r>
+      <w:r>
+        <w:rPr>
+          <w:rFonts w:ascii="Consolas" w:hAnsi="Consolas" w:eastAsia="等线"/>
+          <w:shd w:val="clear" w:color="auto" w:fill="F2F4F7"/>
+        </w:rPr>
+        <w:t>mdp/100ns/*.mdp</w:t>
+      </w:r>
+      <w:r>
+        <w:t>参数集和</w:t>
+      </w:r>
+      <w:r>
+        <w:rPr>
+          <w:rFonts w:ascii="Consolas" w:hAnsi="Consolas" w:eastAsia="等线"/>
+          <w:shd w:val="clear" w:color="auto" w:fill="F2F4F7"/>
+        </w:rPr>
+        <w:t>scripts/run_all.sh</w:t>
+      </w:r>
+      <w:r>
+        <w:t>，而不采用该仓库其他叙述中关于不同生产时长的表述。计划体系包括游离人AChE，以及标记为ALLLHRC、FLLHTTR和YLSLLQR的AChE复合物。审计时，仓库输入目录中不存在所需复合物PDB，因此该方案按前瞻性方法报告，不表述为已执行分析。</w:t>
+      </w:r>
+    </w:p>
+    <w:p>
+      <w:pPr>
+        <w:pStyle w:val="Normal"/>
+      </w:pPr>
+      <w:r>
+        <w:t>配置流程以GROMACS运行，默认力场为</w:t>
+      </w:r>
+      <w:r>
+        <w:rPr>
+          <w:rFonts w:ascii="Consolas" w:hAnsi="Consolas" w:eastAsia="等线"/>
+          <w:shd w:val="clear" w:color="auto" w:fill="F2F4F7"/>
+        </w:rPr>
+        <w:t>amber99sb-ildn</w:t>
+      </w:r>
+      <w:r>
+        <w:t>，采用TIP3P水拓扑、溶质至边界距离1.0 nm的三斜周期盒，以及中和并加入0.15 mol/L NaCl。能量最小化设置为2,000步最速下降，并对重原子施加1,255 kJ mol⁻¹ nm⁻²位置约束。随后在约束下使用velocity-rescale控温，于1.0 ns NVT过程中从10 K升至300 K；继而在300 K、1 bar下进行1.0 ns约束NPT平衡和1.0 ns无约束NPT平衡。前瞻性生产阶段为100 ns，步长2 fs，使用LINCS约束含氢键，实空间截断1.2 nm，范德华相互作用从1.0 nm开始力切换，长程静电采用PME，温度采用velocity-rescale耦合，压力采用Berendsen耦合。计划每20 ps保存坐标，每条轨迹共5,000帧。</w:t>
+      </w:r>
+    </w:p>
+    <w:p>
+      <w:pPr>
+        <w:pStyle w:val="Normal"/>
+      </w:pPr>
+      <w:r>
+        <w:t>预先指定的轨迹输出包括复合物、AChE和肽层面的RMSD/RMSF、回转半径、溶剂可及表面积、径向分布函数、DSSP二级结构、氢键、残基接触和桥连水分析。任何MD结果被接纳前，必须归档起始坐标、末端和质子化状态、拓扑哈希、精确GROMACS版本、随机种子、重复设计、命令、日志、TPR、轨迹、能量、检查点和最终坐标文件。参考仓库中的未完成分析产物不纳入本稿；本文不报告稳定性、收敛性、接触或体系间MD结论。</w:t>
       </w:r>
     </w:p>
     <w:p>
@@ -716,7 +935,32 @@
         <w:keepNext/>
       </w:pPr>
       <w:r>
-        <w:t>2.9 文献与报告完整性</w:t>
+        <w:t>2.9 描述性统计与审计规则</w:t>
+      </w:r>
+    </w:p>
+    <w:p>
+      <w:pPr>
+        <w:pStyle w:val="Normal"/>
+      </w:pPr>
+      <w:r>
+        <w:t>计数从A层转录；比例按100×n/N并使用明确分母重算。候选序列是嵌套于样本、基因组和同源序列组的计算记账单位，不是独立生物学重复。在缺少受试者/样本—候选行时，对汇总肽计数进行Fisher或卡方检验将造成伪重复并人为缩小不确定性。因此，本研究不报告健康与牙周炎比较的p值、置信区间、效应量、ROC、功效或多重校正。</w:t>
+      </w:r>
+    </w:p>
+    <w:p>
+      <w:pPr>
+        <w:pStyle w:val="Normal"/>
+      </w:pPr>
+      <w:r>
+        <w:t>标准库脚本检查分支加和、分子≤分母、NTxPred2已评估/未评估分区、下游单调性、8/12阈值敏感性、序列组成和分数排序。这些属于算术与来源审计，不是生物学管线或对接的独立复现。</w:t>
+      </w:r>
+    </w:p>
+    <w:p>
+      <w:pPr>
+        <w:pStyle w:val="Heading3"/>
+        <w:keepNext/>
+      </w:pPr>
+      <w:r>
+        <w:t>2.10 文献与报告完整性</w:t>
       </w:r>
     </w:p>
     <w:p>
@@ -5543,7 +5787,7 @@
         <w:t>图3.</w:t>
       </w:r>
       <w:r>
-        <w:t xml:space="preserve"> 整合外部来源记录后的证据阶梯。汇总筛选已达到；12条序列和对接分数属于部分可用的来源报告新增信息。原始链路和对接产物、表达、暴露、表型、机制和因果关系仍未解决或未测试。</w:t>
+        <w:t xml:space="preserve"> 整合外部来源记录和前瞻性MD流程后的证据阶梯。汇总筛选已达到；12条序列和对接分数属于部分可用的来源报告信息；MD阶段仅有登记方法，不含可接纳轨迹结果。原始链路和对接产物、表达、暴露、表型、机制和因果关系仍未解决或未测试。</w:t>
       </w:r>
     </w:p>
     <w:p>
@@ -5736,7 +5980,7 @@
         <w:pStyle w:val="Normal"/>
       </w:pPr>
       <w:r>
-        <w:t>对接发布应增加受体登录号和链、缺失残基处理、质子化、端基、电荷、水/辅因子、配体构象、PDBQT、盒中心与大小、exhaustiveness、mode数、energy range、种子、原始日志、所有构象、聚类和相互作用分析代码。外部记录的失败MD叙述在缺少模拟包时无法评估，未纳入本研究结果。只有对接可复现且结构缺口被前瞻处理后，才应启动新的模拟。</w:t>
+        <w:t>对接发布应增加受体登录号和链、缺失残基处理、质子化、端基、电荷、水/辅因子、配体构象、PDBQT、盒中心与大小、exhaustiveness、mode数、energy range、种子、原始日志、所有构象、聚类和相互作用分析代码。现已登记的GROMACS流程记录了100 ns方案，但审计快照不含起始复合物结构和完整模拟包。本稿不使用任何局部轨迹指标。后续MD报告必须版本化最终参数集，前瞻性解决生产期控压以及种子/重复设计，归档全部原始轨迹与日志，并在不根据结果修改流程的前提下实施预先指定分析。</w:t>
       </w:r>
     </w:p>
     <w:p>
@@ -5974,15 +6218,15 @@
         <w:pStyle w:val="Normal"/>
       </w:pPr>
       <w:r>
-        <w:t>优势包括明确分离的证据架构、完整汇总算术、显式分母、拒绝伪重复推断检验、整合具体序列清单、独立序列组成审计、透明对接来源、53条文献的机制背景，以及可复现图件/文档构建。本稿还保留负面边界，而不隐藏材料缺失。</w:t>
-      </w:r>
-    </w:p>
-    <w:p>
-      <w:pPr>
-        <w:pStyle w:val="Normal"/>
-      </w:pPr>
-      <w:r>
-        <w:t>局限仍具有决定性。主要来源缺少逐行数据和代码；外部序列清单无法审计连接到主要来源12行或更严格8条；对接汇总缺少原始产物且未复现；候选分类、翻译、队列表达、BBB转运、毒性、金属化学、AChE结合/功能、Aβ效应和疾病关联均未测量；登录号关系已解决，但候选—样本和登录号—分组映射仍不可得；主要来源PDF被保留，但未独立逐页解析。增加文字或文献不能消除这些局限。</w:t>
+        <w:t>优势包括明确分离的证据架构、完整汇总算术、显式分母、拒绝伪重复推断检验、整合具体序列清单、独立序列组成审计、透明对接来源、前瞻性版本化MD方案、基于证据综合的机制背景，以及可复现SVG和文档构建。本稿还保留负面边界，而不隐藏材料缺失。</w:t>
+      </w:r>
+    </w:p>
+    <w:p>
+      <w:pPr>
+        <w:pStyle w:val="Normal"/>
+      </w:pPr>
+      <w:r>
+        <w:t>局限仍具有决定性。主要来源缺少逐行数据和代码；外部序列清单无法审计连接到主要来源12行或更严格8条；对接汇总缺少原始产物且未复现；MD起始结构和完整原始模拟包不可用，轨迹分析尚未完成，本文不报告MD结果；候选分类、翻译、队列表达、BBB转运、毒性、金属化学、AChE结合/功能、Aβ效应和疾病关联均未测量；登录号关系已解决，但候选—样本、登录号—分组和MAG-bin映射仍不可得。增加文字或文献不能消除这些局限。</w:t>
       </w:r>
     </w:p>
     <w:p>
@@ -6007,7 +6251,7 @@
         <w:pStyle w:val="Normal"/>
       </w:pPr>
       <w:r>
-        <w:t>科学上下一项不可协商的工作是发布或重建逐行筛选和对接产物，继而开展表达、转运、毒理、金属和AChE/Aβ实验。在此之前，不应提出疾病特异性、靶标结合或因果结论。</w:t>
+        <w:t>下一步计算工作是发布或重建逐行筛选和对接产物，并以版本化输入、完整轨迹、日志、重复定义和预先指定分析完成已登记MD流程。其后仍需实验评价表达、转运、毒理、金属化学和AChE/Aβ效应。在此之前，不应提出疾病特异性、靶标结合、动态稳定性或因果结论。</w:t>
       </w:r>
     </w:p>
     <w:p>
@@ -6067,7 +6311,27 @@
         <w:pStyle w:val="Normal"/>
       </w:pPr>
       <w:r>
-        <w:t>主要记录列出PRJNA678453、PRJEB65451、PXD003151、PXD004319、PXD026727及HOMD/eHOMD。PRJNA678453是包含22名参与者和66份标本的来源队列；PRJEB65451是其衍生的EBI-EMG/MGnify TPA组装项目。外部来源记录提供表3的12条序列，但不含稳定ID、受试者/样本映射、谱图、分类、预测器逐行输出、严格子集标签或主要来源链路。PDB 4EY6为公共结构[27]。原始对接输入、运行、日志和构象不可用。</w:t>
+        <w:t>主要记录列出PRJNA678453、PRJEB65451、PXD003151、PXD004319、PXD026727及HOMD/eHOMD。PRJEB65451是与PRJNA678453关联的衍生EBI-EMG/MGnify TPA组装项目；因缺少可重算映射和bin清单，正文不报告队列或MAG总数。外部来源记录提供表3的12条序列，但不含稳定ID、受试者/样本映射、谱图、分类、预测器逐行输出、严格子集标签或主要来源链路。PDB 4EY6为公共结构[27]。原始对接输入、运行、日志和构象不可用。前瞻性MD脚本版本化于</w:t>
+      </w:r>
+      <w:r>
+        <w:rPr>
+          <w:rFonts w:ascii="Consolas" w:hAnsi="Consolas" w:eastAsia="等线"/>
+          <w:shd w:val="clear" w:color="auto" w:fill="F2F4F7"/>
+        </w:rPr>
+        <w:t>shaohuawen03-cyber/asd</w:t>
+      </w:r>
+      <w:r>
+        <w:t>提交</w:t>
+      </w:r>
+      <w:r>
+        <w:rPr>
+          <w:rFonts w:ascii="Consolas" w:hAnsi="Consolas" w:eastAsia="等线"/>
+          <w:shd w:val="clear" w:color="auto" w:fill="F2F4F7"/>
+        </w:rPr>
+        <w:t>f11cd3751e8fce53dbf1a335ef1d8fa777751ef5</w:t>
+      </w:r>
+      <w:r>
+        <w:t>；本次分析无法获得完整起始结构和原始生产轨迹。</w:t>
       </w:r>
     </w:p>
     <w:p>
@@ -6084,7 +6348,7 @@
         <w:pStyle w:val="Normal"/>
       </w:pPr>
       <w:r>
-        <w:t>本仓库含文档提取、汇总算术、序列组成检查、图件、双语组装、DOCX打包和质量审计代码；不含原始smORF发现/预测管线，也不含外部对接的可执行复现。因此，代码可复现报告算术和文档层审计，但不能复现缺少输入和执行产物的分析。</w:t>
+        <w:t>本仓库含文档提取、汇总算术、序列组成检查、可编辑文字SVG图件、DOCX打包和质量审计代码；不含原始smORF发现/预测管线，也不含外部对接的可执行复现。参考MD仓库含前瞻性流程，但缺少接纳结果所需的完整输入和原始轨迹。因此，现有代码可复现报告算术和文档层审计，但不能复现缺少输入和执行产物的分析。</w:t>
       </w:r>
     </w:p>
     <w:p>

</xml_diff>

<commit_message>
release: restore multidimensional peptide results for v3.9.0
Co-authored-by: arena-agent <297053741+arena-agent@users.noreply.github.com>
</commit_message>
<xml_diff>
--- a/projects/porphyromonas-ad-mechanism-manuscript/manuscript/full/Chinese.docx
+++ b/projects/porphyromonas-ad-mechanism-manuscript/manuscript/full/Chinese.docx
@@ -851,6 +851,14 @@
       </w:r>
       <w:r>
         <w:t>。</w:t>
+      </w:r>
+    </w:p>
+    <w:p>
+      <w:pPr>
+        <w:pStyle w:val="BodyText"/>
+      </w:pPr>
+      <w:r>
+        <w:t>主源还分别保留了短肽与长肽分支中22项UniDL4BioPep功能输出的高置信度计数，包括ACE抑制、TTCA、BBB、抗寄生虫、NeuroPred、抗细菌、抗真菌、抗病毒、毒性、抗氧化FRS、致敏性、DPP-IV抑制、细胞穿透、苦味、鲜味、广谱抗菌、两项抗疟输出、群体感应、两项抗癌输出和Anti-MRSA。所有任务均采用所提供的≥0.80阈值。计数和比例按分支特异背景转录（长肽：健康标记953条、牙周炎标记1,032条；短肽：30,557条和32,754条）；这些输出是可重叠的任务标签，不作为独立生物学重复或组间富集证据。</w:t>
       </w:r>
     </w:p>
     <w:p>
@@ -1478,6 +1486,4626 @@
         <w:keepNext/>
       </w:pPr>
       <w:r>
+        <w:t>长肽多维功能预测结果</w:t>
+      </w:r>
+    </w:p>
+    <w:p>
+      <w:pPr>
+        <w:pStyle w:val="BodyText"/>
+      </w:pPr>
+      <w:r>
+        <w:t>完整长肽分支汇总按主源保留（表2）。在健康标记953条和牙周炎标记1,032条长肽背景中，数量最大的高置信度输出为Bitter（635条，66.63%；641条，62.11%），其次为Anti-parasitic（288条，30.22%；280条，27.13%）和Antimicrobial（206条，21.62%；238条，23.06%）。BBB高分分别为40条（4.20%）和72条（6.98%），NeuroPred分别为82条（8.60%）和77条（7.46%），Toxicity分别为13条（1.36%）和18条（1.74%）。由于不同功能输出可以重叠，且候选不是参与者层面的独立观察，这些并列比例仅作描述。</w:t>
+      </w:r>
+    </w:p>
+    <w:p>
+      <w:pPr>
+        <w:pStyle w:val="Caption"/>
+      </w:pPr>
+      <w:r>
+        <w:rPr>
+          <w:b/>
+        </w:rPr>
+        <w:t>表2. UniDL4BioPep评分≥0.80的长肽多维功能预测结果。</w:t>
+      </w:r>
+    </w:p>
+    <w:tbl>
+      <w:tblPr>
+        <w:tblStyle w:val="ThreeLineTable"/>
+        <w:tblW w:w="5000" w:type="pct"/>
+        <w:tblLayout w:type="fixed"/>
+        <w:tblBorders>
+          <w:top w:val="single" w:sz="12" w:space="0" w:color="000000"/>
+          <w:left w:val="nil"/>
+          <w:bottom w:val="single" w:sz="12" w:space="0" w:color="000000"/>
+          <w:right w:val="nil"/>
+          <w:insideH w:val="nil"/>
+          <w:insideV w:val="nil"/>
+        </w:tblBorders>
+        <w:tblCellMar>
+          <w:top w:w="70" w:type="dxa"/>
+          <w:left w:w="80" w:type="dxa"/>
+          <w:bottom w:w="70" w:type="dxa"/>
+          <w:right w:w="80" w:type="dxa"/>
+        </w:tblCellMar>
+      </w:tblPr>
+      <w:tblGrid>
+        <w:gridCol w:w="1872"/>
+        <w:gridCol w:w="1872"/>
+        <w:gridCol w:w="1872"/>
+        <w:gridCol w:w="1872"/>
+        <w:gridCol w:w="1872"/>
+      </w:tblGrid>
+      <w:tr>
+        <w:trPr>
+          <w:tblHeader/>
+        </w:trPr>
+        <w:tc>
+          <w:tcPr>
+            <w:tcW w:w="1872" w:type="dxa"/>
+            <w:tcBorders>
+              <w:bottom w:val="single" w:sz="8" w:space="0" w:color="000000"/>
+            </w:tcBorders>
+            <w:vAlign w:val="center"/>
+          </w:tcPr>
+          <w:p>
+            <w:pPr>
+              <w:pStyle w:val="TableText"/>
+              <w:spacing w:before="0" w:after="0" w:line="240" w:lineRule="auto"/>
+            </w:pPr>
+            <w:r>
+              <w:rPr>
+                <w:sz w:val="20"/>
+                <w:szCs w:val="20"/>
+              </w:rPr>
+              <w:t>模型输出</w:t>
+            </w:r>
+          </w:p>
+        </w:tc>
+        <w:tc>
+          <w:tcPr>
+            <w:tcW w:w="1872" w:type="dxa"/>
+            <w:tcBorders>
+              <w:bottom w:val="single" w:sz="8" w:space="0" w:color="000000"/>
+            </w:tcBorders>
+            <w:vAlign w:val="center"/>
+          </w:tcPr>
+          <w:p>
+            <w:pPr>
+              <w:pStyle w:val="TableText"/>
+              <w:spacing w:before="0" w:after="0" w:line="240" w:lineRule="auto"/>
+            </w:pPr>
+            <w:r>
+              <w:rPr>
+                <w:sz w:val="20"/>
+                <w:szCs w:val="20"/>
+              </w:rPr>
+              <w:t>健康 n</w:t>
+            </w:r>
+          </w:p>
+        </w:tc>
+        <w:tc>
+          <w:tcPr>
+            <w:tcW w:w="1872" w:type="dxa"/>
+            <w:tcBorders>
+              <w:bottom w:val="single" w:sz="8" w:space="0" w:color="000000"/>
+            </w:tcBorders>
+            <w:vAlign w:val="center"/>
+          </w:tcPr>
+          <w:p>
+            <w:pPr>
+              <w:pStyle w:val="TableText"/>
+              <w:spacing w:before="0" w:after="0" w:line="240" w:lineRule="auto"/>
+            </w:pPr>
+            <w:r>
+              <w:rPr>
+                <w:sz w:val="20"/>
+                <w:szCs w:val="20"/>
+              </w:rPr>
+              <w:t>健康 %</w:t>
+            </w:r>
+          </w:p>
+        </w:tc>
+        <w:tc>
+          <w:tcPr>
+            <w:tcW w:w="1872" w:type="dxa"/>
+            <w:tcBorders>
+              <w:bottom w:val="single" w:sz="8" w:space="0" w:color="000000"/>
+            </w:tcBorders>
+            <w:vAlign w:val="center"/>
+          </w:tcPr>
+          <w:p>
+            <w:pPr>
+              <w:pStyle w:val="TableText"/>
+              <w:spacing w:before="0" w:after="0" w:line="240" w:lineRule="auto"/>
+            </w:pPr>
+            <w:r>
+              <w:rPr>
+                <w:sz w:val="20"/>
+                <w:szCs w:val="20"/>
+              </w:rPr>
+              <w:t>牙周炎 n</w:t>
+            </w:r>
+          </w:p>
+        </w:tc>
+        <w:tc>
+          <w:tcPr>
+            <w:tcW w:w="1872" w:type="dxa"/>
+            <w:tcBorders>
+              <w:bottom w:val="single" w:sz="8" w:space="0" w:color="000000"/>
+            </w:tcBorders>
+            <w:vAlign w:val="center"/>
+          </w:tcPr>
+          <w:p>
+            <w:pPr>
+              <w:pStyle w:val="TableText"/>
+              <w:spacing w:before="0" w:after="0" w:line="240" w:lineRule="auto"/>
+            </w:pPr>
+            <w:r>
+              <w:rPr>
+                <w:sz w:val="20"/>
+                <w:szCs w:val="20"/>
+              </w:rPr>
+              <w:t>牙周炎 %</w:t>
+            </w:r>
+          </w:p>
+        </w:tc>
+      </w:tr>
+      <w:tr>
+        <w:tc>
+          <w:tcPr>
+            <w:tcW w:w="1872" w:type="dxa"/>
+            <w:vAlign w:val="center"/>
+          </w:tcPr>
+          <w:p>
+            <w:pPr>
+              <w:pStyle w:val="TableText"/>
+              <w:spacing w:before="0" w:after="0" w:line="240" w:lineRule="auto"/>
+            </w:pPr>
+            <w:r>
+              <w:rPr>
+                <w:sz w:val="20"/>
+                <w:szCs w:val="20"/>
+              </w:rPr>
+              <w:t>ACP_Anticancer_alt</w:t>
+            </w:r>
+          </w:p>
+        </w:tc>
+        <w:tc>
+          <w:tcPr>
+            <w:tcW w:w="1872" w:type="dxa"/>
+            <w:vAlign w:val="center"/>
+          </w:tcPr>
+          <w:p>
+            <w:pPr>
+              <w:pStyle w:val="TableText"/>
+              <w:spacing w:before="0" w:after="0" w:line="240" w:lineRule="auto"/>
+            </w:pPr>
+            <w:r>
+              <w:rPr>
+                <w:sz w:val="20"/>
+                <w:szCs w:val="20"/>
+              </w:rPr>
+              <w:t>91</w:t>
+            </w:r>
+          </w:p>
+        </w:tc>
+        <w:tc>
+          <w:tcPr>
+            <w:tcW w:w="1872" w:type="dxa"/>
+            <w:vAlign w:val="center"/>
+          </w:tcPr>
+          <w:p>
+            <w:pPr>
+              <w:pStyle w:val="TableText"/>
+              <w:spacing w:before="0" w:after="0" w:line="240" w:lineRule="auto"/>
+            </w:pPr>
+            <w:r>
+              <w:rPr>
+                <w:sz w:val="20"/>
+                <w:szCs w:val="20"/>
+              </w:rPr>
+              <w:t>9.55</w:t>
+            </w:r>
+          </w:p>
+        </w:tc>
+        <w:tc>
+          <w:tcPr>
+            <w:tcW w:w="1872" w:type="dxa"/>
+            <w:vAlign w:val="center"/>
+          </w:tcPr>
+          <w:p>
+            <w:pPr>
+              <w:pStyle w:val="TableText"/>
+              <w:spacing w:before="0" w:after="0" w:line="240" w:lineRule="auto"/>
+            </w:pPr>
+            <w:r>
+              <w:rPr>
+                <w:sz w:val="20"/>
+                <w:szCs w:val="20"/>
+              </w:rPr>
+              <w:t>121</w:t>
+            </w:r>
+          </w:p>
+        </w:tc>
+        <w:tc>
+          <w:tcPr>
+            <w:tcW w:w="1872" w:type="dxa"/>
+            <w:vAlign w:val="center"/>
+          </w:tcPr>
+          <w:p>
+            <w:pPr>
+              <w:pStyle w:val="TableText"/>
+              <w:spacing w:before="0" w:after="0" w:line="240" w:lineRule="auto"/>
+            </w:pPr>
+            <w:r>
+              <w:rPr>
+                <w:sz w:val="20"/>
+                <w:szCs w:val="20"/>
+              </w:rPr>
+              <w:t>11.72</w:t>
+            </w:r>
+          </w:p>
+        </w:tc>
+      </w:tr>
+      <w:tr>
+        <w:tc>
+          <w:tcPr>
+            <w:tcW w:w="1872" w:type="dxa"/>
+            <w:vAlign w:val="center"/>
+          </w:tcPr>
+          <w:p>
+            <w:pPr>
+              <w:pStyle w:val="TableText"/>
+              <w:spacing w:before="0" w:after="0" w:line="240" w:lineRule="auto"/>
+            </w:pPr>
+            <w:r>
+              <w:rPr>
+                <w:sz w:val="20"/>
+                <w:szCs w:val="20"/>
+              </w:rPr>
+              <w:t>BBB_Peptides</w:t>
+            </w:r>
+          </w:p>
+        </w:tc>
+        <w:tc>
+          <w:tcPr>
+            <w:tcW w:w="1872" w:type="dxa"/>
+            <w:vAlign w:val="center"/>
+          </w:tcPr>
+          <w:p>
+            <w:pPr>
+              <w:pStyle w:val="TableText"/>
+              <w:spacing w:before="0" w:after="0" w:line="240" w:lineRule="auto"/>
+            </w:pPr>
+            <w:r>
+              <w:rPr>
+                <w:sz w:val="20"/>
+                <w:szCs w:val="20"/>
+              </w:rPr>
+              <w:t>40</w:t>
+            </w:r>
+          </w:p>
+        </w:tc>
+        <w:tc>
+          <w:tcPr>
+            <w:tcW w:w="1872" w:type="dxa"/>
+            <w:vAlign w:val="center"/>
+          </w:tcPr>
+          <w:p>
+            <w:pPr>
+              <w:pStyle w:val="TableText"/>
+              <w:spacing w:before="0" w:after="0" w:line="240" w:lineRule="auto"/>
+            </w:pPr>
+            <w:r>
+              <w:rPr>
+                <w:sz w:val="20"/>
+                <w:szCs w:val="20"/>
+              </w:rPr>
+              <w:t>4.20</w:t>
+            </w:r>
+          </w:p>
+        </w:tc>
+        <w:tc>
+          <w:tcPr>
+            <w:tcW w:w="1872" w:type="dxa"/>
+            <w:vAlign w:val="center"/>
+          </w:tcPr>
+          <w:p>
+            <w:pPr>
+              <w:pStyle w:val="TableText"/>
+              <w:spacing w:before="0" w:after="0" w:line="240" w:lineRule="auto"/>
+            </w:pPr>
+            <w:r>
+              <w:rPr>
+                <w:sz w:val="20"/>
+                <w:szCs w:val="20"/>
+              </w:rPr>
+              <w:t>72</w:t>
+            </w:r>
+          </w:p>
+        </w:tc>
+        <w:tc>
+          <w:tcPr>
+            <w:tcW w:w="1872" w:type="dxa"/>
+            <w:vAlign w:val="center"/>
+          </w:tcPr>
+          <w:p>
+            <w:pPr>
+              <w:pStyle w:val="TableText"/>
+              <w:spacing w:before="0" w:after="0" w:line="240" w:lineRule="auto"/>
+            </w:pPr>
+            <w:r>
+              <w:rPr>
+                <w:sz w:val="20"/>
+                <w:szCs w:val="20"/>
+              </w:rPr>
+              <w:t>6.98</w:t>
+            </w:r>
+          </w:p>
+        </w:tc>
+      </w:tr>
+      <w:tr>
+        <w:tc>
+          <w:tcPr>
+            <w:tcW w:w="1872" w:type="dxa"/>
+            <w:vAlign w:val="center"/>
+          </w:tcPr>
+          <w:p>
+            <w:pPr>
+              <w:pStyle w:val="TableText"/>
+              <w:spacing w:before="0" w:after="0" w:line="240" w:lineRule="auto"/>
+            </w:pPr>
+            <w:r>
+              <w:rPr>
+                <w:sz w:val="20"/>
+                <w:szCs w:val="20"/>
+              </w:rPr>
+              <w:t>Quorum_sensing</w:t>
+            </w:r>
+          </w:p>
+        </w:tc>
+        <w:tc>
+          <w:tcPr>
+            <w:tcW w:w="1872" w:type="dxa"/>
+            <w:vAlign w:val="center"/>
+          </w:tcPr>
+          <w:p>
+            <w:pPr>
+              <w:pStyle w:val="TableText"/>
+              <w:spacing w:before="0" w:after="0" w:line="240" w:lineRule="auto"/>
+            </w:pPr>
+            <w:r>
+              <w:rPr>
+                <w:sz w:val="20"/>
+                <w:szCs w:val="20"/>
+              </w:rPr>
+              <w:t>173</w:t>
+            </w:r>
+          </w:p>
+        </w:tc>
+        <w:tc>
+          <w:tcPr>
+            <w:tcW w:w="1872" w:type="dxa"/>
+            <w:vAlign w:val="center"/>
+          </w:tcPr>
+          <w:p>
+            <w:pPr>
+              <w:pStyle w:val="TableText"/>
+              <w:spacing w:before="0" w:after="0" w:line="240" w:lineRule="auto"/>
+            </w:pPr>
+            <w:r>
+              <w:rPr>
+                <w:sz w:val="20"/>
+                <w:szCs w:val="20"/>
+              </w:rPr>
+              <w:t>18.15</w:t>
+            </w:r>
+          </w:p>
+        </w:tc>
+        <w:tc>
+          <w:tcPr>
+            <w:tcW w:w="1872" w:type="dxa"/>
+            <w:vAlign w:val="center"/>
+          </w:tcPr>
+          <w:p>
+            <w:pPr>
+              <w:pStyle w:val="TableText"/>
+              <w:spacing w:before="0" w:after="0" w:line="240" w:lineRule="auto"/>
+            </w:pPr>
+            <w:r>
+              <w:rPr>
+                <w:sz w:val="20"/>
+                <w:szCs w:val="20"/>
+              </w:rPr>
+              <w:t>190</w:t>
+            </w:r>
+          </w:p>
+        </w:tc>
+        <w:tc>
+          <w:tcPr>
+            <w:tcW w:w="1872" w:type="dxa"/>
+            <w:vAlign w:val="center"/>
+          </w:tcPr>
+          <w:p>
+            <w:pPr>
+              <w:pStyle w:val="TableText"/>
+              <w:spacing w:before="0" w:after="0" w:line="240" w:lineRule="auto"/>
+            </w:pPr>
+            <w:r>
+              <w:rPr>
+                <w:sz w:val="20"/>
+                <w:szCs w:val="20"/>
+              </w:rPr>
+              <w:t>18.41</w:t>
+            </w:r>
+          </w:p>
+        </w:tc>
+      </w:tr>
+      <w:tr>
+        <w:tc>
+          <w:tcPr>
+            <w:tcW w:w="1872" w:type="dxa"/>
+            <w:vAlign w:val="center"/>
+          </w:tcPr>
+          <w:p>
+            <w:pPr>
+              <w:pStyle w:val="TableText"/>
+              <w:spacing w:before="0" w:after="0" w:line="240" w:lineRule="auto"/>
+            </w:pPr>
+            <w:r>
+              <w:rPr>
+                <w:sz w:val="20"/>
+                <w:szCs w:val="20"/>
+              </w:rPr>
+              <w:t>Antimicrobial</w:t>
+            </w:r>
+          </w:p>
+        </w:tc>
+        <w:tc>
+          <w:tcPr>
+            <w:tcW w:w="1872" w:type="dxa"/>
+            <w:vAlign w:val="center"/>
+          </w:tcPr>
+          <w:p>
+            <w:pPr>
+              <w:pStyle w:val="TableText"/>
+              <w:spacing w:before="0" w:after="0" w:line="240" w:lineRule="auto"/>
+            </w:pPr>
+            <w:r>
+              <w:rPr>
+                <w:sz w:val="20"/>
+                <w:szCs w:val="20"/>
+              </w:rPr>
+              <w:t>206</w:t>
+            </w:r>
+          </w:p>
+        </w:tc>
+        <w:tc>
+          <w:tcPr>
+            <w:tcW w:w="1872" w:type="dxa"/>
+            <w:vAlign w:val="center"/>
+          </w:tcPr>
+          <w:p>
+            <w:pPr>
+              <w:pStyle w:val="TableText"/>
+              <w:spacing w:before="0" w:after="0" w:line="240" w:lineRule="auto"/>
+            </w:pPr>
+            <w:r>
+              <w:rPr>
+                <w:sz w:val="20"/>
+                <w:szCs w:val="20"/>
+              </w:rPr>
+              <w:t>21.62</w:t>
+            </w:r>
+          </w:p>
+        </w:tc>
+        <w:tc>
+          <w:tcPr>
+            <w:tcW w:w="1872" w:type="dxa"/>
+            <w:vAlign w:val="center"/>
+          </w:tcPr>
+          <w:p>
+            <w:pPr>
+              <w:pStyle w:val="TableText"/>
+              <w:spacing w:before="0" w:after="0" w:line="240" w:lineRule="auto"/>
+            </w:pPr>
+            <w:r>
+              <w:rPr>
+                <w:sz w:val="20"/>
+                <w:szCs w:val="20"/>
+              </w:rPr>
+              <w:t>238</w:t>
+            </w:r>
+          </w:p>
+        </w:tc>
+        <w:tc>
+          <w:tcPr>
+            <w:tcW w:w="1872" w:type="dxa"/>
+            <w:vAlign w:val="center"/>
+          </w:tcPr>
+          <w:p>
+            <w:pPr>
+              <w:pStyle w:val="TableText"/>
+              <w:spacing w:before="0" w:after="0" w:line="240" w:lineRule="auto"/>
+            </w:pPr>
+            <w:r>
+              <w:rPr>
+                <w:sz w:val="20"/>
+                <w:szCs w:val="20"/>
+              </w:rPr>
+              <w:t>23.06</w:t>
+            </w:r>
+          </w:p>
+        </w:tc>
+      </w:tr>
+      <w:tr>
+        <w:tc>
+          <w:tcPr>
+            <w:tcW w:w="1872" w:type="dxa"/>
+            <w:vAlign w:val="center"/>
+          </w:tcPr>
+          <w:p>
+            <w:pPr>
+              <w:pStyle w:val="TableText"/>
+              <w:spacing w:before="0" w:after="0" w:line="240" w:lineRule="auto"/>
+            </w:pPr>
+            <w:r>
+              <w:rPr>
+                <w:sz w:val="20"/>
+                <w:szCs w:val="20"/>
+              </w:rPr>
+              <w:t>Antibacterial</w:t>
+            </w:r>
+          </w:p>
+        </w:tc>
+        <w:tc>
+          <w:tcPr>
+            <w:tcW w:w="1872" w:type="dxa"/>
+            <w:vAlign w:val="center"/>
+          </w:tcPr>
+          <w:p>
+            <w:pPr>
+              <w:pStyle w:val="TableText"/>
+              <w:spacing w:before="0" w:after="0" w:line="240" w:lineRule="auto"/>
+            </w:pPr>
+            <w:r>
+              <w:rPr>
+                <w:sz w:val="20"/>
+                <w:szCs w:val="20"/>
+              </w:rPr>
+              <w:t>111</w:t>
+            </w:r>
+          </w:p>
+        </w:tc>
+        <w:tc>
+          <w:tcPr>
+            <w:tcW w:w="1872" w:type="dxa"/>
+            <w:vAlign w:val="center"/>
+          </w:tcPr>
+          <w:p>
+            <w:pPr>
+              <w:pStyle w:val="TableText"/>
+              <w:spacing w:before="0" w:after="0" w:line="240" w:lineRule="auto"/>
+            </w:pPr>
+            <w:r>
+              <w:rPr>
+                <w:sz w:val="20"/>
+                <w:szCs w:val="20"/>
+              </w:rPr>
+              <w:t>11.65</w:t>
+            </w:r>
+          </w:p>
+        </w:tc>
+        <w:tc>
+          <w:tcPr>
+            <w:tcW w:w="1872" w:type="dxa"/>
+            <w:vAlign w:val="center"/>
+          </w:tcPr>
+          <w:p>
+            <w:pPr>
+              <w:pStyle w:val="TableText"/>
+              <w:spacing w:before="0" w:after="0" w:line="240" w:lineRule="auto"/>
+            </w:pPr>
+            <w:r>
+              <w:rPr>
+                <w:sz w:val="20"/>
+                <w:szCs w:val="20"/>
+              </w:rPr>
+              <w:t>153</w:t>
+            </w:r>
+          </w:p>
+        </w:tc>
+        <w:tc>
+          <w:tcPr>
+            <w:tcW w:w="1872" w:type="dxa"/>
+            <w:vAlign w:val="center"/>
+          </w:tcPr>
+          <w:p>
+            <w:pPr>
+              <w:pStyle w:val="TableText"/>
+              <w:spacing w:before="0" w:after="0" w:line="240" w:lineRule="auto"/>
+            </w:pPr>
+            <w:r>
+              <w:rPr>
+                <w:sz w:val="20"/>
+                <w:szCs w:val="20"/>
+              </w:rPr>
+              <w:t>14.83</w:t>
+            </w:r>
+          </w:p>
+        </w:tc>
+      </w:tr>
+      <w:tr>
+        <w:tc>
+          <w:tcPr>
+            <w:tcW w:w="1872" w:type="dxa"/>
+            <w:vAlign w:val="center"/>
+          </w:tcPr>
+          <w:p>
+            <w:pPr>
+              <w:pStyle w:val="TableText"/>
+              <w:spacing w:before="0" w:after="0" w:line="240" w:lineRule="auto"/>
+            </w:pPr>
+            <w:r>
+              <w:rPr>
+                <w:sz w:val="20"/>
+                <w:szCs w:val="20"/>
+              </w:rPr>
+              <w:t>Anti-MRSA</w:t>
+            </w:r>
+          </w:p>
+        </w:tc>
+        <w:tc>
+          <w:tcPr>
+            <w:tcW w:w="1872" w:type="dxa"/>
+            <w:vAlign w:val="center"/>
+          </w:tcPr>
+          <w:p>
+            <w:pPr>
+              <w:pStyle w:val="TableText"/>
+              <w:spacing w:before="0" w:after="0" w:line="240" w:lineRule="auto"/>
+            </w:pPr>
+            <w:r>
+              <w:rPr>
+                <w:sz w:val="20"/>
+                <w:szCs w:val="20"/>
+              </w:rPr>
+              <w:t>47</w:t>
+            </w:r>
+          </w:p>
+        </w:tc>
+        <w:tc>
+          <w:tcPr>
+            <w:tcW w:w="1872" w:type="dxa"/>
+            <w:vAlign w:val="center"/>
+          </w:tcPr>
+          <w:p>
+            <w:pPr>
+              <w:pStyle w:val="TableText"/>
+              <w:spacing w:before="0" w:after="0" w:line="240" w:lineRule="auto"/>
+            </w:pPr>
+            <w:r>
+              <w:rPr>
+                <w:sz w:val="20"/>
+                <w:szCs w:val="20"/>
+              </w:rPr>
+              <w:t>4.93</w:t>
+            </w:r>
+          </w:p>
+        </w:tc>
+        <w:tc>
+          <w:tcPr>
+            <w:tcW w:w="1872" w:type="dxa"/>
+            <w:vAlign w:val="center"/>
+          </w:tcPr>
+          <w:p>
+            <w:pPr>
+              <w:pStyle w:val="TableText"/>
+              <w:spacing w:before="0" w:after="0" w:line="240" w:lineRule="auto"/>
+            </w:pPr>
+            <w:r>
+              <w:rPr>
+                <w:sz w:val="20"/>
+                <w:szCs w:val="20"/>
+              </w:rPr>
+              <w:t>62</w:t>
+            </w:r>
+          </w:p>
+        </w:tc>
+        <w:tc>
+          <w:tcPr>
+            <w:tcW w:w="1872" w:type="dxa"/>
+            <w:vAlign w:val="center"/>
+          </w:tcPr>
+          <w:p>
+            <w:pPr>
+              <w:pStyle w:val="TableText"/>
+              <w:spacing w:before="0" w:after="0" w:line="240" w:lineRule="auto"/>
+            </w:pPr>
+            <w:r>
+              <w:rPr>
+                <w:sz w:val="20"/>
+                <w:szCs w:val="20"/>
+              </w:rPr>
+              <w:t>6.01</w:t>
+            </w:r>
+          </w:p>
+        </w:tc>
+      </w:tr>
+      <w:tr>
+        <w:tc>
+          <w:tcPr>
+            <w:tcW w:w="1872" w:type="dxa"/>
+            <w:vAlign w:val="center"/>
+          </w:tcPr>
+          <w:p>
+            <w:pPr>
+              <w:pStyle w:val="TableText"/>
+              <w:spacing w:before="0" w:after="0" w:line="240" w:lineRule="auto"/>
+            </w:pPr>
+            <w:r>
+              <w:rPr>
+                <w:sz w:val="20"/>
+                <w:szCs w:val="20"/>
+              </w:rPr>
+              <w:t>CPP</w:t>
+            </w:r>
+          </w:p>
+        </w:tc>
+        <w:tc>
+          <w:tcPr>
+            <w:tcW w:w="1872" w:type="dxa"/>
+            <w:vAlign w:val="center"/>
+          </w:tcPr>
+          <w:p>
+            <w:pPr>
+              <w:pStyle w:val="TableText"/>
+              <w:spacing w:before="0" w:after="0" w:line="240" w:lineRule="auto"/>
+            </w:pPr>
+            <w:r>
+              <w:rPr>
+                <w:sz w:val="20"/>
+                <w:szCs w:val="20"/>
+              </w:rPr>
+              <w:t>15</w:t>
+            </w:r>
+          </w:p>
+        </w:tc>
+        <w:tc>
+          <w:tcPr>
+            <w:tcW w:w="1872" w:type="dxa"/>
+            <w:vAlign w:val="center"/>
+          </w:tcPr>
+          <w:p>
+            <w:pPr>
+              <w:pStyle w:val="TableText"/>
+              <w:spacing w:before="0" w:after="0" w:line="240" w:lineRule="auto"/>
+            </w:pPr>
+            <w:r>
+              <w:rPr>
+                <w:sz w:val="20"/>
+                <w:szCs w:val="20"/>
+              </w:rPr>
+              <w:t>1.57</w:t>
+            </w:r>
+          </w:p>
+        </w:tc>
+        <w:tc>
+          <w:tcPr>
+            <w:tcW w:w="1872" w:type="dxa"/>
+            <w:vAlign w:val="center"/>
+          </w:tcPr>
+          <w:p>
+            <w:pPr>
+              <w:pStyle w:val="TableText"/>
+              <w:spacing w:before="0" w:after="0" w:line="240" w:lineRule="auto"/>
+            </w:pPr>
+            <w:r>
+              <w:rPr>
+                <w:sz w:val="20"/>
+                <w:szCs w:val="20"/>
+              </w:rPr>
+              <w:t>29</w:t>
+            </w:r>
+          </w:p>
+        </w:tc>
+        <w:tc>
+          <w:tcPr>
+            <w:tcW w:w="1872" w:type="dxa"/>
+            <w:vAlign w:val="center"/>
+          </w:tcPr>
+          <w:p>
+            <w:pPr>
+              <w:pStyle w:val="TableText"/>
+              <w:spacing w:before="0" w:after="0" w:line="240" w:lineRule="auto"/>
+            </w:pPr>
+            <w:r>
+              <w:rPr>
+                <w:sz w:val="20"/>
+                <w:szCs w:val="20"/>
+              </w:rPr>
+              <w:t>2.81</w:t>
+            </w:r>
+          </w:p>
+        </w:tc>
+      </w:tr>
+      <w:tr>
+        <w:tc>
+          <w:tcPr>
+            <w:tcW w:w="1872" w:type="dxa"/>
+            <w:vAlign w:val="center"/>
+          </w:tcPr>
+          <w:p>
+            <w:pPr>
+              <w:pStyle w:val="TableText"/>
+              <w:spacing w:before="0" w:after="0" w:line="240" w:lineRule="auto"/>
+            </w:pPr>
+            <w:r>
+              <w:rPr>
+                <w:sz w:val="20"/>
+                <w:szCs w:val="20"/>
+              </w:rPr>
+              <w:t>Antifungal</w:t>
+            </w:r>
+          </w:p>
+        </w:tc>
+        <w:tc>
+          <w:tcPr>
+            <w:tcW w:w="1872" w:type="dxa"/>
+            <w:vAlign w:val="center"/>
+          </w:tcPr>
+          <w:p>
+            <w:pPr>
+              <w:pStyle w:val="TableText"/>
+              <w:spacing w:before="0" w:after="0" w:line="240" w:lineRule="auto"/>
+            </w:pPr>
+            <w:r>
+              <w:rPr>
+                <w:sz w:val="20"/>
+                <w:szCs w:val="20"/>
+              </w:rPr>
+              <w:t>73</w:t>
+            </w:r>
+          </w:p>
+        </w:tc>
+        <w:tc>
+          <w:tcPr>
+            <w:tcW w:w="1872" w:type="dxa"/>
+            <w:vAlign w:val="center"/>
+          </w:tcPr>
+          <w:p>
+            <w:pPr>
+              <w:pStyle w:val="TableText"/>
+              <w:spacing w:before="0" w:after="0" w:line="240" w:lineRule="auto"/>
+            </w:pPr>
+            <w:r>
+              <w:rPr>
+                <w:sz w:val="20"/>
+                <w:szCs w:val="20"/>
+              </w:rPr>
+              <w:t>7.66</w:t>
+            </w:r>
+          </w:p>
+        </w:tc>
+        <w:tc>
+          <w:tcPr>
+            <w:tcW w:w="1872" w:type="dxa"/>
+            <w:vAlign w:val="center"/>
+          </w:tcPr>
+          <w:p>
+            <w:pPr>
+              <w:pStyle w:val="TableText"/>
+              <w:spacing w:before="0" w:after="0" w:line="240" w:lineRule="auto"/>
+            </w:pPr>
+            <w:r>
+              <w:rPr>
+                <w:sz w:val="20"/>
+                <w:szCs w:val="20"/>
+              </w:rPr>
+              <w:t>96</w:t>
+            </w:r>
+          </w:p>
+        </w:tc>
+        <w:tc>
+          <w:tcPr>
+            <w:tcW w:w="1872" w:type="dxa"/>
+            <w:vAlign w:val="center"/>
+          </w:tcPr>
+          <w:p>
+            <w:pPr>
+              <w:pStyle w:val="TableText"/>
+              <w:spacing w:before="0" w:after="0" w:line="240" w:lineRule="auto"/>
+            </w:pPr>
+            <w:r>
+              <w:rPr>
+                <w:sz w:val="20"/>
+                <w:szCs w:val="20"/>
+              </w:rPr>
+              <w:t>9.30</w:t>
+            </w:r>
+          </w:p>
+        </w:tc>
+      </w:tr>
+      <w:tr>
+        <w:tc>
+          <w:tcPr>
+            <w:tcW w:w="1872" w:type="dxa"/>
+            <w:vAlign w:val="center"/>
+          </w:tcPr>
+          <w:p>
+            <w:pPr>
+              <w:pStyle w:val="TableText"/>
+              <w:spacing w:before="0" w:after="0" w:line="240" w:lineRule="auto"/>
+            </w:pPr>
+            <w:r>
+              <w:rPr>
+                <w:sz w:val="20"/>
+                <w:szCs w:val="20"/>
+              </w:rPr>
+              <w:t>Toxicity</w:t>
+            </w:r>
+          </w:p>
+        </w:tc>
+        <w:tc>
+          <w:tcPr>
+            <w:tcW w:w="1872" w:type="dxa"/>
+            <w:vAlign w:val="center"/>
+          </w:tcPr>
+          <w:p>
+            <w:pPr>
+              <w:pStyle w:val="TableText"/>
+              <w:spacing w:before="0" w:after="0" w:line="240" w:lineRule="auto"/>
+            </w:pPr>
+            <w:r>
+              <w:rPr>
+                <w:sz w:val="20"/>
+                <w:szCs w:val="20"/>
+              </w:rPr>
+              <w:t>13</w:t>
+            </w:r>
+          </w:p>
+        </w:tc>
+        <w:tc>
+          <w:tcPr>
+            <w:tcW w:w="1872" w:type="dxa"/>
+            <w:vAlign w:val="center"/>
+          </w:tcPr>
+          <w:p>
+            <w:pPr>
+              <w:pStyle w:val="TableText"/>
+              <w:spacing w:before="0" w:after="0" w:line="240" w:lineRule="auto"/>
+            </w:pPr>
+            <w:r>
+              <w:rPr>
+                <w:sz w:val="20"/>
+                <w:szCs w:val="20"/>
+              </w:rPr>
+              <w:t>1.36</w:t>
+            </w:r>
+          </w:p>
+        </w:tc>
+        <w:tc>
+          <w:tcPr>
+            <w:tcW w:w="1872" w:type="dxa"/>
+            <w:vAlign w:val="center"/>
+          </w:tcPr>
+          <w:p>
+            <w:pPr>
+              <w:pStyle w:val="TableText"/>
+              <w:spacing w:before="0" w:after="0" w:line="240" w:lineRule="auto"/>
+            </w:pPr>
+            <w:r>
+              <w:rPr>
+                <w:sz w:val="20"/>
+                <w:szCs w:val="20"/>
+              </w:rPr>
+              <w:t>18</w:t>
+            </w:r>
+          </w:p>
+        </w:tc>
+        <w:tc>
+          <w:tcPr>
+            <w:tcW w:w="1872" w:type="dxa"/>
+            <w:vAlign w:val="center"/>
+          </w:tcPr>
+          <w:p>
+            <w:pPr>
+              <w:pStyle w:val="TableText"/>
+              <w:spacing w:before="0" w:after="0" w:line="240" w:lineRule="auto"/>
+            </w:pPr>
+            <w:r>
+              <w:rPr>
+                <w:sz w:val="20"/>
+                <w:szCs w:val="20"/>
+              </w:rPr>
+              <w:t>1.74</w:t>
+            </w:r>
+          </w:p>
+        </w:tc>
+      </w:tr>
+      <w:tr>
+        <w:tc>
+          <w:tcPr>
+            <w:tcW w:w="1872" w:type="dxa"/>
+            <w:vAlign w:val="center"/>
+          </w:tcPr>
+          <w:p>
+            <w:pPr>
+              <w:pStyle w:val="TableText"/>
+              <w:spacing w:before="0" w:after="0" w:line="240" w:lineRule="auto"/>
+            </w:pPr>
+            <w:r>
+              <w:rPr>
+                <w:sz w:val="20"/>
+                <w:szCs w:val="20"/>
+              </w:rPr>
+              <w:t>Umami</w:t>
+            </w:r>
+          </w:p>
+        </w:tc>
+        <w:tc>
+          <w:tcPr>
+            <w:tcW w:w="1872" w:type="dxa"/>
+            <w:vAlign w:val="center"/>
+          </w:tcPr>
+          <w:p>
+            <w:pPr>
+              <w:pStyle w:val="TableText"/>
+              <w:spacing w:before="0" w:after="0" w:line="240" w:lineRule="auto"/>
+            </w:pPr>
+            <w:r>
+              <w:rPr>
+                <w:sz w:val="20"/>
+                <w:szCs w:val="20"/>
+              </w:rPr>
+              <w:t>17</w:t>
+            </w:r>
+          </w:p>
+        </w:tc>
+        <w:tc>
+          <w:tcPr>
+            <w:tcW w:w="1872" w:type="dxa"/>
+            <w:vAlign w:val="center"/>
+          </w:tcPr>
+          <w:p>
+            <w:pPr>
+              <w:pStyle w:val="TableText"/>
+              <w:spacing w:before="0" w:after="0" w:line="240" w:lineRule="auto"/>
+            </w:pPr>
+            <w:r>
+              <w:rPr>
+                <w:sz w:val="20"/>
+                <w:szCs w:val="20"/>
+              </w:rPr>
+              <w:t>1.78</w:t>
+            </w:r>
+          </w:p>
+        </w:tc>
+        <w:tc>
+          <w:tcPr>
+            <w:tcW w:w="1872" w:type="dxa"/>
+            <w:vAlign w:val="center"/>
+          </w:tcPr>
+          <w:p>
+            <w:pPr>
+              <w:pStyle w:val="TableText"/>
+              <w:spacing w:before="0" w:after="0" w:line="240" w:lineRule="auto"/>
+            </w:pPr>
+            <w:r>
+              <w:rPr>
+                <w:sz w:val="20"/>
+                <w:szCs w:val="20"/>
+              </w:rPr>
+              <w:t>15</w:t>
+            </w:r>
+          </w:p>
+        </w:tc>
+        <w:tc>
+          <w:tcPr>
+            <w:tcW w:w="1872" w:type="dxa"/>
+            <w:vAlign w:val="center"/>
+          </w:tcPr>
+          <w:p>
+            <w:pPr>
+              <w:pStyle w:val="TableText"/>
+              <w:spacing w:before="0" w:after="0" w:line="240" w:lineRule="auto"/>
+            </w:pPr>
+            <w:r>
+              <w:rPr>
+                <w:sz w:val="20"/>
+                <w:szCs w:val="20"/>
+              </w:rPr>
+              <w:t>1.45</w:t>
+            </w:r>
+          </w:p>
+        </w:tc>
+      </w:tr>
+      <w:tr>
+        <w:tc>
+          <w:tcPr>
+            <w:tcW w:w="1872" w:type="dxa"/>
+            <w:vAlign w:val="center"/>
+          </w:tcPr>
+          <w:p>
+            <w:pPr>
+              <w:pStyle w:val="TableText"/>
+              <w:spacing w:before="0" w:after="0" w:line="240" w:lineRule="auto"/>
+            </w:pPr>
+            <w:r>
+              <w:rPr>
+                <w:sz w:val="20"/>
+                <w:szCs w:val="20"/>
+              </w:rPr>
+              <w:t>Antimalarial_alt</w:t>
+            </w:r>
+          </w:p>
+        </w:tc>
+        <w:tc>
+          <w:tcPr>
+            <w:tcW w:w="1872" w:type="dxa"/>
+            <w:vAlign w:val="center"/>
+          </w:tcPr>
+          <w:p>
+            <w:pPr>
+              <w:pStyle w:val="TableText"/>
+              <w:spacing w:before="0" w:after="0" w:line="240" w:lineRule="auto"/>
+            </w:pPr>
+            <w:r>
+              <w:rPr>
+                <w:sz w:val="20"/>
+                <w:szCs w:val="20"/>
+              </w:rPr>
+              <w:t>12</w:t>
+            </w:r>
+          </w:p>
+        </w:tc>
+        <w:tc>
+          <w:tcPr>
+            <w:tcW w:w="1872" w:type="dxa"/>
+            <w:vAlign w:val="center"/>
+          </w:tcPr>
+          <w:p>
+            <w:pPr>
+              <w:pStyle w:val="TableText"/>
+              <w:spacing w:before="0" w:after="0" w:line="240" w:lineRule="auto"/>
+            </w:pPr>
+            <w:r>
+              <w:rPr>
+                <w:sz w:val="20"/>
+                <w:szCs w:val="20"/>
+              </w:rPr>
+              <w:t>1.26</w:t>
+            </w:r>
+          </w:p>
+        </w:tc>
+        <w:tc>
+          <w:tcPr>
+            <w:tcW w:w="1872" w:type="dxa"/>
+            <w:vAlign w:val="center"/>
+          </w:tcPr>
+          <w:p>
+            <w:pPr>
+              <w:pStyle w:val="TableText"/>
+              <w:spacing w:before="0" w:after="0" w:line="240" w:lineRule="auto"/>
+            </w:pPr>
+            <w:r>
+              <w:rPr>
+                <w:sz w:val="20"/>
+                <w:szCs w:val="20"/>
+              </w:rPr>
+              <w:t>14</w:t>
+            </w:r>
+          </w:p>
+        </w:tc>
+        <w:tc>
+          <w:tcPr>
+            <w:tcW w:w="1872" w:type="dxa"/>
+            <w:vAlign w:val="center"/>
+          </w:tcPr>
+          <w:p>
+            <w:pPr>
+              <w:pStyle w:val="TableText"/>
+              <w:spacing w:before="0" w:after="0" w:line="240" w:lineRule="auto"/>
+            </w:pPr>
+            <w:r>
+              <w:rPr>
+                <w:sz w:val="20"/>
+                <w:szCs w:val="20"/>
+              </w:rPr>
+              <w:t>1.36</w:t>
+            </w:r>
+          </w:p>
+        </w:tc>
+      </w:tr>
+      <w:tr>
+        <w:tc>
+          <w:tcPr>
+            <w:tcW w:w="1872" w:type="dxa"/>
+            <w:vAlign w:val="center"/>
+          </w:tcPr>
+          <w:p>
+            <w:pPr>
+              <w:pStyle w:val="TableText"/>
+              <w:spacing w:before="0" w:after="0" w:line="240" w:lineRule="auto"/>
+            </w:pPr>
+            <w:r>
+              <w:rPr>
+                <w:sz w:val="20"/>
+                <w:szCs w:val="20"/>
+              </w:rPr>
+              <w:t>TTCA</w:t>
+            </w:r>
+          </w:p>
+        </w:tc>
+        <w:tc>
+          <w:tcPr>
+            <w:tcW w:w="1872" w:type="dxa"/>
+            <w:vAlign w:val="center"/>
+          </w:tcPr>
+          <w:p>
+            <w:pPr>
+              <w:pStyle w:val="TableText"/>
+              <w:spacing w:before="0" w:after="0" w:line="240" w:lineRule="auto"/>
+            </w:pPr>
+            <w:r>
+              <w:rPr>
+                <w:sz w:val="20"/>
+                <w:szCs w:val="20"/>
+              </w:rPr>
+              <w:t>1</w:t>
+            </w:r>
+          </w:p>
+        </w:tc>
+        <w:tc>
+          <w:tcPr>
+            <w:tcW w:w="1872" w:type="dxa"/>
+            <w:vAlign w:val="center"/>
+          </w:tcPr>
+          <w:p>
+            <w:pPr>
+              <w:pStyle w:val="TableText"/>
+              <w:spacing w:before="0" w:after="0" w:line="240" w:lineRule="auto"/>
+            </w:pPr>
+            <w:r>
+              <w:rPr>
+                <w:sz w:val="20"/>
+                <w:szCs w:val="20"/>
+              </w:rPr>
+              <w:t>0.10</w:t>
+            </w:r>
+          </w:p>
+        </w:tc>
+        <w:tc>
+          <w:tcPr>
+            <w:tcW w:w="1872" w:type="dxa"/>
+            <w:vAlign w:val="center"/>
+          </w:tcPr>
+          <w:p>
+            <w:pPr>
+              <w:pStyle w:val="TableText"/>
+              <w:spacing w:before="0" w:after="0" w:line="240" w:lineRule="auto"/>
+            </w:pPr>
+            <w:r>
+              <w:rPr>
+                <w:sz w:val="20"/>
+                <w:szCs w:val="20"/>
+              </w:rPr>
+              <w:t>1</w:t>
+            </w:r>
+          </w:p>
+        </w:tc>
+        <w:tc>
+          <w:tcPr>
+            <w:tcW w:w="1872" w:type="dxa"/>
+            <w:vAlign w:val="center"/>
+          </w:tcPr>
+          <w:p>
+            <w:pPr>
+              <w:pStyle w:val="TableText"/>
+              <w:spacing w:before="0" w:after="0" w:line="240" w:lineRule="auto"/>
+            </w:pPr>
+            <w:r>
+              <w:rPr>
+                <w:sz w:val="20"/>
+                <w:szCs w:val="20"/>
+              </w:rPr>
+              <w:t>0.10</w:t>
+            </w:r>
+          </w:p>
+        </w:tc>
+      </w:tr>
+      <w:tr>
+        <w:tc>
+          <w:tcPr>
+            <w:tcW w:w="1872" w:type="dxa"/>
+            <w:vAlign w:val="center"/>
+          </w:tcPr>
+          <w:p>
+            <w:pPr>
+              <w:pStyle w:val="TableText"/>
+              <w:spacing w:before="0" w:after="0" w:line="240" w:lineRule="auto"/>
+            </w:pPr>
+            <w:r>
+              <w:rPr>
+                <w:sz w:val="20"/>
+                <w:szCs w:val="20"/>
+              </w:rPr>
+              <w:t>Antioxidant_FRS</w:t>
+            </w:r>
+          </w:p>
+        </w:tc>
+        <w:tc>
+          <w:tcPr>
+            <w:tcW w:w="1872" w:type="dxa"/>
+            <w:vAlign w:val="center"/>
+          </w:tcPr>
+          <w:p>
+            <w:pPr>
+              <w:pStyle w:val="TableText"/>
+              <w:spacing w:before="0" w:after="0" w:line="240" w:lineRule="auto"/>
+            </w:pPr>
+            <w:r>
+              <w:rPr>
+                <w:sz w:val="20"/>
+                <w:szCs w:val="20"/>
+              </w:rPr>
+              <w:t>43</w:t>
+            </w:r>
+          </w:p>
+        </w:tc>
+        <w:tc>
+          <w:tcPr>
+            <w:tcW w:w="1872" w:type="dxa"/>
+            <w:vAlign w:val="center"/>
+          </w:tcPr>
+          <w:p>
+            <w:pPr>
+              <w:pStyle w:val="TableText"/>
+              <w:spacing w:before="0" w:after="0" w:line="240" w:lineRule="auto"/>
+            </w:pPr>
+            <w:r>
+              <w:rPr>
+                <w:sz w:val="20"/>
+                <w:szCs w:val="20"/>
+              </w:rPr>
+              <w:t>4.51</w:t>
+            </w:r>
+          </w:p>
+        </w:tc>
+        <w:tc>
+          <w:tcPr>
+            <w:tcW w:w="1872" w:type="dxa"/>
+            <w:vAlign w:val="center"/>
+          </w:tcPr>
+          <w:p>
+            <w:pPr>
+              <w:pStyle w:val="TableText"/>
+              <w:spacing w:before="0" w:after="0" w:line="240" w:lineRule="auto"/>
+            </w:pPr>
+            <w:r>
+              <w:rPr>
+                <w:sz w:val="20"/>
+                <w:szCs w:val="20"/>
+              </w:rPr>
+              <w:t>41</w:t>
+            </w:r>
+          </w:p>
+        </w:tc>
+        <w:tc>
+          <w:tcPr>
+            <w:tcW w:w="1872" w:type="dxa"/>
+            <w:vAlign w:val="center"/>
+          </w:tcPr>
+          <w:p>
+            <w:pPr>
+              <w:pStyle w:val="TableText"/>
+              <w:spacing w:before="0" w:after="0" w:line="240" w:lineRule="auto"/>
+            </w:pPr>
+            <w:r>
+              <w:rPr>
+                <w:sz w:val="20"/>
+                <w:szCs w:val="20"/>
+              </w:rPr>
+              <w:t>3.97</w:t>
+            </w:r>
+          </w:p>
+        </w:tc>
+      </w:tr>
+      <w:tr>
+        <w:tc>
+          <w:tcPr>
+            <w:tcW w:w="1872" w:type="dxa"/>
+            <w:vAlign w:val="center"/>
+          </w:tcPr>
+          <w:p>
+            <w:pPr>
+              <w:pStyle w:val="TableText"/>
+              <w:spacing w:before="0" w:after="0" w:line="240" w:lineRule="auto"/>
+            </w:pPr>
+            <w:r>
+              <w:rPr>
+                <w:sz w:val="20"/>
+                <w:szCs w:val="20"/>
+              </w:rPr>
+              <w:t>DPPIV</w:t>
+            </w:r>
+          </w:p>
+        </w:tc>
+        <w:tc>
+          <w:tcPr>
+            <w:tcW w:w="1872" w:type="dxa"/>
+            <w:vAlign w:val="center"/>
+          </w:tcPr>
+          <w:p>
+            <w:pPr>
+              <w:pStyle w:val="TableText"/>
+              <w:spacing w:before="0" w:after="0" w:line="240" w:lineRule="auto"/>
+            </w:pPr>
+            <w:r>
+              <w:rPr>
+                <w:sz w:val="20"/>
+                <w:szCs w:val="20"/>
+              </w:rPr>
+              <w:t>0</w:t>
+            </w:r>
+          </w:p>
+        </w:tc>
+        <w:tc>
+          <w:tcPr>
+            <w:tcW w:w="1872" w:type="dxa"/>
+            <w:vAlign w:val="center"/>
+          </w:tcPr>
+          <w:p>
+            <w:pPr>
+              <w:pStyle w:val="TableText"/>
+              <w:spacing w:before="0" w:after="0" w:line="240" w:lineRule="auto"/>
+            </w:pPr>
+            <w:r>
+              <w:rPr>
+                <w:sz w:val="20"/>
+                <w:szCs w:val="20"/>
+              </w:rPr>
+              <w:t>0.00</w:t>
+            </w:r>
+          </w:p>
+        </w:tc>
+        <w:tc>
+          <w:tcPr>
+            <w:tcW w:w="1872" w:type="dxa"/>
+            <w:vAlign w:val="center"/>
+          </w:tcPr>
+          <w:p>
+            <w:pPr>
+              <w:pStyle w:val="TableText"/>
+              <w:spacing w:before="0" w:after="0" w:line="240" w:lineRule="auto"/>
+            </w:pPr>
+            <w:r>
+              <w:rPr>
+                <w:sz w:val="20"/>
+                <w:szCs w:val="20"/>
+              </w:rPr>
+              <w:t>0</w:t>
+            </w:r>
+          </w:p>
+        </w:tc>
+        <w:tc>
+          <w:tcPr>
+            <w:tcW w:w="1872" w:type="dxa"/>
+            <w:vAlign w:val="center"/>
+          </w:tcPr>
+          <w:p>
+            <w:pPr>
+              <w:pStyle w:val="TableText"/>
+              <w:spacing w:before="0" w:after="0" w:line="240" w:lineRule="auto"/>
+            </w:pPr>
+            <w:r>
+              <w:rPr>
+                <w:sz w:val="20"/>
+                <w:szCs w:val="20"/>
+              </w:rPr>
+              <w:t>0.00</w:t>
+            </w:r>
+          </w:p>
+        </w:tc>
+      </w:tr>
+      <w:tr>
+        <w:tc>
+          <w:tcPr>
+            <w:tcW w:w="1872" w:type="dxa"/>
+            <w:vAlign w:val="center"/>
+          </w:tcPr>
+          <w:p>
+            <w:pPr>
+              <w:pStyle w:val="TableText"/>
+              <w:spacing w:before="0" w:after="0" w:line="240" w:lineRule="auto"/>
+            </w:pPr>
+            <w:r>
+              <w:rPr>
+                <w:sz w:val="20"/>
+                <w:szCs w:val="20"/>
+              </w:rPr>
+              <w:t>Antimalarial_main</w:t>
+            </w:r>
+          </w:p>
+        </w:tc>
+        <w:tc>
+          <w:tcPr>
+            <w:tcW w:w="1872" w:type="dxa"/>
+            <w:vAlign w:val="center"/>
+          </w:tcPr>
+          <w:p>
+            <w:pPr>
+              <w:pStyle w:val="TableText"/>
+              <w:spacing w:before="0" w:after="0" w:line="240" w:lineRule="auto"/>
+            </w:pPr>
+            <w:r>
+              <w:rPr>
+                <w:sz w:val="20"/>
+                <w:szCs w:val="20"/>
+              </w:rPr>
+              <w:t>0</w:t>
+            </w:r>
+          </w:p>
+        </w:tc>
+        <w:tc>
+          <w:tcPr>
+            <w:tcW w:w="1872" w:type="dxa"/>
+            <w:vAlign w:val="center"/>
+          </w:tcPr>
+          <w:p>
+            <w:pPr>
+              <w:pStyle w:val="TableText"/>
+              <w:spacing w:before="0" w:after="0" w:line="240" w:lineRule="auto"/>
+            </w:pPr>
+            <w:r>
+              <w:rPr>
+                <w:sz w:val="20"/>
+                <w:szCs w:val="20"/>
+              </w:rPr>
+              <w:t>0.00</w:t>
+            </w:r>
+          </w:p>
+        </w:tc>
+        <w:tc>
+          <w:tcPr>
+            <w:tcW w:w="1872" w:type="dxa"/>
+            <w:vAlign w:val="center"/>
+          </w:tcPr>
+          <w:p>
+            <w:pPr>
+              <w:pStyle w:val="TableText"/>
+              <w:spacing w:before="0" w:after="0" w:line="240" w:lineRule="auto"/>
+            </w:pPr>
+            <w:r>
+              <w:rPr>
+                <w:sz w:val="20"/>
+                <w:szCs w:val="20"/>
+              </w:rPr>
+              <w:t>0</w:t>
+            </w:r>
+          </w:p>
+        </w:tc>
+        <w:tc>
+          <w:tcPr>
+            <w:tcW w:w="1872" w:type="dxa"/>
+            <w:vAlign w:val="center"/>
+          </w:tcPr>
+          <w:p>
+            <w:pPr>
+              <w:pStyle w:val="TableText"/>
+              <w:spacing w:before="0" w:after="0" w:line="240" w:lineRule="auto"/>
+            </w:pPr>
+            <w:r>
+              <w:rPr>
+                <w:sz w:val="20"/>
+                <w:szCs w:val="20"/>
+              </w:rPr>
+              <w:t>0.00</w:t>
+            </w:r>
+          </w:p>
+        </w:tc>
+      </w:tr>
+      <w:tr>
+        <w:tc>
+          <w:tcPr>
+            <w:tcW w:w="1872" w:type="dxa"/>
+            <w:vAlign w:val="center"/>
+          </w:tcPr>
+          <w:p>
+            <w:pPr>
+              <w:pStyle w:val="TableText"/>
+              <w:spacing w:before="0" w:after="0" w:line="240" w:lineRule="auto"/>
+            </w:pPr>
+            <w:r>
+              <w:rPr>
+                <w:sz w:val="20"/>
+                <w:szCs w:val="20"/>
+              </w:rPr>
+              <w:t>Anti-parasitic</w:t>
+            </w:r>
+          </w:p>
+        </w:tc>
+        <w:tc>
+          <w:tcPr>
+            <w:tcW w:w="1872" w:type="dxa"/>
+            <w:vAlign w:val="center"/>
+          </w:tcPr>
+          <w:p>
+            <w:pPr>
+              <w:pStyle w:val="TableText"/>
+              <w:spacing w:before="0" w:after="0" w:line="240" w:lineRule="auto"/>
+            </w:pPr>
+            <w:r>
+              <w:rPr>
+                <w:sz w:val="20"/>
+                <w:szCs w:val="20"/>
+              </w:rPr>
+              <w:t>288</w:t>
+            </w:r>
+          </w:p>
+        </w:tc>
+        <w:tc>
+          <w:tcPr>
+            <w:tcW w:w="1872" w:type="dxa"/>
+            <w:vAlign w:val="center"/>
+          </w:tcPr>
+          <w:p>
+            <w:pPr>
+              <w:pStyle w:val="TableText"/>
+              <w:spacing w:before="0" w:after="0" w:line="240" w:lineRule="auto"/>
+            </w:pPr>
+            <w:r>
+              <w:rPr>
+                <w:sz w:val="20"/>
+                <w:szCs w:val="20"/>
+              </w:rPr>
+              <w:t>30.22</w:t>
+            </w:r>
+          </w:p>
+        </w:tc>
+        <w:tc>
+          <w:tcPr>
+            <w:tcW w:w="1872" w:type="dxa"/>
+            <w:vAlign w:val="center"/>
+          </w:tcPr>
+          <w:p>
+            <w:pPr>
+              <w:pStyle w:val="TableText"/>
+              <w:spacing w:before="0" w:after="0" w:line="240" w:lineRule="auto"/>
+            </w:pPr>
+            <w:r>
+              <w:rPr>
+                <w:sz w:val="20"/>
+                <w:szCs w:val="20"/>
+              </w:rPr>
+              <w:t>280</w:t>
+            </w:r>
+          </w:p>
+        </w:tc>
+        <w:tc>
+          <w:tcPr>
+            <w:tcW w:w="1872" w:type="dxa"/>
+            <w:vAlign w:val="center"/>
+          </w:tcPr>
+          <w:p>
+            <w:pPr>
+              <w:pStyle w:val="TableText"/>
+              <w:spacing w:before="0" w:after="0" w:line="240" w:lineRule="auto"/>
+            </w:pPr>
+            <w:r>
+              <w:rPr>
+                <w:sz w:val="20"/>
+                <w:szCs w:val="20"/>
+              </w:rPr>
+              <w:t>27.13</w:t>
+            </w:r>
+          </w:p>
+        </w:tc>
+      </w:tr>
+      <w:tr>
+        <w:tc>
+          <w:tcPr>
+            <w:tcW w:w="1872" w:type="dxa"/>
+            <w:vAlign w:val="center"/>
+          </w:tcPr>
+          <w:p>
+            <w:pPr>
+              <w:pStyle w:val="TableText"/>
+              <w:spacing w:before="0" w:after="0" w:line="240" w:lineRule="auto"/>
+            </w:pPr>
+            <w:r>
+              <w:rPr>
+                <w:sz w:val="20"/>
+                <w:szCs w:val="20"/>
+              </w:rPr>
+              <w:t>NeuroPred</w:t>
+            </w:r>
+          </w:p>
+        </w:tc>
+        <w:tc>
+          <w:tcPr>
+            <w:tcW w:w="1872" w:type="dxa"/>
+            <w:vAlign w:val="center"/>
+          </w:tcPr>
+          <w:p>
+            <w:pPr>
+              <w:pStyle w:val="TableText"/>
+              <w:spacing w:before="0" w:after="0" w:line="240" w:lineRule="auto"/>
+            </w:pPr>
+            <w:r>
+              <w:rPr>
+                <w:sz w:val="20"/>
+                <w:szCs w:val="20"/>
+              </w:rPr>
+              <w:t>82</w:t>
+            </w:r>
+          </w:p>
+        </w:tc>
+        <w:tc>
+          <w:tcPr>
+            <w:tcW w:w="1872" w:type="dxa"/>
+            <w:vAlign w:val="center"/>
+          </w:tcPr>
+          <w:p>
+            <w:pPr>
+              <w:pStyle w:val="TableText"/>
+              <w:spacing w:before="0" w:after="0" w:line="240" w:lineRule="auto"/>
+            </w:pPr>
+            <w:r>
+              <w:rPr>
+                <w:sz w:val="20"/>
+                <w:szCs w:val="20"/>
+              </w:rPr>
+              <w:t>8.60</w:t>
+            </w:r>
+          </w:p>
+        </w:tc>
+        <w:tc>
+          <w:tcPr>
+            <w:tcW w:w="1872" w:type="dxa"/>
+            <w:vAlign w:val="center"/>
+          </w:tcPr>
+          <w:p>
+            <w:pPr>
+              <w:pStyle w:val="TableText"/>
+              <w:spacing w:before="0" w:after="0" w:line="240" w:lineRule="auto"/>
+            </w:pPr>
+            <w:r>
+              <w:rPr>
+                <w:sz w:val="20"/>
+                <w:szCs w:val="20"/>
+              </w:rPr>
+              <w:t>77</w:t>
+            </w:r>
+          </w:p>
+        </w:tc>
+        <w:tc>
+          <w:tcPr>
+            <w:tcW w:w="1872" w:type="dxa"/>
+            <w:vAlign w:val="center"/>
+          </w:tcPr>
+          <w:p>
+            <w:pPr>
+              <w:pStyle w:val="TableText"/>
+              <w:spacing w:before="0" w:after="0" w:line="240" w:lineRule="auto"/>
+            </w:pPr>
+            <w:r>
+              <w:rPr>
+                <w:sz w:val="20"/>
+                <w:szCs w:val="20"/>
+              </w:rPr>
+              <w:t>7.46</w:t>
+            </w:r>
+          </w:p>
+        </w:tc>
+      </w:tr>
+      <w:tr>
+        <w:tc>
+          <w:tcPr>
+            <w:tcW w:w="1872" w:type="dxa"/>
+            <w:vAlign w:val="center"/>
+          </w:tcPr>
+          <w:p>
+            <w:pPr>
+              <w:pStyle w:val="TableText"/>
+              <w:spacing w:before="0" w:after="0" w:line="240" w:lineRule="auto"/>
+            </w:pPr>
+            <w:r>
+              <w:rPr>
+                <w:sz w:val="20"/>
+                <w:szCs w:val="20"/>
+              </w:rPr>
+              <w:t>ACP_Anticancer_main</w:t>
+            </w:r>
+          </w:p>
+        </w:tc>
+        <w:tc>
+          <w:tcPr>
+            <w:tcW w:w="1872" w:type="dxa"/>
+            <w:vAlign w:val="center"/>
+          </w:tcPr>
+          <w:p>
+            <w:pPr>
+              <w:pStyle w:val="TableText"/>
+              <w:spacing w:before="0" w:after="0" w:line="240" w:lineRule="auto"/>
+            </w:pPr>
+            <w:r>
+              <w:rPr>
+                <w:sz w:val="20"/>
+                <w:szCs w:val="20"/>
+              </w:rPr>
+              <w:t>37</w:t>
+            </w:r>
+          </w:p>
+        </w:tc>
+        <w:tc>
+          <w:tcPr>
+            <w:tcW w:w="1872" w:type="dxa"/>
+            <w:vAlign w:val="center"/>
+          </w:tcPr>
+          <w:p>
+            <w:pPr>
+              <w:pStyle w:val="TableText"/>
+              <w:spacing w:before="0" w:after="0" w:line="240" w:lineRule="auto"/>
+            </w:pPr>
+            <w:r>
+              <w:rPr>
+                <w:sz w:val="20"/>
+                <w:szCs w:val="20"/>
+              </w:rPr>
+              <w:t>3.88</w:t>
+            </w:r>
+          </w:p>
+        </w:tc>
+        <w:tc>
+          <w:tcPr>
+            <w:tcW w:w="1872" w:type="dxa"/>
+            <w:vAlign w:val="center"/>
+          </w:tcPr>
+          <w:p>
+            <w:pPr>
+              <w:pStyle w:val="TableText"/>
+              <w:spacing w:before="0" w:after="0" w:line="240" w:lineRule="auto"/>
+            </w:pPr>
+            <w:r>
+              <w:rPr>
+                <w:sz w:val="20"/>
+                <w:szCs w:val="20"/>
+              </w:rPr>
+              <w:t>31</w:t>
+            </w:r>
+          </w:p>
+        </w:tc>
+        <w:tc>
+          <w:tcPr>
+            <w:tcW w:w="1872" w:type="dxa"/>
+            <w:vAlign w:val="center"/>
+          </w:tcPr>
+          <w:p>
+            <w:pPr>
+              <w:pStyle w:val="TableText"/>
+              <w:spacing w:before="0" w:after="0" w:line="240" w:lineRule="auto"/>
+            </w:pPr>
+            <w:r>
+              <w:rPr>
+                <w:sz w:val="20"/>
+                <w:szCs w:val="20"/>
+              </w:rPr>
+              <w:t>3.00</w:t>
+            </w:r>
+          </w:p>
+        </w:tc>
+      </w:tr>
+      <w:tr>
+        <w:tc>
+          <w:tcPr>
+            <w:tcW w:w="1872" w:type="dxa"/>
+            <w:vAlign w:val="center"/>
+          </w:tcPr>
+          <w:p>
+            <w:pPr>
+              <w:pStyle w:val="TableText"/>
+              <w:spacing w:before="0" w:after="0" w:line="240" w:lineRule="auto"/>
+            </w:pPr>
+            <w:r>
+              <w:rPr>
+                <w:sz w:val="20"/>
+                <w:szCs w:val="20"/>
+              </w:rPr>
+              <w:t>ACE_inhibitory</w:t>
+            </w:r>
+          </w:p>
+        </w:tc>
+        <w:tc>
+          <w:tcPr>
+            <w:tcW w:w="1872" w:type="dxa"/>
+            <w:vAlign w:val="center"/>
+          </w:tcPr>
+          <w:p>
+            <w:pPr>
+              <w:pStyle w:val="TableText"/>
+              <w:spacing w:before="0" w:after="0" w:line="240" w:lineRule="auto"/>
+            </w:pPr>
+            <w:r>
+              <w:rPr>
+                <w:sz w:val="20"/>
+                <w:szCs w:val="20"/>
+              </w:rPr>
+              <w:t>20</w:t>
+            </w:r>
+          </w:p>
+        </w:tc>
+        <w:tc>
+          <w:tcPr>
+            <w:tcW w:w="1872" w:type="dxa"/>
+            <w:vAlign w:val="center"/>
+          </w:tcPr>
+          <w:p>
+            <w:pPr>
+              <w:pStyle w:val="TableText"/>
+              <w:spacing w:before="0" w:after="0" w:line="240" w:lineRule="auto"/>
+            </w:pPr>
+            <w:r>
+              <w:rPr>
+                <w:sz w:val="20"/>
+                <w:szCs w:val="20"/>
+              </w:rPr>
+              <w:t>2.10</w:t>
+            </w:r>
+          </w:p>
+        </w:tc>
+        <w:tc>
+          <w:tcPr>
+            <w:tcW w:w="1872" w:type="dxa"/>
+            <w:vAlign w:val="center"/>
+          </w:tcPr>
+          <w:p>
+            <w:pPr>
+              <w:pStyle w:val="TableText"/>
+              <w:spacing w:before="0" w:after="0" w:line="240" w:lineRule="auto"/>
+            </w:pPr>
+            <w:r>
+              <w:rPr>
+                <w:sz w:val="20"/>
+                <w:szCs w:val="20"/>
+              </w:rPr>
+              <w:t>14</w:t>
+            </w:r>
+          </w:p>
+        </w:tc>
+        <w:tc>
+          <w:tcPr>
+            <w:tcW w:w="1872" w:type="dxa"/>
+            <w:vAlign w:val="center"/>
+          </w:tcPr>
+          <w:p>
+            <w:pPr>
+              <w:pStyle w:val="TableText"/>
+              <w:spacing w:before="0" w:after="0" w:line="240" w:lineRule="auto"/>
+            </w:pPr>
+            <w:r>
+              <w:rPr>
+                <w:sz w:val="20"/>
+                <w:szCs w:val="20"/>
+              </w:rPr>
+              <w:t>1.36</w:t>
+            </w:r>
+          </w:p>
+        </w:tc>
+      </w:tr>
+      <w:tr>
+        <w:tc>
+          <w:tcPr>
+            <w:tcW w:w="1872" w:type="dxa"/>
+            <w:vAlign w:val="center"/>
+          </w:tcPr>
+          <w:p>
+            <w:pPr>
+              <w:pStyle w:val="TableText"/>
+              <w:spacing w:before="0" w:after="0" w:line="240" w:lineRule="auto"/>
+            </w:pPr>
+            <w:r>
+              <w:rPr>
+                <w:sz w:val="20"/>
+                <w:szCs w:val="20"/>
+              </w:rPr>
+              <w:t>Allergenicity</w:t>
+            </w:r>
+          </w:p>
+        </w:tc>
+        <w:tc>
+          <w:tcPr>
+            <w:tcW w:w="1872" w:type="dxa"/>
+            <w:vAlign w:val="center"/>
+          </w:tcPr>
+          <w:p>
+            <w:pPr>
+              <w:pStyle w:val="TableText"/>
+              <w:spacing w:before="0" w:after="0" w:line="240" w:lineRule="auto"/>
+            </w:pPr>
+            <w:r>
+              <w:rPr>
+                <w:sz w:val="20"/>
+                <w:szCs w:val="20"/>
+              </w:rPr>
+              <w:t>16</w:t>
+            </w:r>
+          </w:p>
+        </w:tc>
+        <w:tc>
+          <w:tcPr>
+            <w:tcW w:w="1872" w:type="dxa"/>
+            <w:vAlign w:val="center"/>
+          </w:tcPr>
+          <w:p>
+            <w:pPr>
+              <w:pStyle w:val="TableText"/>
+              <w:spacing w:before="0" w:after="0" w:line="240" w:lineRule="auto"/>
+            </w:pPr>
+            <w:r>
+              <w:rPr>
+                <w:sz w:val="20"/>
+                <w:szCs w:val="20"/>
+              </w:rPr>
+              <w:t>1.68</w:t>
+            </w:r>
+          </w:p>
+        </w:tc>
+        <w:tc>
+          <w:tcPr>
+            <w:tcW w:w="1872" w:type="dxa"/>
+            <w:vAlign w:val="center"/>
+          </w:tcPr>
+          <w:p>
+            <w:pPr>
+              <w:pStyle w:val="TableText"/>
+              <w:spacing w:before="0" w:after="0" w:line="240" w:lineRule="auto"/>
+            </w:pPr>
+            <w:r>
+              <w:rPr>
+                <w:sz w:val="20"/>
+                <w:szCs w:val="20"/>
+              </w:rPr>
+              <w:t>11</w:t>
+            </w:r>
+          </w:p>
+        </w:tc>
+        <w:tc>
+          <w:tcPr>
+            <w:tcW w:w="1872" w:type="dxa"/>
+            <w:vAlign w:val="center"/>
+          </w:tcPr>
+          <w:p>
+            <w:pPr>
+              <w:pStyle w:val="TableText"/>
+              <w:spacing w:before="0" w:after="0" w:line="240" w:lineRule="auto"/>
+            </w:pPr>
+            <w:r>
+              <w:rPr>
+                <w:sz w:val="20"/>
+                <w:szCs w:val="20"/>
+              </w:rPr>
+              <w:t>1.07</w:t>
+            </w:r>
+          </w:p>
+        </w:tc>
+      </w:tr>
+      <w:tr>
+        <w:tc>
+          <w:tcPr>
+            <w:tcW w:w="1872" w:type="dxa"/>
+            <w:vAlign w:val="center"/>
+          </w:tcPr>
+          <w:p>
+            <w:pPr>
+              <w:pStyle w:val="TableText"/>
+              <w:spacing w:before="0" w:after="0" w:line="240" w:lineRule="auto"/>
+            </w:pPr>
+            <w:r>
+              <w:rPr>
+                <w:sz w:val="20"/>
+                <w:szCs w:val="20"/>
+              </w:rPr>
+              <w:t>Antiviral</w:t>
+            </w:r>
+          </w:p>
+        </w:tc>
+        <w:tc>
+          <w:tcPr>
+            <w:tcW w:w="1872" w:type="dxa"/>
+            <w:vAlign w:val="center"/>
+          </w:tcPr>
+          <w:p>
+            <w:pPr>
+              <w:pStyle w:val="TableText"/>
+              <w:spacing w:before="0" w:after="0" w:line="240" w:lineRule="auto"/>
+            </w:pPr>
+            <w:r>
+              <w:rPr>
+                <w:sz w:val="20"/>
+                <w:szCs w:val="20"/>
+              </w:rPr>
+              <w:t>55</w:t>
+            </w:r>
+          </w:p>
+        </w:tc>
+        <w:tc>
+          <w:tcPr>
+            <w:tcW w:w="1872" w:type="dxa"/>
+            <w:vAlign w:val="center"/>
+          </w:tcPr>
+          <w:p>
+            <w:pPr>
+              <w:pStyle w:val="TableText"/>
+              <w:spacing w:before="0" w:after="0" w:line="240" w:lineRule="auto"/>
+            </w:pPr>
+            <w:r>
+              <w:rPr>
+                <w:sz w:val="20"/>
+                <w:szCs w:val="20"/>
+              </w:rPr>
+              <w:t>5.77</w:t>
+            </w:r>
+          </w:p>
+        </w:tc>
+        <w:tc>
+          <w:tcPr>
+            <w:tcW w:w="1872" w:type="dxa"/>
+            <w:vAlign w:val="center"/>
+          </w:tcPr>
+          <w:p>
+            <w:pPr>
+              <w:pStyle w:val="TableText"/>
+              <w:spacing w:before="0" w:after="0" w:line="240" w:lineRule="auto"/>
+            </w:pPr>
+            <w:r>
+              <w:rPr>
+                <w:sz w:val="20"/>
+                <w:szCs w:val="20"/>
+              </w:rPr>
+              <w:t>52</w:t>
+            </w:r>
+          </w:p>
+        </w:tc>
+        <w:tc>
+          <w:tcPr>
+            <w:tcW w:w="1872" w:type="dxa"/>
+            <w:vAlign w:val="center"/>
+          </w:tcPr>
+          <w:p>
+            <w:pPr>
+              <w:pStyle w:val="TableText"/>
+              <w:spacing w:before="0" w:after="0" w:line="240" w:lineRule="auto"/>
+            </w:pPr>
+            <w:r>
+              <w:rPr>
+                <w:sz w:val="20"/>
+                <w:szCs w:val="20"/>
+              </w:rPr>
+              <w:t>5.04</w:t>
+            </w:r>
+          </w:p>
+        </w:tc>
+      </w:tr>
+      <w:tr>
+        <w:tc>
+          <w:tcPr>
+            <w:tcW w:w="1872" w:type="dxa"/>
+            <w:vAlign w:val="center"/>
+          </w:tcPr>
+          <w:p>
+            <w:pPr>
+              <w:pStyle w:val="TableText"/>
+              <w:spacing w:before="0" w:after="0" w:line="240" w:lineRule="auto"/>
+            </w:pPr>
+            <w:r>
+              <w:rPr>
+                <w:sz w:val="20"/>
+                <w:szCs w:val="20"/>
+              </w:rPr>
+              <w:t>Bitter</w:t>
+            </w:r>
+          </w:p>
+        </w:tc>
+        <w:tc>
+          <w:tcPr>
+            <w:tcW w:w="1872" w:type="dxa"/>
+            <w:vAlign w:val="center"/>
+          </w:tcPr>
+          <w:p>
+            <w:pPr>
+              <w:pStyle w:val="TableText"/>
+              <w:spacing w:before="0" w:after="0" w:line="240" w:lineRule="auto"/>
+            </w:pPr>
+            <w:r>
+              <w:rPr>
+                <w:sz w:val="20"/>
+                <w:szCs w:val="20"/>
+              </w:rPr>
+              <w:t>635</w:t>
+            </w:r>
+          </w:p>
+        </w:tc>
+        <w:tc>
+          <w:tcPr>
+            <w:tcW w:w="1872" w:type="dxa"/>
+            <w:vAlign w:val="center"/>
+          </w:tcPr>
+          <w:p>
+            <w:pPr>
+              <w:pStyle w:val="TableText"/>
+              <w:spacing w:before="0" w:after="0" w:line="240" w:lineRule="auto"/>
+            </w:pPr>
+            <w:r>
+              <w:rPr>
+                <w:sz w:val="20"/>
+                <w:szCs w:val="20"/>
+              </w:rPr>
+              <w:t>66.63</w:t>
+            </w:r>
+          </w:p>
+        </w:tc>
+        <w:tc>
+          <w:tcPr>
+            <w:tcW w:w="1872" w:type="dxa"/>
+            <w:vAlign w:val="center"/>
+          </w:tcPr>
+          <w:p>
+            <w:pPr>
+              <w:pStyle w:val="TableText"/>
+              <w:spacing w:before="0" w:after="0" w:line="240" w:lineRule="auto"/>
+            </w:pPr>
+            <w:r>
+              <w:rPr>
+                <w:sz w:val="20"/>
+                <w:szCs w:val="20"/>
+              </w:rPr>
+              <w:t>641</w:t>
+            </w:r>
+          </w:p>
+        </w:tc>
+        <w:tc>
+          <w:tcPr>
+            <w:tcW w:w="1872" w:type="dxa"/>
+            <w:vAlign w:val="center"/>
+          </w:tcPr>
+          <w:p>
+            <w:pPr>
+              <w:pStyle w:val="TableText"/>
+              <w:spacing w:before="0" w:after="0" w:line="240" w:lineRule="auto"/>
+            </w:pPr>
+            <w:r>
+              <w:rPr>
+                <w:sz w:val="20"/>
+                <w:szCs w:val="20"/>
+              </w:rPr>
+              <w:t>62.11</w:t>
+            </w:r>
+          </w:p>
+        </w:tc>
+      </w:tr>
+    </w:tbl>
+    <w:p>
+      <w:pPr>
+        <w:spacing w:after="40"/>
+      </w:pPr>
+    </w:p>
+    <w:p>
+      <w:pPr>
+        <w:pStyle w:val="Heading3"/>
+        <w:keepNext/>
+      </w:pPr>
+      <w:r>
+        <w:t>短肽多维功能预测结果</w:t>
+      </w:r>
+    </w:p>
+    <w:p>
+      <w:pPr>
+        <w:pStyle w:val="BodyText"/>
+      </w:pPr>
+      <w:r>
+        <w:t>对应的短肽分支汇总亦完整保留（表3）。在30,557条和32,754条候选背景中，Antimicrobial_activity输出接近饱和（30,537条，99.93%；32,721条，99.90%）。其他较大输出包括APP_Anti-parasitic（21,185条，69.33%；22,010条，67.20%）、Quorum_sensing（11,834条，38.73%；12,674条，38.69%）和ACP_Anticancer_main（11,370条，37.21%；12,023条，36.71%）。牙周炎标记短肽分支还包含3,446条BBB_Peptides、4,019条NeuroPred和4,728条Anti-MRSA模型阳性候选。这些均为模型特异的高置信度标签，不是实测功能。</w:t>
+      </w:r>
+    </w:p>
+    <w:p>
+      <w:pPr>
+        <w:pStyle w:val="Caption"/>
+      </w:pPr>
+      <w:r>
+        <w:rPr>
+          <w:b/>
+        </w:rPr>
+        <w:t>表3. UniDL4BioPep评分≥0.80的短肽多维功能预测结果。</w:t>
+      </w:r>
+    </w:p>
+    <w:tbl>
+      <w:tblPr>
+        <w:tblStyle w:val="ThreeLineTable"/>
+        <w:tblW w:w="5000" w:type="pct"/>
+        <w:tblLayout w:type="fixed"/>
+        <w:tblBorders>
+          <w:top w:val="single" w:sz="12" w:space="0" w:color="000000"/>
+          <w:left w:val="nil"/>
+          <w:bottom w:val="single" w:sz="12" w:space="0" w:color="000000"/>
+          <w:right w:val="nil"/>
+          <w:insideH w:val="nil"/>
+          <w:insideV w:val="nil"/>
+        </w:tblBorders>
+        <w:tblCellMar>
+          <w:top w:w="70" w:type="dxa"/>
+          <w:left w:w="80" w:type="dxa"/>
+          <w:bottom w:w="70" w:type="dxa"/>
+          <w:right w:w="80" w:type="dxa"/>
+        </w:tblCellMar>
+      </w:tblPr>
+      <w:tblGrid>
+        <w:gridCol w:w="1872"/>
+        <w:gridCol w:w="1872"/>
+        <w:gridCol w:w="1872"/>
+        <w:gridCol w:w="1872"/>
+        <w:gridCol w:w="1872"/>
+      </w:tblGrid>
+      <w:tr>
+        <w:trPr>
+          <w:tblHeader/>
+        </w:trPr>
+        <w:tc>
+          <w:tcPr>
+            <w:tcW w:w="1872" w:type="dxa"/>
+            <w:tcBorders>
+              <w:bottom w:val="single" w:sz="8" w:space="0" w:color="000000"/>
+            </w:tcBorders>
+            <w:vAlign w:val="center"/>
+          </w:tcPr>
+          <w:p>
+            <w:pPr>
+              <w:pStyle w:val="TableText"/>
+              <w:spacing w:before="0" w:after="0" w:line="240" w:lineRule="auto"/>
+            </w:pPr>
+            <w:r>
+              <w:rPr>
+                <w:sz w:val="20"/>
+                <w:szCs w:val="20"/>
+              </w:rPr>
+              <w:t>模型输出</w:t>
+            </w:r>
+          </w:p>
+        </w:tc>
+        <w:tc>
+          <w:tcPr>
+            <w:tcW w:w="1872" w:type="dxa"/>
+            <w:tcBorders>
+              <w:bottom w:val="single" w:sz="8" w:space="0" w:color="000000"/>
+            </w:tcBorders>
+            <w:vAlign w:val="center"/>
+          </w:tcPr>
+          <w:p>
+            <w:pPr>
+              <w:pStyle w:val="TableText"/>
+              <w:spacing w:before="0" w:after="0" w:line="240" w:lineRule="auto"/>
+            </w:pPr>
+            <w:r>
+              <w:rPr>
+                <w:sz w:val="20"/>
+                <w:szCs w:val="20"/>
+              </w:rPr>
+              <w:t>健康 n</w:t>
+            </w:r>
+          </w:p>
+        </w:tc>
+        <w:tc>
+          <w:tcPr>
+            <w:tcW w:w="1872" w:type="dxa"/>
+            <w:tcBorders>
+              <w:bottom w:val="single" w:sz="8" w:space="0" w:color="000000"/>
+            </w:tcBorders>
+            <w:vAlign w:val="center"/>
+          </w:tcPr>
+          <w:p>
+            <w:pPr>
+              <w:pStyle w:val="TableText"/>
+              <w:spacing w:before="0" w:after="0" w:line="240" w:lineRule="auto"/>
+            </w:pPr>
+            <w:r>
+              <w:rPr>
+                <w:sz w:val="20"/>
+                <w:szCs w:val="20"/>
+              </w:rPr>
+              <w:t>健康 %</w:t>
+            </w:r>
+          </w:p>
+        </w:tc>
+        <w:tc>
+          <w:tcPr>
+            <w:tcW w:w="1872" w:type="dxa"/>
+            <w:tcBorders>
+              <w:bottom w:val="single" w:sz="8" w:space="0" w:color="000000"/>
+            </w:tcBorders>
+            <w:vAlign w:val="center"/>
+          </w:tcPr>
+          <w:p>
+            <w:pPr>
+              <w:pStyle w:val="TableText"/>
+              <w:spacing w:before="0" w:after="0" w:line="240" w:lineRule="auto"/>
+            </w:pPr>
+            <w:r>
+              <w:rPr>
+                <w:sz w:val="20"/>
+                <w:szCs w:val="20"/>
+              </w:rPr>
+              <w:t>牙周炎 n</w:t>
+            </w:r>
+          </w:p>
+        </w:tc>
+        <w:tc>
+          <w:tcPr>
+            <w:tcW w:w="1872" w:type="dxa"/>
+            <w:tcBorders>
+              <w:bottom w:val="single" w:sz="8" w:space="0" w:color="000000"/>
+            </w:tcBorders>
+            <w:vAlign w:val="center"/>
+          </w:tcPr>
+          <w:p>
+            <w:pPr>
+              <w:pStyle w:val="TableText"/>
+              <w:spacing w:before="0" w:after="0" w:line="240" w:lineRule="auto"/>
+            </w:pPr>
+            <w:r>
+              <w:rPr>
+                <w:sz w:val="20"/>
+                <w:szCs w:val="20"/>
+              </w:rPr>
+              <w:t>牙周炎 %</w:t>
+            </w:r>
+          </w:p>
+        </w:tc>
+      </w:tr>
+      <w:tr>
+        <w:tc>
+          <w:tcPr>
+            <w:tcW w:w="1872" w:type="dxa"/>
+            <w:vAlign w:val="center"/>
+          </w:tcPr>
+          <w:p>
+            <w:pPr>
+              <w:pStyle w:val="TableText"/>
+              <w:spacing w:before="0" w:after="0" w:line="240" w:lineRule="auto"/>
+            </w:pPr>
+            <w:r>
+              <w:rPr>
+                <w:sz w:val="20"/>
+                <w:szCs w:val="20"/>
+              </w:rPr>
+              <w:t>ACE_inhibitory_activity</w:t>
+            </w:r>
+          </w:p>
+        </w:tc>
+        <w:tc>
+          <w:tcPr>
+            <w:tcW w:w="1872" w:type="dxa"/>
+            <w:vAlign w:val="center"/>
+          </w:tcPr>
+          <w:p>
+            <w:pPr>
+              <w:pStyle w:val="TableText"/>
+              <w:spacing w:before="0" w:after="0" w:line="240" w:lineRule="auto"/>
+            </w:pPr>
+            <w:r>
+              <w:rPr>
+                <w:sz w:val="20"/>
+                <w:szCs w:val="20"/>
+              </w:rPr>
+              <w:t>2,781</w:t>
+            </w:r>
+          </w:p>
+        </w:tc>
+        <w:tc>
+          <w:tcPr>
+            <w:tcW w:w="1872" w:type="dxa"/>
+            <w:vAlign w:val="center"/>
+          </w:tcPr>
+          <w:p>
+            <w:pPr>
+              <w:pStyle w:val="TableText"/>
+              <w:spacing w:before="0" w:after="0" w:line="240" w:lineRule="auto"/>
+            </w:pPr>
+            <w:r>
+              <w:rPr>
+                <w:sz w:val="20"/>
+                <w:szCs w:val="20"/>
+              </w:rPr>
+              <w:t>9.10</w:t>
+            </w:r>
+          </w:p>
+        </w:tc>
+        <w:tc>
+          <w:tcPr>
+            <w:tcW w:w="1872" w:type="dxa"/>
+            <w:vAlign w:val="center"/>
+          </w:tcPr>
+          <w:p>
+            <w:pPr>
+              <w:pStyle w:val="TableText"/>
+              <w:spacing w:before="0" w:after="0" w:line="240" w:lineRule="auto"/>
+            </w:pPr>
+            <w:r>
+              <w:rPr>
+                <w:sz w:val="20"/>
+                <w:szCs w:val="20"/>
+              </w:rPr>
+              <w:t>2,856</w:t>
+            </w:r>
+          </w:p>
+        </w:tc>
+        <w:tc>
+          <w:tcPr>
+            <w:tcW w:w="1872" w:type="dxa"/>
+            <w:vAlign w:val="center"/>
+          </w:tcPr>
+          <w:p>
+            <w:pPr>
+              <w:pStyle w:val="TableText"/>
+              <w:spacing w:before="0" w:after="0" w:line="240" w:lineRule="auto"/>
+            </w:pPr>
+            <w:r>
+              <w:rPr>
+                <w:sz w:val="20"/>
+                <w:szCs w:val="20"/>
+              </w:rPr>
+              <w:t>8.72</w:t>
+            </w:r>
+          </w:p>
+        </w:tc>
+      </w:tr>
+      <w:tr>
+        <w:tc>
+          <w:tcPr>
+            <w:tcW w:w="1872" w:type="dxa"/>
+            <w:vAlign w:val="center"/>
+          </w:tcPr>
+          <w:p>
+            <w:pPr>
+              <w:pStyle w:val="TableText"/>
+              <w:spacing w:before="0" w:after="0" w:line="240" w:lineRule="auto"/>
+            </w:pPr>
+            <w:r>
+              <w:rPr>
+                <w:sz w:val="20"/>
+                <w:szCs w:val="20"/>
+              </w:rPr>
+              <w:t>TTCA</w:t>
+            </w:r>
+          </w:p>
+        </w:tc>
+        <w:tc>
+          <w:tcPr>
+            <w:tcW w:w="1872" w:type="dxa"/>
+            <w:vAlign w:val="center"/>
+          </w:tcPr>
+          <w:p>
+            <w:pPr>
+              <w:pStyle w:val="TableText"/>
+              <w:spacing w:before="0" w:after="0" w:line="240" w:lineRule="auto"/>
+            </w:pPr>
+            <w:r>
+              <w:rPr>
+                <w:sz w:val="20"/>
+                <w:szCs w:val="20"/>
+              </w:rPr>
+              <w:t>9,123</w:t>
+            </w:r>
+          </w:p>
+        </w:tc>
+        <w:tc>
+          <w:tcPr>
+            <w:tcW w:w="1872" w:type="dxa"/>
+            <w:vAlign w:val="center"/>
+          </w:tcPr>
+          <w:p>
+            <w:pPr>
+              <w:pStyle w:val="TableText"/>
+              <w:spacing w:before="0" w:after="0" w:line="240" w:lineRule="auto"/>
+            </w:pPr>
+            <w:r>
+              <w:rPr>
+                <w:sz w:val="20"/>
+                <w:szCs w:val="20"/>
+              </w:rPr>
+              <w:t>29.86</w:t>
+            </w:r>
+          </w:p>
+        </w:tc>
+        <w:tc>
+          <w:tcPr>
+            <w:tcW w:w="1872" w:type="dxa"/>
+            <w:vAlign w:val="center"/>
+          </w:tcPr>
+          <w:p>
+            <w:pPr>
+              <w:pStyle w:val="TableText"/>
+              <w:spacing w:before="0" w:after="0" w:line="240" w:lineRule="auto"/>
+            </w:pPr>
+            <w:r>
+              <w:rPr>
+                <w:sz w:val="20"/>
+                <w:szCs w:val="20"/>
+              </w:rPr>
+              <w:t>9,161</w:t>
+            </w:r>
+          </w:p>
+        </w:tc>
+        <w:tc>
+          <w:tcPr>
+            <w:tcW w:w="1872" w:type="dxa"/>
+            <w:vAlign w:val="center"/>
+          </w:tcPr>
+          <w:p>
+            <w:pPr>
+              <w:pStyle w:val="TableText"/>
+              <w:spacing w:before="0" w:after="0" w:line="240" w:lineRule="auto"/>
+            </w:pPr>
+            <w:r>
+              <w:rPr>
+                <w:sz w:val="20"/>
+                <w:szCs w:val="20"/>
+              </w:rPr>
+              <w:t>27.97</w:t>
+            </w:r>
+          </w:p>
+        </w:tc>
+      </w:tr>
+      <w:tr>
+        <w:tc>
+          <w:tcPr>
+            <w:tcW w:w="1872" w:type="dxa"/>
+            <w:vAlign w:val="center"/>
+          </w:tcPr>
+          <w:p>
+            <w:pPr>
+              <w:pStyle w:val="TableText"/>
+              <w:spacing w:before="0" w:after="0" w:line="240" w:lineRule="auto"/>
+            </w:pPr>
+            <w:r>
+              <w:rPr>
+                <w:sz w:val="20"/>
+                <w:szCs w:val="20"/>
+              </w:rPr>
+              <w:t>BBB_Peptides</w:t>
+            </w:r>
+          </w:p>
+        </w:tc>
+        <w:tc>
+          <w:tcPr>
+            <w:tcW w:w="1872" w:type="dxa"/>
+            <w:vAlign w:val="center"/>
+          </w:tcPr>
+          <w:p>
+            <w:pPr>
+              <w:pStyle w:val="TableText"/>
+              <w:spacing w:before="0" w:after="0" w:line="240" w:lineRule="auto"/>
+            </w:pPr>
+            <w:r>
+              <w:rPr>
+                <w:sz w:val="20"/>
+                <w:szCs w:val="20"/>
+              </w:rPr>
+              <w:t>3,359</w:t>
+            </w:r>
+          </w:p>
+        </w:tc>
+        <w:tc>
+          <w:tcPr>
+            <w:tcW w:w="1872" w:type="dxa"/>
+            <w:vAlign w:val="center"/>
+          </w:tcPr>
+          <w:p>
+            <w:pPr>
+              <w:pStyle w:val="TableText"/>
+              <w:spacing w:before="0" w:after="0" w:line="240" w:lineRule="auto"/>
+            </w:pPr>
+            <w:r>
+              <w:rPr>
+                <w:sz w:val="20"/>
+                <w:szCs w:val="20"/>
+              </w:rPr>
+              <w:t>10.99</w:t>
+            </w:r>
+          </w:p>
+        </w:tc>
+        <w:tc>
+          <w:tcPr>
+            <w:tcW w:w="1872" w:type="dxa"/>
+            <w:vAlign w:val="center"/>
+          </w:tcPr>
+          <w:p>
+            <w:pPr>
+              <w:pStyle w:val="TableText"/>
+              <w:spacing w:before="0" w:after="0" w:line="240" w:lineRule="auto"/>
+            </w:pPr>
+            <w:r>
+              <w:rPr>
+                <w:sz w:val="20"/>
+                <w:szCs w:val="20"/>
+              </w:rPr>
+              <w:t>3,446</w:t>
+            </w:r>
+          </w:p>
+        </w:tc>
+        <w:tc>
+          <w:tcPr>
+            <w:tcW w:w="1872" w:type="dxa"/>
+            <w:vAlign w:val="center"/>
+          </w:tcPr>
+          <w:p>
+            <w:pPr>
+              <w:pStyle w:val="TableText"/>
+              <w:spacing w:before="0" w:after="0" w:line="240" w:lineRule="auto"/>
+            </w:pPr>
+            <w:r>
+              <w:rPr>
+                <w:sz w:val="20"/>
+                <w:szCs w:val="20"/>
+              </w:rPr>
+              <w:t>10.52</w:t>
+            </w:r>
+          </w:p>
+        </w:tc>
+      </w:tr>
+      <w:tr>
+        <w:tc>
+          <w:tcPr>
+            <w:tcW w:w="1872" w:type="dxa"/>
+            <w:vAlign w:val="center"/>
+          </w:tcPr>
+          <w:p>
+            <w:pPr>
+              <w:pStyle w:val="TableText"/>
+              <w:spacing w:before="0" w:after="0" w:line="240" w:lineRule="auto"/>
+            </w:pPr>
+            <w:r>
+              <w:rPr>
+                <w:sz w:val="20"/>
+                <w:szCs w:val="20"/>
+              </w:rPr>
+              <w:t>APP_Anti-parasitic</w:t>
+            </w:r>
+          </w:p>
+        </w:tc>
+        <w:tc>
+          <w:tcPr>
+            <w:tcW w:w="1872" w:type="dxa"/>
+            <w:vAlign w:val="center"/>
+          </w:tcPr>
+          <w:p>
+            <w:pPr>
+              <w:pStyle w:val="TableText"/>
+              <w:spacing w:before="0" w:after="0" w:line="240" w:lineRule="auto"/>
+            </w:pPr>
+            <w:r>
+              <w:rPr>
+                <w:sz w:val="20"/>
+                <w:szCs w:val="20"/>
+              </w:rPr>
+              <w:t>21,185</w:t>
+            </w:r>
+          </w:p>
+        </w:tc>
+        <w:tc>
+          <w:tcPr>
+            <w:tcW w:w="1872" w:type="dxa"/>
+            <w:vAlign w:val="center"/>
+          </w:tcPr>
+          <w:p>
+            <w:pPr>
+              <w:pStyle w:val="TableText"/>
+              <w:spacing w:before="0" w:after="0" w:line="240" w:lineRule="auto"/>
+            </w:pPr>
+            <w:r>
+              <w:rPr>
+                <w:sz w:val="20"/>
+                <w:szCs w:val="20"/>
+              </w:rPr>
+              <w:t>69.33</w:t>
+            </w:r>
+          </w:p>
+        </w:tc>
+        <w:tc>
+          <w:tcPr>
+            <w:tcW w:w="1872" w:type="dxa"/>
+            <w:vAlign w:val="center"/>
+          </w:tcPr>
+          <w:p>
+            <w:pPr>
+              <w:pStyle w:val="TableText"/>
+              <w:spacing w:before="0" w:after="0" w:line="240" w:lineRule="auto"/>
+            </w:pPr>
+            <w:r>
+              <w:rPr>
+                <w:sz w:val="20"/>
+                <w:szCs w:val="20"/>
+              </w:rPr>
+              <w:t>22,010</w:t>
+            </w:r>
+          </w:p>
+        </w:tc>
+        <w:tc>
+          <w:tcPr>
+            <w:tcW w:w="1872" w:type="dxa"/>
+            <w:vAlign w:val="center"/>
+          </w:tcPr>
+          <w:p>
+            <w:pPr>
+              <w:pStyle w:val="TableText"/>
+              <w:spacing w:before="0" w:after="0" w:line="240" w:lineRule="auto"/>
+            </w:pPr>
+            <w:r>
+              <w:rPr>
+                <w:sz w:val="20"/>
+                <w:szCs w:val="20"/>
+              </w:rPr>
+              <w:t>67.20</w:t>
+            </w:r>
+          </w:p>
+        </w:tc>
+      </w:tr>
+      <w:tr>
+        <w:tc>
+          <w:tcPr>
+            <w:tcW w:w="1872" w:type="dxa"/>
+            <w:vAlign w:val="center"/>
+          </w:tcPr>
+          <w:p>
+            <w:pPr>
+              <w:pStyle w:val="TableText"/>
+              <w:spacing w:before="0" w:after="0" w:line="240" w:lineRule="auto"/>
+            </w:pPr>
+            <w:r>
+              <w:rPr>
+                <w:sz w:val="20"/>
+                <w:szCs w:val="20"/>
+              </w:rPr>
+              <w:t>NeuroPred</w:t>
+            </w:r>
+          </w:p>
+        </w:tc>
+        <w:tc>
+          <w:tcPr>
+            <w:tcW w:w="1872" w:type="dxa"/>
+            <w:vAlign w:val="center"/>
+          </w:tcPr>
+          <w:p>
+            <w:pPr>
+              <w:pStyle w:val="TableText"/>
+              <w:spacing w:before="0" w:after="0" w:line="240" w:lineRule="auto"/>
+            </w:pPr>
+            <w:r>
+              <w:rPr>
+                <w:sz w:val="20"/>
+                <w:szCs w:val="20"/>
+              </w:rPr>
+              <w:t>3,876</w:t>
+            </w:r>
+          </w:p>
+        </w:tc>
+        <w:tc>
+          <w:tcPr>
+            <w:tcW w:w="1872" w:type="dxa"/>
+            <w:vAlign w:val="center"/>
+          </w:tcPr>
+          <w:p>
+            <w:pPr>
+              <w:pStyle w:val="TableText"/>
+              <w:spacing w:before="0" w:after="0" w:line="240" w:lineRule="auto"/>
+            </w:pPr>
+            <w:r>
+              <w:rPr>
+                <w:sz w:val="20"/>
+                <w:szCs w:val="20"/>
+              </w:rPr>
+              <w:t>12.68</w:t>
+            </w:r>
+          </w:p>
+        </w:tc>
+        <w:tc>
+          <w:tcPr>
+            <w:tcW w:w="1872" w:type="dxa"/>
+            <w:vAlign w:val="center"/>
+          </w:tcPr>
+          <w:p>
+            <w:pPr>
+              <w:pStyle w:val="TableText"/>
+              <w:spacing w:before="0" w:after="0" w:line="240" w:lineRule="auto"/>
+            </w:pPr>
+            <w:r>
+              <w:rPr>
+                <w:sz w:val="20"/>
+                <w:szCs w:val="20"/>
+              </w:rPr>
+              <w:t>4,019</w:t>
+            </w:r>
+          </w:p>
+        </w:tc>
+        <w:tc>
+          <w:tcPr>
+            <w:tcW w:w="1872" w:type="dxa"/>
+            <w:vAlign w:val="center"/>
+          </w:tcPr>
+          <w:p>
+            <w:pPr>
+              <w:pStyle w:val="TableText"/>
+              <w:spacing w:before="0" w:after="0" w:line="240" w:lineRule="auto"/>
+            </w:pPr>
+            <w:r>
+              <w:rPr>
+                <w:sz w:val="20"/>
+                <w:szCs w:val="20"/>
+              </w:rPr>
+              <w:t>12.27</w:t>
+            </w:r>
+          </w:p>
+        </w:tc>
+      </w:tr>
+      <w:tr>
+        <w:tc>
+          <w:tcPr>
+            <w:tcW w:w="1872" w:type="dxa"/>
+            <w:vAlign w:val="center"/>
+          </w:tcPr>
+          <w:p>
+            <w:pPr>
+              <w:pStyle w:val="TableText"/>
+              <w:spacing w:before="0" w:after="0" w:line="240" w:lineRule="auto"/>
+            </w:pPr>
+            <w:r>
+              <w:rPr>
+                <w:sz w:val="20"/>
+                <w:szCs w:val="20"/>
+              </w:rPr>
+              <w:t>Antibacterial_AB</w:t>
+            </w:r>
+          </w:p>
+        </w:tc>
+        <w:tc>
+          <w:tcPr>
+            <w:tcW w:w="1872" w:type="dxa"/>
+            <w:vAlign w:val="center"/>
+          </w:tcPr>
+          <w:p>
+            <w:pPr>
+              <w:pStyle w:val="TableText"/>
+              <w:spacing w:before="0" w:after="0" w:line="240" w:lineRule="auto"/>
+            </w:pPr>
+            <w:r>
+              <w:rPr>
+                <w:sz w:val="20"/>
+                <w:szCs w:val="20"/>
+              </w:rPr>
+              <w:t>9,269</w:t>
+            </w:r>
+          </w:p>
+        </w:tc>
+        <w:tc>
+          <w:tcPr>
+            <w:tcW w:w="1872" w:type="dxa"/>
+            <w:vAlign w:val="center"/>
+          </w:tcPr>
+          <w:p>
+            <w:pPr>
+              <w:pStyle w:val="TableText"/>
+              <w:spacing w:before="0" w:after="0" w:line="240" w:lineRule="auto"/>
+            </w:pPr>
+            <w:r>
+              <w:rPr>
+                <w:sz w:val="20"/>
+                <w:szCs w:val="20"/>
+              </w:rPr>
+              <w:t>30.33</w:t>
+            </w:r>
+          </w:p>
+        </w:tc>
+        <w:tc>
+          <w:tcPr>
+            <w:tcW w:w="1872" w:type="dxa"/>
+            <w:vAlign w:val="center"/>
+          </w:tcPr>
+          <w:p>
+            <w:pPr>
+              <w:pStyle w:val="TableText"/>
+              <w:spacing w:before="0" w:after="0" w:line="240" w:lineRule="auto"/>
+            </w:pPr>
+            <w:r>
+              <w:rPr>
+                <w:sz w:val="20"/>
+                <w:szCs w:val="20"/>
+              </w:rPr>
+              <w:t>9,273</w:t>
+            </w:r>
+          </w:p>
+        </w:tc>
+        <w:tc>
+          <w:tcPr>
+            <w:tcW w:w="1872" w:type="dxa"/>
+            <w:vAlign w:val="center"/>
+          </w:tcPr>
+          <w:p>
+            <w:pPr>
+              <w:pStyle w:val="TableText"/>
+              <w:spacing w:before="0" w:after="0" w:line="240" w:lineRule="auto"/>
+            </w:pPr>
+            <w:r>
+              <w:rPr>
+                <w:sz w:val="20"/>
+                <w:szCs w:val="20"/>
+              </w:rPr>
+              <w:t>28.31</w:t>
+            </w:r>
+          </w:p>
+        </w:tc>
+      </w:tr>
+      <w:tr>
+        <w:tc>
+          <w:tcPr>
+            <w:tcW w:w="1872" w:type="dxa"/>
+            <w:vAlign w:val="center"/>
+          </w:tcPr>
+          <w:p>
+            <w:pPr>
+              <w:pStyle w:val="TableText"/>
+              <w:spacing w:before="0" w:after="0" w:line="240" w:lineRule="auto"/>
+            </w:pPr>
+            <w:r>
+              <w:rPr>
+                <w:sz w:val="20"/>
+                <w:szCs w:val="20"/>
+              </w:rPr>
+              <w:t>Antifungal_AF</w:t>
+            </w:r>
+          </w:p>
+        </w:tc>
+        <w:tc>
+          <w:tcPr>
+            <w:tcW w:w="1872" w:type="dxa"/>
+            <w:vAlign w:val="center"/>
+          </w:tcPr>
+          <w:p>
+            <w:pPr>
+              <w:pStyle w:val="TableText"/>
+              <w:spacing w:before="0" w:after="0" w:line="240" w:lineRule="auto"/>
+            </w:pPr>
+            <w:r>
+              <w:rPr>
+                <w:sz w:val="20"/>
+                <w:szCs w:val="20"/>
+              </w:rPr>
+              <w:t>8,732</w:t>
+            </w:r>
+          </w:p>
+        </w:tc>
+        <w:tc>
+          <w:tcPr>
+            <w:tcW w:w="1872" w:type="dxa"/>
+            <w:vAlign w:val="center"/>
+          </w:tcPr>
+          <w:p>
+            <w:pPr>
+              <w:pStyle w:val="TableText"/>
+              <w:spacing w:before="0" w:after="0" w:line="240" w:lineRule="auto"/>
+            </w:pPr>
+            <w:r>
+              <w:rPr>
+                <w:sz w:val="20"/>
+                <w:szCs w:val="20"/>
+              </w:rPr>
+              <w:t>28.58</w:t>
+            </w:r>
+          </w:p>
+        </w:tc>
+        <w:tc>
+          <w:tcPr>
+            <w:tcW w:w="1872" w:type="dxa"/>
+            <w:vAlign w:val="center"/>
+          </w:tcPr>
+          <w:p>
+            <w:pPr>
+              <w:pStyle w:val="TableText"/>
+              <w:spacing w:before="0" w:after="0" w:line="240" w:lineRule="auto"/>
+            </w:pPr>
+            <w:r>
+              <w:rPr>
+                <w:sz w:val="20"/>
+                <w:szCs w:val="20"/>
+              </w:rPr>
+              <w:t>8,475</w:t>
+            </w:r>
+          </w:p>
+        </w:tc>
+        <w:tc>
+          <w:tcPr>
+            <w:tcW w:w="1872" w:type="dxa"/>
+            <w:vAlign w:val="center"/>
+          </w:tcPr>
+          <w:p>
+            <w:pPr>
+              <w:pStyle w:val="TableText"/>
+              <w:spacing w:before="0" w:after="0" w:line="240" w:lineRule="auto"/>
+            </w:pPr>
+            <w:r>
+              <w:rPr>
+                <w:sz w:val="20"/>
+                <w:szCs w:val="20"/>
+              </w:rPr>
+              <w:t>25.87</w:t>
+            </w:r>
+          </w:p>
+        </w:tc>
+      </w:tr>
+      <w:tr>
+        <w:tc>
+          <w:tcPr>
+            <w:tcW w:w="1872" w:type="dxa"/>
+            <w:vAlign w:val="center"/>
+          </w:tcPr>
+          <w:p>
+            <w:pPr>
+              <w:pStyle w:val="TableText"/>
+              <w:spacing w:before="0" w:after="0" w:line="240" w:lineRule="auto"/>
+            </w:pPr>
+            <w:r>
+              <w:rPr>
+                <w:sz w:val="20"/>
+                <w:szCs w:val="20"/>
+              </w:rPr>
+              <w:t>AV_Antiviral</w:t>
+            </w:r>
+          </w:p>
+        </w:tc>
+        <w:tc>
+          <w:tcPr>
+            <w:tcW w:w="1872" w:type="dxa"/>
+            <w:vAlign w:val="center"/>
+          </w:tcPr>
+          <w:p>
+            <w:pPr>
+              <w:pStyle w:val="TableText"/>
+              <w:spacing w:before="0" w:after="0" w:line="240" w:lineRule="auto"/>
+            </w:pPr>
+            <w:r>
+              <w:rPr>
+                <w:sz w:val="20"/>
+                <w:szCs w:val="20"/>
+              </w:rPr>
+              <w:t>7,501</w:t>
+            </w:r>
+          </w:p>
+        </w:tc>
+        <w:tc>
+          <w:tcPr>
+            <w:tcW w:w="1872" w:type="dxa"/>
+            <w:vAlign w:val="center"/>
+          </w:tcPr>
+          <w:p>
+            <w:pPr>
+              <w:pStyle w:val="TableText"/>
+              <w:spacing w:before="0" w:after="0" w:line="240" w:lineRule="auto"/>
+            </w:pPr>
+            <w:r>
+              <w:rPr>
+                <w:sz w:val="20"/>
+                <w:szCs w:val="20"/>
+              </w:rPr>
+              <w:t>24.55</w:t>
+            </w:r>
+          </w:p>
+        </w:tc>
+        <w:tc>
+          <w:tcPr>
+            <w:tcW w:w="1872" w:type="dxa"/>
+            <w:vAlign w:val="center"/>
+          </w:tcPr>
+          <w:p>
+            <w:pPr>
+              <w:pStyle w:val="TableText"/>
+              <w:spacing w:before="0" w:after="0" w:line="240" w:lineRule="auto"/>
+            </w:pPr>
+            <w:r>
+              <w:rPr>
+                <w:sz w:val="20"/>
+                <w:szCs w:val="20"/>
+              </w:rPr>
+              <w:t>7,221</w:t>
+            </w:r>
+          </w:p>
+        </w:tc>
+        <w:tc>
+          <w:tcPr>
+            <w:tcW w:w="1872" w:type="dxa"/>
+            <w:vAlign w:val="center"/>
+          </w:tcPr>
+          <w:p>
+            <w:pPr>
+              <w:pStyle w:val="TableText"/>
+              <w:spacing w:before="0" w:after="0" w:line="240" w:lineRule="auto"/>
+            </w:pPr>
+            <w:r>
+              <w:rPr>
+                <w:sz w:val="20"/>
+                <w:szCs w:val="20"/>
+              </w:rPr>
+              <w:t>22.05</w:t>
+            </w:r>
+          </w:p>
+        </w:tc>
+      </w:tr>
+      <w:tr>
+        <w:tc>
+          <w:tcPr>
+            <w:tcW w:w="1872" w:type="dxa"/>
+            <w:vAlign w:val="center"/>
+          </w:tcPr>
+          <w:p>
+            <w:pPr>
+              <w:pStyle w:val="TableText"/>
+              <w:spacing w:before="0" w:after="0" w:line="240" w:lineRule="auto"/>
+            </w:pPr>
+            <w:r>
+              <w:rPr>
+                <w:sz w:val="20"/>
+                <w:szCs w:val="20"/>
+              </w:rPr>
+              <w:t>Toxicity_2021</w:t>
+            </w:r>
+          </w:p>
+        </w:tc>
+        <w:tc>
+          <w:tcPr>
+            <w:tcW w:w="1872" w:type="dxa"/>
+            <w:vAlign w:val="center"/>
+          </w:tcPr>
+          <w:p>
+            <w:pPr>
+              <w:pStyle w:val="TableText"/>
+              <w:spacing w:before="0" w:after="0" w:line="240" w:lineRule="auto"/>
+            </w:pPr>
+            <w:r>
+              <w:rPr>
+                <w:sz w:val="20"/>
+                <w:szCs w:val="20"/>
+              </w:rPr>
+              <w:t>2,770</w:t>
+            </w:r>
+          </w:p>
+        </w:tc>
+        <w:tc>
+          <w:tcPr>
+            <w:tcW w:w="1872" w:type="dxa"/>
+            <w:vAlign w:val="center"/>
+          </w:tcPr>
+          <w:p>
+            <w:pPr>
+              <w:pStyle w:val="TableText"/>
+              <w:spacing w:before="0" w:after="0" w:line="240" w:lineRule="auto"/>
+            </w:pPr>
+            <w:r>
+              <w:rPr>
+                <w:sz w:val="20"/>
+                <w:szCs w:val="20"/>
+              </w:rPr>
+              <w:t>9.07</w:t>
+            </w:r>
+          </w:p>
+        </w:tc>
+        <w:tc>
+          <w:tcPr>
+            <w:tcW w:w="1872" w:type="dxa"/>
+            <w:vAlign w:val="center"/>
+          </w:tcPr>
+          <w:p>
+            <w:pPr>
+              <w:pStyle w:val="TableText"/>
+              <w:spacing w:before="0" w:after="0" w:line="240" w:lineRule="auto"/>
+            </w:pPr>
+            <w:r>
+              <w:rPr>
+                <w:sz w:val="20"/>
+                <w:szCs w:val="20"/>
+              </w:rPr>
+              <w:t>2,751</w:t>
+            </w:r>
+          </w:p>
+        </w:tc>
+        <w:tc>
+          <w:tcPr>
+            <w:tcW w:w="1872" w:type="dxa"/>
+            <w:vAlign w:val="center"/>
+          </w:tcPr>
+          <w:p>
+            <w:pPr>
+              <w:pStyle w:val="TableText"/>
+              <w:spacing w:before="0" w:after="0" w:line="240" w:lineRule="auto"/>
+            </w:pPr>
+            <w:r>
+              <w:rPr>
+                <w:sz w:val="20"/>
+                <w:szCs w:val="20"/>
+              </w:rPr>
+              <w:t>8.40</w:t>
+            </w:r>
+          </w:p>
+        </w:tc>
+      </w:tr>
+      <w:tr>
+        <w:tc>
+          <w:tcPr>
+            <w:tcW w:w="1872" w:type="dxa"/>
+            <w:vAlign w:val="center"/>
+          </w:tcPr>
+          <w:p>
+            <w:pPr>
+              <w:pStyle w:val="TableText"/>
+              <w:spacing w:before="0" w:after="0" w:line="240" w:lineRule="auto"/>
+            </w:pPr>
+            <w:r>
+              <w:rPr>
+                <w:sz w:val="20"/>
+                <w:szCs w:val="20"/>
+              </w:rPr>
+              <w:t>Antioxidant_FRS</w:t>
+            </w:r>
+          </w:p>
+        </w:tc>
+        <w:tc>
+          <w:tcPr>
+            <w:tcW w:w="1872" w:type="dxa"/>
+            <w:vAlign w:val="center"/>
+          </w:tcPr>
+          <w:p>
+            <w:pPr>
+              <w:pStyle w:val="TableText"/>
+              <w:spacing w:before="0" w:after="0" w:line="240" w:lineRule="auto"/>
+            </w:pPr>
+            <w:r>
+              <w:rPr>
+                <w:sz w:val="20"/>
+                <w:szCs w:val="20"/>
+              </w:rPr>
+              <w:t>4,171</w:t>
+            </w:r>
+          </w:p>
+        </w:tc>
+        <w:tc>
+          <w:tcPr>
+            <w:tcW w:w="1872" w:type="dxa"/>
+            <w:vAlign w:val="center"/>
+          </w:tcPr>
+          <w:p>
+            <w:pPr>
+              <w:pStyle w:val="TableText"/>
+              <w:spacing w:before="0" w:after="0" w:line="240" w:lineRule="auto"/>
+            </w:pPr>
+            <w:r>
+              <w:rPr>
+                <w:sz w:val="20"/>
+                <w:szCs w:val="20"/>
+              </w:rPr>
+              <w:t>13.65</w:t>
+            </w:r>
+          </w:p>
+        </w:tc>
+        <w:tc>
+          <w:tcPr>
+            <w:tcW w:w="1872" w:type="dxa"/>
+            <w:vAlign w:val="center"/>
+          </w:tcPr>
+          <w:p>
+            <w:pPr>
+              <w:pStyle w:val="TableText"/>
+              <w:spacing w:before="0" w:after="0" w:line="240" w:lineRule="auto"/>
+            </w:pPr>
+            <w:r>
+              <w:rPr>
+                <w:sz w:val="20"/>
+                <w:szCs w:val="20"/>
+              </w:rPr>
+              <w:t>4,093</w:t>
+            </w:r>
+          </w:p>
+        </w:tc>
+        <w:tc>
+          <w:tcPr>
+            <w:tcW w:w="1872" w:type="dxa"/>
+            <w:vAlign w:val="center"/>
+          </w:tcPr>
+          <w:p>
+            <w:pPr>
+              <w:pStyle w:val="TableText"/>
+              <w:spacing w:before="0" w:after="0" w:line="240" w:lineRule="auto"/>
+            </w:pPr>
+            <w:r>
+              <w:rPr>
+                <w:sz w:val="20"/>
+                <w:szCs w:val="20"/>
+              </w:rPr>
+              <w:t>12.50</w:t>
+            </w:r>
+          </w:p>
+        </w:tc>
+      </w:tr>
+      <w:tr>
+        <w:tc>
+          <w:tcPr>
+            <w:tcW w:w="1872" w:type="dxa"/>
+            <w:vAlign w:val="center"/>
+          </w:tcPr>
+          <w:p>
+            <w:pPr>
+              <w:pStyle w:val="TableText"/>
+              <w:spacing w:before="0" w:after="0" w:line="240" w:lineRule="auto"/>
+            </w:pPr>
+            <w:r>
+              <w:rPr>
+                <w:sz w:val="20"/>
+                <w:szCs w:val="20"/>
+              </w:rPr>
+              <w:t>Allergenicity</w:t>
+            </w:r>
+          </w:p>
+        </w:tc>
+        <w:tc>
+          <w:tcPr>
+            <w:tcW w:w="1872" w:type="dxa"/>
+            <w:vAlign w:val="center"/>
+          </w:tcPr>
+          <w:p>
+            <w:pPr>
+              <w:pStyle w:val="TableText"/>
+              <w:spacing w:before="0" w:after="0" w:line="240" w:lineRule="auto"/>
+            </w:pPr>
+            <w:r>
+              <w:rPr>
+                <w:sz w:val="20"/>
+                <w:szCs w:val="20"/>
+              </w:rPr>
+              <w:t>8,599</w:t>
+            </w:r>
+          </w:p>
+        </w:tc>
+        <w:tc>
+          <w:tcPr>
+            <w:tcW w:w="1872" w:type="dxa"/>
+            <w:vAlign w:val="center"/>
+          </w:tcPr>
+          <w:p>
+            <w:pPr>
+              <w:pStyle w:val="TableText"/>
+              <w:spacing w:before="0" w:after="0" w:line="240" w:lineRule="auto"/>
+            </w:pPr>
+            <w:r>
+              <w:rPr>
+                <w:sz w:val="20"/>
+                <w:szCs w:val="20"/>
+              </w:rPr>
+              <w:t>28.14</w:t>
+            </w:r>
+          </w:p>
+        </w:tc>
+        <w:tc>
+          <w:tcPr>
+            <w:tcW w:w="1872" w:type="dxa"/>
+            <w:vAlign w:val="center"/>
+          </w:tcPr>
+          <w:p>
+            <w:pPr>
+              <w:pStyle w:val="TableText"/>
+              <w:spacing w:before="0" w:after="0" w:line="240" w:lineRule="auto"/>
+            </w:pPr>
+            <w:r>
+              <w:rPr>
+                <w:sz w:val="20"/>
+                <w:szCs w:val="20"/>
+              </w:rPr>
+              <w:t>9,422</w:t>
+            </w:r>
+          </w:p>
+        </w:tc>
+        <w:tc>
+          <w:tcPr>
+            <w:tcW w:w="1872" w:type="dxa"/>
+            <w:vAlign w:val="center"/>
+          </w:tcPr>
+          <w:p>
+            <w:pPr>
+              <w:pStyle w:val="TableText"/>
+              <w:spacing w:before="0" w:after="0" w:line="240" w:lineRule="auto"/>
+            </w:pPr>
+            <w:r>
+              <w:rPr>
+                <w:sz w:val="20"/>
+                <w:szCs w:val="20"/>
+              </w:rPr>
+              <w:t>28.77</w:t>
+            </w:r>
+          </w:p>
+        </w:tc>
+      </w:tr>
+      <w:tr>
+        <w:tc>
+          <w:tcPr>
+            <w:tcW w:w="1872" w:type="dxa"/>
+            <w:vAlign w:val="center"/>
+          </w:tcPr>
+          <w:p>
+            <w:pPr>
+              <w:pStyle w:val="TableText"/>
+              <w:spacing w:before="0" w:after="0" w:line="240" w:lineRule="auto"/>
+            </w:pPr>
+            <w:r>
+              <w:rPr>
+                <w:sz w:val="20"/>
+                <w:szCs w:val="20"/>
+              </w:rPr>
+              <w:t>DPPIV_inhibitory_activity</w:t>
+            </w:r>
+          </w:p>
+        </w:tc>
+        <w:tc>
+          <w:tcPr>
+            <w:tcW w:w="1872" w:type="dxa"/>
+            <w:vAlign w:val="center"/>
+          </w:tcPr>
+          <w:p>
+            <w:pPr>
+              <w:pStyle w:val="TableText"/>
+              <w:spacing w:before="0" w:after="0" w:line="240" w:lineRule="auto"/>
+            </w:pPr>
+            <w:r>
+              <w:rPr>
+                <w:sz w:val="20"/>
+                <w:szCs w:val="20"/>
+              </w:rPr>
+              <w:t>207</w:t>
+            </w:r>
+          </w:p>
+        </w:tc>
+        <w:tc>
+          <w:tcPr>
+            <w:tcW w:w="1872" w:type="dxa"/>
+            <w:vAlign w:val="center"/>
+          </w:tcPr>
+          <w:p>
+            <w:pPr>
+              <w:pStyle w:val="TableText"/>
+              <w:spacing w:before="0" w:after="0" w:line="240" w:lineRule="auto"/>
+            </w:pPr>
+            <w:r>
+              <w:rPr>
+                <w:sz w:val="20"/>
+                <w:szCs w:val="20"/>
+              </w:rPr>
+              <w:t>0.68</w:t>
+            </w:r>
+          </w:p>
+        </w:tc>
+        <w:tc>
+          <w:tcPr>
+            <w:tcW w:w="1872" w:type="dxa"/>
+            <w:vAlign w:val="center"/>
+          </w:tcPr>
+          <w:p>
+            <w:pPr>
+              <w:pStyle w:val="TableText"/>
+              <w:spacing w:before="0" w:after="0" w:line="240" w:lineRule="auto"/>
+            </w:pPr>
+            <w:r>
+              <w:rPr>
+                <w:sz w:val="20"/>
+                <w:szCs w:val="20"/>
+              </w:rPr>
+              <w:t>266</w:t>
+            </w:r>
+          </w:p>
+        </w:tc>
+        <w:tc>
+          <w:tcPr>
+            <w:tcW w:w="1872" w:type="dxa"/>
+            <w:vAlign w:val="center"/>
+          </w:tcPr>
+          <w:p>
+            <w:pPr>
+              <w:pStyle w:val="TableText"/>
+              <w:spacing w:before="0" w:after="0" w:line="240" w:lineRule="auto"/>
+            </w:pPr>
+            <w:r>
+              <w:rPr>
+                <w:sz w:val="20"/>
+                <w:szCs w:val="20"/>
+              </w:rPr>
+              <w:t>0.81</w:t>
+            </w:r>
+          </w:p>
+        </w:tc>
+      </w:tr>
+      <w:tr>
+        <w:tc>
+          <w:tcPr>
+            <w:tcW w:w="1872" w:type="dxa"/>
+            <w:vAlign w:val="center"/>
+          </w:tcPr>
+          <w:p>
+            <w:pPr>
+              <w:pStyle w:val="TableText"/>
+              <w:spacing w:before="0" w:after="0" w:line="240" w:lineRule="auto"/>
+            </w:pPr>
+            <w:r>
+              <w:rPr>
+                <w:sz w:val="20"/>
+                <w:szCs w:val="20"/>
+              </w:rPr>
+              <w:t>CPP</w:t>
+            </w:r>
+          </w:p>
+        </w:tc>
+        <w:tc>
+          <w:tcPr>
+            <w:tcW w:w="1872" w:type="dxa"/>
+            <w:vAlign w:val="center"/>
+          </w:tcPr>
+          <w:p>
+            <w:pPr>
+              <w:pStyle w:val="TableText"/>
+              <w:spacing w:before="0" w:after="0" w:line="240" w:lineRule="auto"/>
+            </w:pPr>
+            <w:r>
+              <w:rPr>
+                <w:sz w:val="20"/>
+                <w:szCs w:val="20"/>
+              </w:rPr>
+              <w:t>4,435</w:t>
+            </w:r>
+          </w:p>
+        </w:tc>
+        <w:tc>
+          <w:tcPr>
+            <w:tcW w:w="1872" w:type="dxa"/>
+            <w:vAlign w:val="center"/>
+          </w:tcPr>
+          <w:p>
+            <w:pPr>
+              <w:pStyle w:val="TableText"/>
+              <w:spacing w:before="0" w:after="0" w:line="240" w:lineRule="auto"/>
+            </w:pPr>
+            <w:r>
+              <w:rPr>
+                <w:sz w:val="20"/>
+                <w:szCs w:val="20"/>
+              </w:rPr>
+              <w:t>14.51</w:t>
+            </w:r>
+          </w:p>
+        </w:tc>
+        <w:tc>
+          <w:tcPr>
+            <w:tcW w:w="1872" w:type="dxa"/>
+            <w:vAlign w:val="center"/>
+          </w:tcPr>
+          <w:p>
+            <w:pPr>
+              <w:pStyle w:val="TableText"/>
+              <w:spacing w:before="0" w:after="0" w:line="240" w:lineRule="auto"/>
+            </w:pPr>
+            <w:r>
+              <w:rPr>
+                <w:sz w:val="20"/>
+                <w:szCs w:val="20"/>
+              </w:rPr>
+              <w:t>4,133</w:t>
+            </w:r>
+          </w:p>
+        </w:tc>
+        <w:tc>
+          <w:tcPr>
+            <w:tcW w:w="1872" w:type="dxa"/>
+            <w:vAlign w:val="center"/>
+          </w:tcPr>
+          <w:p>
+            <w:pPr>
+              <w:pStyle w:val="TableText"/>
+              <w:spacing w:before="0" w:after="0" w:line="240" w:lineRule="auto"/>
+            </w:pPr>
+            <w:r>
+              <w:rPr>
+                <w:sz w:val="20"/>
+                <w:szCs w:val="20"/>
+              </w:rPr>
+              <w:t>12.62</w:t>
+            </w:r>
+          </w:p>
+        </w:tc>
+      </w:tr>
+      <w:tr>
+        <w:tc>
+          <w:tcPr>
+            <w:tcW w:w="1872" w:type="dxa"/>
+            <w:vAlign w:val="center"/>
+          </w:tcPr>
+          <w:p>
+            <w:pPr>
+              <w:pStyle w:val="TableText"/>
+              <w:spacing w:before="0" w:after="0" w:line="240" w:lineRule="auto"/>
+            </w:pPr>
+            <w:r>
+              <w:rPr>
+                <w:sz w:val="20"/>
+                <w:szCs w:val="20"/>
+              </w:rPr>
+              <w:t>Bitter</w:t>
+            </w:r>
+          </w:p>
+        </w:tc>
+        <w:tc>
+          <w:tcPr>
+            <w:tcW w:w="1872" w:type="dxa"/>
+            <w:vAlign w:val="center"/>
+          </w:tcPr>
+          <w:p>
+            <w:pPr>
+              <w:pStyle w:val="TableText"/>
+              <w:spacing w:before="0" w:after="0" w:line="240" w:lineRule="auto"/>
+            </w:pPr>
+            <w:r>
+              <w:rPr>
+                <w:sz w:val="20"/>
+                <w:szCs w:val="20"/>
+              </w:rPr>
+              <w:t>5,037</w:t>
+            </w:r>
+          </w:p>
+        </w:tc>
+        <w:tc>
+          <w:tcPr>
+            <w:tcW w:w="1872" w:type="dxa"/>
+            <w:vAlign w:val="center"/>
+          </w:tcPr>
+          <w:p>
+            <w:pPr>
+              <w:pStyle w:val="TableText"/>
+              <w:spacing w:before="0" w:after="0" w:line="240" w:lineRule="auto"/>
+            </w:pPr>
+            <w:r>
+              <w:rPr>
+                <w:sz w:val="20"/>
+                <w:szCs w:val="20"/>
+              </w:rPr>
+              <w:t>16.48</w:t>
+            </w:r>
+          </w:p>
+        </w:tc>
+        <w:tc>
+          <w:tcPr>
+            <w:tcW w:w="1872" w:type="dxa"/>
+            <w:vAlign w:val="center"/>
+          </w:tcPr>
+          <w:p>
+            <w:pPr>
+              <w:pStyle w:val="TableText"/>
+              <w:spacing w:before="0" w:after="0" w:line="240" w:lineRule="auto"/>
+            </w:pPr>
+            <w:r>
+              <w:rPr>
+                <w:sz w:val="20"/>
+                <w:szCs w:val="20"/>
+              </w:rPr>
+              <w:t>4,986</w:t>
+            </w:r>
+          </w:p>
+        </w:tc>
+        <w:tc>
+          <w:tcPr>
+            <w:tcW w:w="1872" w:type="dxa"/>
+            <w:vAlign w:val="center"/>
+          </w:tcPr>
+          <w:p>
+            <w:pPr>
+              <w:pStyle w:val="TableText"/>
+              <w:spacing w:before="0" w:after="0" w:line="240" w:lineRule="auto"/>
+            </w:pPr>
+            <w:r>
+              <w:rPr>
+                <w:sz w:val="20"/>
+                <w:szCs w:val="20"/>
+              </w:rPr>
+              <w:t>15.22</w:t>
+            </w:r>
+          </w:p>
+        </w:tc>
+      </w:tr>
+      <w:tr>
+        <w:tc>
+          <w:tcPr>
+            <w:tcW w:w="1872" w:type="dxa"/>
+            <w:vAlign w:val="center"/>
+          </w:tcPr>
+          <w:p>
+            <w:pPr>
+              <w:pStyle w:val="TableText"/>
+              <w:spacing w:before="0" w:after="0" w:line="240" w:lineRule="auto"/>
+            </w:pPr>
+            <w:r>
+              <w:rPr>
+                <w:sz w:val="20"/>
+                <w:szCs w:val="20"/>
+              </w:rPr>
+              <w:t>Umami</w:t>
+            </w:r>
+          </w:p>
+        </w:tc>
+        <w:tc>
+          <w:tcPr>
+            <w:tcW w:w="1872" w:type="dxa"/>
+            <w:vAlign w:val="center"/>
+          </w:tcPr>
+          <w:p>
+            <w:pPr>
+              <w:pStyle w:val="TableText"/>
+              <w:spacing w:before="0" w:after="0" w:line="240" w:lineRule="auto"/>
+            </w:pPr>
+            <w:r>
+              <w:rPr>
+                <w:sz w:val="20"/>
+                <w:szCs w:val="20"/>
+              </w:rPr>
+              <w:t>6,095</w:t>
+            </w:r>
+          </w:p>
+        </w:tc>
+        <w:tc>
+          <w:tcPr>
+            <w:tcW w:w="1872" w:type="dxa"/>
+            <w:vAlign w:val="center"/>
+          </w:tcPr>
+          <w:p>
+            <w:pPr>
+              <w:pStyle w:val="TableText"/>
+              <w:spacing w:before="0" w:after="0" w:line="240" w:lineRule="auto"/>
+            </w:pPr>
+            <w:r>
+              <w:rPr>
+                <w:sz w:val="20"/>
+                <w:szCs w:val="20"/>
+              </w:rPr>
+              <w:t>19.95</w:t>
+            </w:r>
+          </w:p>
+        </w:tc>
+        <w:tc>
+          <w:tcPr>
+            <w:tcW w:w="1872" w:type="dxa"/>
+            <w:vAlign w:val="center"/>
+          </w:tcPr>
+          <w:p>
+            <w:pPr>
+              <w:pStyle w:val="TableText"/>
+              <w:spacing w:before="0" w:after="0" w:line="240" w:lineRule="auto"/>
+            </w:pPr>
+            <w:r>
+              <w:rPr>
+                <w:sz w:val="20"/>
+                <w:szCs w:val="20"/>
+              </w:rPr>
+              <w:t>6,094</w:t>
+            </w:r>
+          </w:p>
+        </w:tc>
+        <w:tc>
+          <w:tcPr>
+            <w:tcW w:w="1872" w:type="dxa"/>
+            <w:vAlign w:val="center"/>
+          </w:tcPr>
+          <w:p>
+            <w:pPr>
+              <w:pStyle w:val="TableText"/>
+              <w:spacing w:before="0" w:after="0" w:line="240" w:lineRule="auto"/>
+            </w:pPr>
+            <w:r>
+              <w:rPr>
+                <w:sz w:val="20"/>
+                <w:szCs w:val="20"/>
+              </w:rPr>
+              <w:t>18.61</w:t>
+            </w:r>
+          </w:p>
+        </w:tc>
+      </w:tr>
+      <w:tr>
+        <w:tc>
+          <w:tcPr>
+            <w:tcW w:w="1872" w:type="dxa"/>
+            <w:vAlign w:val="center"/>
+          </w:tcPr>
+          <w:p>
+            <w:pPr>
+              <w:pStyle w:val="TableText"/>
+              <w:spacing w:before="0" w:after="0" w:line="240" w:lineRule="auto"/>
+            </w:pPr>
+            <w:r>
+              <w:rPr>
+                <w:sz w:val="20"/>
+                <w:szCs w:val="20"/>
+              </w:rPr>
+              <w:t>Antimicrobial_activity</w:t>
+            </w:r>
+          </w:p>
+        </w:tc>
+        <w:tc>
+          <w:tcPr>
+            <w:tcW w:w="1872" w:type="dxa"/>
+            <w:vAlign w:val="center"/>
+          </w:tcPr>
+          <w:p>
+            <w:pPr>
+              <w:pStyle w:val="TableText"/>
+              <w:spacing w:before="0" w:after="0" w:line="240" w:lineRule="auto"/>
+            </w:pPr>
+            <w:r>
+              <w:rPr>
+                <w:sz w:val="20"/>
+                <w:szCs w:val="20"/>
+              </w:rPr>
+              <w:t>30,537</w:t>
+            </w:r>
+          </w:p>
+        </w:tc>
+        <w:tc>
+          <w:tcPr>
+            <w:tcW w:w="1872" w:type="dxa"/>
+            <w:vAlign w:val="center"/>
+          </w:tcPr>
+          <w:p>
+            <w:pPr>
+              <w:pStyle w:val="TableText"/>
+              <w:spacing w:before="0" w:after="0" w:line="240" w:lineRule="auto"/>
+            </w:pPr>
+            <w:r>
+              <w:rPr>
+                <w:sz w:val="20"/>
+                <w:szCs w:val="20"/>
+              </w:rPr>
+              <w:t>99.93</w:t>
+            </w:r>
+          </w:p>
+        </w:tc>
+        <w:tc>
+          <w:tcPr>
+            <w:tcW w:w="1872" w:type="dxa"/>
+            <w:vAlign w:val="center"/>
+          </w:tcPr>
+          <w:p>
+            <w:pPr>
+              <w:pStyle w:val="TableText"/>
+              <w:spacing w:before="0" w:after="0" w:line="240" w:lineRule="auto"/>
+            </w:pPr>
+            <w:r>
+              <w:rPr>
+                <w:sz w:val="20"/>
+                <w:szCs w:val="20"/>
+              </w:rPr>
+              <w:t>32,721</w:t>
+            </w:r>
+          </w:p>
+        </w:tc>
+        <w:tc>
+          <w:tcPr>
+            <w:tcW w:w="1872" w:type="dxa"/>
+            <w:vAlign w:val="center"/>
+          </w:tcPr>
+          <w:p>
+            <w:pPr>
+              <w:pStyle w:val="TableText"/>
+              <w:spacing w:before="0" w:after="0" w:line="240" w:lineRule="auto"/>
+            </w:pPr>
+            <w:r>
+              <w:rPr>
+                <w:sz w:val="20"/>
+                <w:szCs w:val="20"/>
+              </w:rPr>
+              <w:t>99.90</w:t>
+            </w:r>
+          </w:p>
+        </w:tc>
+      </w:tr>
+      <w:tr>
+        <w:tc>
+          <w:tcPr>
+            <w:tcW w:w="1872" w:type="dxa"/>
+            <w:vAlign w:val="center"/>
+          </w:tcPr>
+          <w:p>
+            <w:pPr>
+              <w:pStyle w:val="TableText"/>
+              <w:spacing w:before="0" w:after="0" w:line="240" w:lineRule="auto"/>
+            </w:pPr>
+            <w:r>
+              <w:rPr>
+                <w:sz w:val="20"/>
+                <w:szCs w:val="20"/>
+              </w:rPr>
+              <w:t>Antimalarial_alt</w:t>
+            </w:r>
+          </w:p>
+        </w:tc>
+        <w:tc>
+          <w:tcPr>
+            <w:tcW w:w="1872" w:type="dxa"/>
+            <w:vAlign w:val="center"/>
+          </w:tcPr>
+          <w:p>
+            <w:pPr>
+              <w:pStyle w:val="TableText"/>
+              <w:spacing w:before="0" w:after="0" w:line="240" w:lineRule="auto"/>
+            </w:pPr>
+            <w:r>
+              <w:rPr>
+                <w:sz w:val="20"/>
+                <w:szCs w:val="20"/>
+              </w:rPr>
+              <w:t>1,724</w:t>
+            </w:r>
+          </w:p>
+        </w:tc>
+        <w:tc>
+          <w:tcPr>
+            <w:tcW w:w="1872" w:type="dxa"/>
+            <w:vAlign w:val="center"/>
+          </w:tcPr>
+          <w:p>
+            <w:pPr>
+              <w:pStyle w:val="TableText"/>
+              <w:spacing w:before="0" w:after="0" w:line="240" w:lineRule="auto"/>
+            </w:pPr>
+            <w:r>
+              <w:rPr>
+                <w:sz w:val="20"/>
+                <w:szCs w:val="20"/>
+              </w:rPr>
+              <w:t>5.64</w:t>
+            </w:r>
+          </w:p>
+        </w:tc>
+        <w:tc>
+          <w:tcPr>
+            <w:tcW w:w="1872" w:type="dxa"/>
+            <w:vAlign w:val="center"/>
+          </w:tcPr>
+          <w:p>
+            <w:pPr>
+              <w:pStyle w:val="TableText"/>
+              <w:spacing w:before="0" w:after="0" w:line="240" w:lineRule="auto"/>
+            </w:pPr>
+            <w:r>
+              <w:rPr>
+                <w:sz w:val="20"/>
+                <w:szCs w:val="20"/>
+              </w:rPr>
+              <w:t>1,695</w:t>
+            </w:r>
+          </w:p>
+        </w:tc>
+        <w:tc>
+          <w:tcPr>
+            <w:tcW w:w="1872" w:type="dxa"/>
+            <w:vAlign w:val="center"/>
+          </w:tcPr>
+          <w:p>
+            <w:pPr>
+              <w:pStyle w:val="TableText"/>
+              <w:spacing w:before="0" w:after="0" w:line="240" w:lineRule="auto"/>
+            </w:pPr>
+            <w:r>
+              <w:rPr>
+                <w:sz w:val="20"/>
+                <w:szCs w:val="20"/>
+              </w:rPr>
+              <w:t>5.17</w:t>
+            </w:r>
+          </w:p>
+        </w:tc>
+      </w:tr>
+      <w:tr>
+        <w:tc>
+          <w:tcPr>
+            <w:tcW w:w="1872" w:type="dxa"/>
+            <w:vAlign w:val="center"/>
+          </w:tcPr>
+          <w:p>
+            <w:pPr>
+              <w:pStyle w:val="TableText"/>
+              <w:spacing w:before="0" w:after="0" w:line="240" w:lineRule="auto"/>
+            </w:pPr>
+            <w:r>
+              <w:rPr>
+                <w:sz w:val="20"/>
+                <w:szCs w:val="20"/>
+              </w:rPr>
+              <w:t>Antimalarial_main</w:t>
+            </w:r>
+          </w:p>
+        </w:tc>
+        <w:tc>
+          <w:tcPr>
+            <w:tcW w:w="1872" w:type="dxa"/>
+            <w:vAlign w:val="center"/>
+          </w:tcPr>
+          <w:p>
+            <w:pPr>
+              <w:pStyle w:val="TableText"/>
+              <w:spacing w:before="0" w:after="0" w:line="240" w:lineRule="auto"/>
+            </w:pPr>
+            <w:r>
+              <w:rPr>
+                <w:sz w:val="20"/>
+                <w:szCs w:val="20"/>
+              </w:rPr>
+              <w:t>6,496</w:t>
+            </w:r>
+          </w:p>
+        </w:tc>
+        <w:tc>
+          <w:tcPr>
+            <w:tcW w:w="1872" w:type="dxa"/>
+            <w:vAlign w:val="center"/>
+          </w:tcPr>
+          <w:p>
+            <w:pPr>
+              <w:pStyle w:val="TableText"/>
+              <w:spacing w:before="0" w:after="0" w:line="240" w:lineRule="auto"/>
+            </w:pPr>
+            <w:r>
+              <w:rPr>
+                <w:sz w:val="20"/>
+                <w:szCs w:val="20"/>
+              </w:rPr>
+              <w:t>21.26</w:t>
+            </w:r>
+          </w:p>
+        </w:tc>
+        <w:tc>
+          <w:tcPr>
+            <w:tcW w:w="1872" w:type="dxa"/>
+            <w:vAlign w:val="center"/>
+          </w:tcPr>
+          <w:p>
+            <w:pPr>
+              <w:pStyle w:val="TableText"/>
+              <w:spacing w:before="0" w:after="0" w:line="240" w:lineRule="auto"/>
+            </w:pPr>
+            <w:r>
+              <w:rPr>
+                <w:sz w:val="20"/>
+                <w:szCs w:val="20"/>
+              </w:rPr>
+              <w:t>6,586</w:t>
+            </w:r>
+          </w:p>
+        </w:tc>
+        <w:tc>
+          <w:tcPr>
+            <w:tcW w:w="1872" w:type="dxa"/>
+            <w:vAlign w:val="center"/>
+          </w:tcPr>
+          <w:p>
+            <w:pPr>
+              <w:pStyle w:val="TableText"/>
+              <w:spacing w:before="0" w:after="0" w:line="240" w:lineRule="auto"/>
+            </w:pPr>
+            <w:r>
+              <w:rPr>
+                <w:sz w:val="20"/>
+                <w:szCs w:val="20"/>
+              </w:rPr>
+              <w:t>20.11</w:t>
+            </w:r>
+          </w:p>
+        </w:tc>
+      </w:tr>
+      <w:tr>
+        <w:tc>
+          <w:tcPr>
+            <w:tcW w:w="1872" w:type="dxa"/>
+            <w:vAlign w:val="center"/>
+          </w:tcPr>
+          <w:p>
+            <w:pPr>
+              <w:pStyle w:val="TableText"/>
+              <w:spacing w:before="0" w:after="0" w:line="240" w:lineRule="auto"/>
+            </w:pPr>
+            <w:r>
+              <w:rPr>
+                <w:sz w:val="20"/>
+                <w:szCs w:val="20"/>
+              </w:rPr>
+              <w:t>Quorum_sensing</w:t>
+            </w:r>
+          </w:p>
+        </w:tc>
+        <w:tc>
+          <w:tcPr>
+            <w:tcW w:w="1872" w:type="dxa"/>
+            <w:vAlign w:val="center"/>
+          </w:tcPr>
+          <w:p>
+            <w:pPr>
+              <w:pStyle w:val="TableText"/>
+              <w:spacing w:before="0" w:after="0" w:line="240" w:lineRule="auto"/>
+            </w:pPr>
+            <w:r>
+              <w:rPr>
+                <w:sz w:val="20"/>
+                <w:szCs w:val="20"/>
+              </w:rPr>
+              <w:t>11,834</w:t>
+            </w:r>
+          </w:p>
+        </w:tc>
+        <w:tc>
+          <w:tcPr>
+            <w:tcW w:w="1872" w:type="dxa"/>
+            <w:vAlign w:val="center"/>
+          </w:tcPr>
+          <w:p>
+            <w:pPr>
+              <w:pStyle w:val="TableText"/>
+              <w:spacing w:before="0" w:after="0" w:line="240" w:lineRule="auto"/>
+            </w:pPr>
+            <w:r>
+              <w:rPr>
+                <w:sz w:val="20"/>
+                <w:szCs w:val="20"/>
+              </w:rPr>
+              <w:t>38.73</w:t>
+            </w:r>
+          </w:p>
+        </w:tc>
+        <w:tc>
+          <w:tcPr>
+            <w:tcW w:w="1872" w:type="dxa"/>
+            <w:vAlign w:val="center"/>
+          </w:tcPr>
+          <w:p>
+            <w:pPr>
+              <w:pStyle w:val="TableText"/>
+              <w:spacing w:before="0" w:after="0" w:line="240" w:lineRule="auto"/>
+            </w:pPr>
+            <w:r>
+              <w:rPr>
+                <w:sz w:val="20"/>
+                <w:szCs w:val="20"/>
+              </w:rPr>
+              <w:t>12,674</w:t>
+            </w:r>
+          </w:p>
+        </w:tc>
+        <w:tc>
+          <w:tcPr>
+            <w:tcW w:w="1872" w:type="dxa"/>
+            <w:vAlign w:val="center"/>
+          </w:tcPr>
+          <w:p>
+            <w:pPr>
+              <w:pStyle w:val="TableText"/>
+              <w:spacing w:before="0" w:after="0" w:line="240" w:lineRule="auto"/>
+            </w:pPr>
+            <w:r>
+              <w:rPr>
+                <w:sz w:val="20"/>
+                <w:szCs w:val="20"/>
+              </w:rPr>
+              <w:t>38.69</w:t>
+            </w:r>
+          </w:p>
+        </w:tc>
+      </w:tr>
+      <w:tr>
+        <w:tc>
+          <w:tcPr>
+            <w:tcW w:w="1872" w:type="dxa"/>
+            <w:vAlign w:val="center"/>
+          </w:tcPr>
+          <w:p>
+            <w:pPr>
+              <w:pStyle w:val="TableText"/>
+              <w:spacing w:before="0" w:after="0" w:line="240" w:lineRule="auto"/>
+            </w:pPr>
+            <w:r>
+              <w:rPr>
+                <w:sz w:val="20"/>
+                <w:szCs w:val="20"/>
+              </w:rPr>
+              <w:t>ACP_Anticancer_alt</w:t>
+            </w:r>
+          </w:p>
+        </w:tc>
+        <w:tc>
+          <w:tcPr>
+            <w:tcW w:w="1872" w:type="dxa"/>
+            <w:vAlign w:val="center"/>
+          </w:tcPr>
+          <w:p>
+            <w:pPr>
+              <w:pStyle w:val="TableText"/>
+              <w:spacing w:before="0" w:after="0" w:line="240" w:lineRule="auto"/>
+            </w:pPr>
+            <w:r>
+              <w:rPr>
+                <w:sz w:val="20"/>
+                <w:szCs w:val="20"/>
+              </w:rPr>
+              <w:t>7,878</w:t>
+            </w:r>
+          </w:p>
+        </w:tc>
+        <w:tc>
+          <w:tcPr>
+            <w:tcW w:w="1872" w:type="dxa"/>
+            <w:vAlign w:val="center"/>
+          </w:tcPr>
+          <w:p>
+            <w:pPr>
+              <w:pStyle w:val="TableText"/>
+              <w:spacing w:before="0" w:after="0" w:line="240" w:lineRule="auto"/>
+            </w:pPr>
+            <w:r>
+              <w:rPr>
+                <w:sz w:val="20"/>
+                <w:szCs w:val="20"/>
+              </w:rPr>
+              <w:t>25.78</w:t>
+            </w:r>
+          </w:p>
+        </w:tc>
+        <w:tc>
+          <w:tcPr>
+            <w:tcW w:w="1872" w:type="dxa"/>
+            <w:vAlign w:val="center"/>
+          </w:tcPr>
+          <w:p>
+            <w:pPr>
+              <w:pStyle w:val="TableText"/>
+              <w:spacing w:before="0" w:after="0" w:line="240" w:lineRule="auto"/>
+            </w:pPr>
+            <w:r>
+              <w:rPr>
+                <w:sz w:val="20"/>
+                <w:szCs w:val="20"/>
+              </w:rPr>
+              <w:t>8,380</w:t>
+            </w:r>
+          </w:p>
+        </w:tc>
+        <w:tc>
+          <w:tcPr>
+            <w:tcW w:w="1872" w:type="dxa"/>
+            <w:vAlign w:val="center"/>
+          </w:tcPr>
+          <w:p>
+            <w:pPr>
+              <w:pStyle w:val="TableText"/>
+              <w:spacing w:before="0" w:after="0" w:line="240" w:lineRule="auto"/>
+            </w:pPr>
+            <w:r>
+              <w:rPr>
+                <w:sz w:val="20"/>
+                <w:szCs w:val="20"/>
+              </w:rPr>
+              <w:t>25.58</w:t>
+            </w:r>
+          </w:p>
+        </w:tc>
+      </w:tr>
+      <w:tr>
+        <w:tc>
+          <w:tcPr>
+            <w:tcW w:w="1872" w:type="dxa"/>
+            <w:vAlign w:val="center"/>
+          </w:tcPr>
+          <w:p>
+            <w:pPr>
+              <w:pStyle w:val="TableText"/>
+              <w:spacing w:before="0" w:after="0" w:line="240" w:lineRule="auto"/>
+            </w:pPr>
+            <w:r>
+              <w:rPr>
+                <w:sz w:val="20"/>
+                <w:szCs w:val="20"/>
+              </w:rPr>
+              <w:t>ACP_Anticancer_main</w:t>
+            </w:r>
+          </w:p>
+        </w:tc>
+        <w:tc>
+          <w:tcPr>
+            <w:tcW w:w="1872" w:type="dxa"/>
+            <w:vAlign w:val="center"/>
+          </w:tcPr>
+          <w:p>
+            <w:pPr>
+              <w:pStyle w:val="TableText"/>
+              <w:spacing w:before="0" w:after="0" w:line="240" w:lineRule="auto"/>
+            </w:pPr>
+            <w:r>
+              <w:rPr>
+                <w:sz w:val="20"/>
+                <w:szCs w:val="20"/>
+              </w:rPr>
+              <w:t>11,370</w:t>
+            </w:r>
+          </w:p>
+        </w:tc>
+        <w:tc>
+          <w:tcPr>
+            <w:tcW w:w="1872" w:type="dxa"/>
+            <w:vAlign w:val="center"/>
+          </w:tcPr>
+          <w:p>
+            <w:pPr>
+              <w:pStyle w:val="TableText"/>
+              <w:spacing w:before="0" w:after="0" w:line="240" w:lineRule="auto"/>
+            </w:pPr>
+            <w:r>
+              <w:rPr>
+                <w:sz w:val="20"/>
+                <w:szCs w:val="20"/>
+              </w:rPr>
+              <w:t>37.21</w:t>
+            </w:r>
+          </w:p>
+        </w:tc>
+        <w:tc>
+          <w:tcPr>
+            <w:tcW w:w="1872" w:type="dxa"/>
+            <w:vAlign w:val="center"/>
+          </w:tcPr>
+          <w:p>
+            <w:pPr>
+              <w:pStyle w:val="TableText"/>
+              <w:spacing w:before="0" w:after="0" w:line="240" w:lineRule="auto"/>
+            </w:pPr>
+            <w:r>
+              <w:rPr>
+                <w:sz w:val="20"/>
+                <w:szCs w:val="20"/>
+              </w:rPr>
+              <w:t>12,023</w:t>
+            </w:r>
+          </w:p>
+        </w:tc>
+        <w:tc>
+          <w:tcPr>
+            <w:tcW w:w="1872" w:type="dxa"/>
+            <w:vAlign w:val="center"/>
+          </w:tcPr>
+          <w:p>
+            <w:pPr>
+              <w:pStyle w:val="TableText"/>
+              <w:spacing w:before="0" w:after="0" w:line="240" w:lineRule="auto"/>
+            </w:pPr>
+            <w:r>
+              <w:rPr>
+                <w:sz w:val="20"/>
+                <w:szCs w:val="20"/>
+              </w:rPr>
+              <w:t>36.71</w:t>
+            </w:r>
+          </w:p>
+        </w:tc>
+      </w:tr>
+      <w:tr>
+        <w:tc>
+          <w:tcPr>
+            <w:tcW w:w="1872" w:type="dxa"/>
+            <w:vAlign w:val="center"/>
+          </w:tcPr>
+          <w:p>
+            <w:pPr>
+              <w:pStyle w:val="TableText"/>
+              <w:spacing w:before="0" w:after="0" w:line="240" w:lineRule="auto"/>
+            </w:pPr>
+            <w:r>
+              <w:rPr>
+                <w:sz w:val="20"/>
+                <w:szCs w:val="20"/>
+              </w:rPr>
+              <w:t>Anti-MRSA</w:t>
+            </w:r>
+          </w:p>
+        </w:tc>
+        <w:tc>
+          <w:tcPr>
+            <w:tcW w:w="1872" w:type="dxa"/>
+            <w:vAlign w:val="center"/>
+          </w:tcPr>
+          <w:p>
+            <w:pPr>
+              <w:pStyle w:val="TableText"/>
+              <w:spacing w:before="0" w:after="0" w:line="240" w:lineRule="auto"/>
+            </w:pPr>
+            <w:r>
+              <w:rPr>
+                <w:sz w:val="20"/>
+                <w:szCs w:val="20"/>
+              </w:rPr>
+              <w:t>4,315</w:t>
+            </w:r>
+          </w:p>
+        </w:tc>
+        <w:tc>
+          <w:tcPr>
+            <w:tcW w:w="1872" w:type="dxa"/>
+            <w:vAlign w:val="center"/>
+          </w:tcPr>
+          <w:p>
+            <w:pPr>
+              <w:pStyle w:val="TableText"/>
+              <w:spacing w:before="0" w:after="0" w:line="240" w:lineRule="auto"/>
+            </w:pPr>
+            <w:r>
+              <w:rPr>
+                <w:sz w:val="20"/>
+                <w:szCs w:val="20"/>
+              </w:rPr>
+              <w:t>14.12</w:t>
+            </w:r>
+          </w:p>
+        </w:tc>
+        <w:tc>
+          <w:tcPr>
+            <w:tcW w:w="1872" w:type="dxa"/>
+            <w:vAlign w:val="center"/>
+          </w:tcPr>
+          <w:p>
+            <w:pPr>
+              <w:pStyle w:val="TableText"/>
+              <w:spacing w:before="0" w:after="0" w:line="240" w:lineRule="auto"/>
+            </w:pPr>
+            <w:r>
+              <w:rPr>
+                <w:sz w:val="20"/>
+                <w:szCs w:val="20"/>
+              </w:rPr>
+              <w:t>4,728</w:t>
+            </w:r>
+          </w:p>
+        </w:tc>
+        <w:tc>
+          <w:tcPr>
+            <w:tcW w:w="1872" w:type="dxa"/>
+            <w:vAlign w:val="center"/>
+          </w:tcPr>
+          <w:p>
+            <w:pPr>
+              <w:pStyle w:val="TableText"/>
+              <w:spacing w:before="0" w:after="0" w:line="240" w:lineRule="auto"/>
+            </w:pPr>
+            <w:r>
+              <w:rPr>
+                <w:sz w:val="20"/>
+                <w:szCs w:val="20"/>
+              </w:rPr>
+              <w:t>14.43</w:t>
+            </w:r>
+          </w:p>
+        </w:tc>
+      </w:tr>
+    </w:tbl>
+    <w:p>
+      <w:pPr>
+        <w:spacing w:after="40"/>
+      </w:pPr>
+    </w:p>
+    <w:p>
+      <w:pPr>
+        <w:pStyle w:val="Heading3"/>
+        <w:keepNext/>
+      </w:pPr>
+      <w:r>
         <w:t>串行模型筛选形成12条和8条候选终点</w:t>
       </w:r>
     </w:p>
@@ -1486,7 +6114,15 @@
         <w:pStyle w:val="BodyText"/>
       </w:pPr>
       <w:r>
-        <w:t>NTxPred2评价了3,299/3,518条牙周炎标记BBB高分候选（93.77%），另有219/3,518条（6.23%）低于模型适用长度。在已评估候选中，923/3,299条（27.98%）为模型阳性。后续汇总计数依次为111条mebipred阳性、15条CHEL≥0.25、12条CHEL≥0.25且FRS&lt;0.50，以及8条CHEL≥0.25且FRS&lt;0.45（表2）。收紧FRS阈值后保留主集合的8/12（66.67%）。由于缺少逐行交接数据，不能把111/923解释为已验证转换率。</w:t>
+        <w:t>NTxPred2评价了3,299/3,518条牙周炎标记BBB高分候选（93.77%），另有219/3,518条（6.23%）低于模型适用长度。在已评估候选中，923/3,299条（27.98%）为模型阳性。后续汇总计数依次为111条mebipred阳性、15条CHEL≥0.25、12条CHEL≥0.25且FRS&lt;0.50，以及8条CHEL≥0.25且FRS&lt;0.45（表4）。收紧FRS阈值后保留主集合的8/12（66.67%）。由于缺少逐行交接数据，不能把111/923解释为已验证转换率。</w:t>
+      </w:r>
+    </w:p>
+    <w:p>
+      <w:pPr>
+        <w:pStyle w:val="BodyText"/>
+      </w:pPr>
+      <w:r>
+        <w:t>主源报告923条NTxPred2阳性候选全部≤30 aa。因此，宏蛋白质组支持并去重后的72条牙周炎标记31–50 aa BBB高分长肽均未保留在进入后续mebipred和AnOxPePred金属结合/CHEL/FRS筛选的神经毒性阳性集合中，汇总的12条终点因而只包含短肽。由于缺少逐行输出，无法重建每条长肽被排除的具体原因。</w:t>
       </w:r>
     </w:p>
     <w:p>
@@ -1497,7 +6133,7 @@
         <w:rPr>
           <w:b/>
         </w:rPr>
-        <w:t>表2. 牙周炎标记分支的汇总优选结果。</w:t>
+        <w:t>表4. 牙周炎标记分支的汇总优选结果。</w:t>
       </w:r>
     </w:p>
     <w:tbl>
@@ -2419,7 +7055,7 @@
         <w:pStyle w:val="BodyText"/>
       </w:pPr>
       <w:r>
-        <w:t>另一张序列表包含12条互不重复、仅由标准氨基酸组成的肽，长度为7–9个残基（表3）。其中11条含组氨酸，6条含半胱氨酸，每条均至少含一个Arg或Lys。这些特征可用于合成规划和假设设计，但不能证明金属结合、BBB转运、毒性、分类学归属，也不能证明其对应汇总终点的12行。由于缺少序列层面FRS标签，严格8/12子集的身份仍未知。</w:t>
+        <w:t>另一张序列表包含12条互不重复、仅由标准氨基酸组成的肽，长度为7–9个残基（表5）。其中11条含组氨酸，6条含半胱氨酸，每条均至少含一个Arg或Lys。这些特征可用于合成规划和假设设计，但不能证明金属结合、BBB转运、毒性、分类学归属，也不能证明其对应汇总终点的12行。由于缺少序列层面FRS标签，严格8/12子集的身份仍未知。</w:t>
       </w:r>
     </w:p>
     <w:p>
@@ -2430,7 +7066,7 @@
         <w:rPr>
           <w:b/>
         </w:rPr>
-        <w:t>表3. 12条序列及重算组成。</w:t>
+        <w:t>表5. 12条序列及重算组成。</w:t>
       </w:r>
     </w:p>
     <w:tbl>
@@ -4261,7 +8897,7 @@
         <w:pStyle w:val="BodyText"/>
       </w:pPr>
       <w:r>
-        <w:t>对接表中的Vina均值范围为−9.60至−8.25 kcal/mol，标准差范围为0.04至0.12（表4）。FLLHTTR、YLSLLQR和ALLLHRC的均值最低，HLPLLHRCC和HVLLLRQCA的均值最高。约1.35 kcal/mol的范围仅描述该评分表。缺少制备输入、运行定义、构象和相互作用文件时，无法评价残基接触、靶位点偏好、亲和力或功能活性。</w:t>
+        <w:t>对接表中的Vina均值范围为−9.60至−8.25 kcal/mol，标准差范围为0.04至0.12（表6）。FLLHTTR、YLSLLQR和ALLLHRC的均值最低，HLPLLHRCC和HVLLLRQCA的均值最高。约1.35 kcal/mol的范围仅描述该评分表。缺少制备输入、运行定义、构象和相互作用文件时，无法评价残基接触、靶位点偏好、亲和力或功能活性。</w:t>
       </w:r>
     </w:p>
     <w:p>
@@ -4272,7 +8908,7 @@
         <w:rPr>
           <w:b/>
         </w:rPr>
-        <w:t>表4. 人AChE PDB 4EY6的现有AutoDock Vina汇总。</w:t>
+        <w:t>表6. 人AChE PDB 4EY6的现有AutoDock Vina汇总。</w:t>
       </w:r>
     </w:p>
     <w:tbl>
@@ -5562,6 +10198,14 @@
       </w:pPr>
       <w:r>
         <w:t>验证应按顺序推进。首先，把12条明确序列连接到12条候选终点及8条严格子集，并使用固定模型版本重新生成全部预测器输出。其次，采用队列匹配的宏转录组、条件允许时的核糖体图谱以及具有肽层面错误发现率控制的靶向蛋白质组学检验翻译和表达。再次，对合成肽开展身份、纯度、溶解性、聚集及血清/蛋白酶稳定性测试。只有通过前序步骤的候选才应进入BBB转运、细胞毒性、金属化学、AChE/BChE活性、直接结合和Aβ测定。仅当分子身份、暴露、可重复生化活性及生物学重复表型均得到确认后，才适合进入复杂疾病模型。</w:t>
+      </w:r>
+    </w:p>
+    <w:p>
+      <w:pPr>
+        <w:pStyle w:val="BodyText"/>
+      </w:pPr>
+      <w:r>
+        <w:t>另一项关键流程局限是BBB优选后的长度依赖性流失。尽管牙周炎标记分支中有72条经宏蛋白质组支持并去重的长肽达到BBB高分，但923条NTxPred2阳性序列全部≤30 aa；因此，后续金属结合及CHEL/FRS网页预测级联没有保留任何长肽，最终汇总的12条候选只包含短肽。这一结果不能证明长肽在生物学上缺乏神经毒性或金属相关活性；它可能反映串行阈值、模型适用性或校准以及网页预测器实现方式。缺少候选层面评分时，无法区分这些解释。</w:t>
       </w:r>
     </w:p>
     <w:p>

</xml_diff>